<commit_message>
[Version] Version 1 6/21.
</commit_message>
<xml_diff>
--- a/期末專題.docx
+++ b/期末專題.docx
@@ -5,6 +5,7 @@
     <w:sdt>
       <w:sdtPr>
         <w:rPr>
+          <w:rFonts w:ascii="微軟正黑體" w:eastAsia="微軟正黑體" w:hAnsi="微軟正黑體"/>
           <w:color w:val="4472C4" w:themeColor="accent1"/>
         </w:rPr>
         <w:id w:val="1890068514"/>
@@ -15,7 +16,6 @@
       </w:sdtPr>
       <w:sdtEndPr>
         <w:rPr>
-          <w:rFonts w:ascii="微軟正黑體" w:eastAsia="微軟正黑體" w:hAnsi="微軟正黑體"/>
           <w:color w:val="auto"/>
           <w:kern w:val="2"/>
           <w:sz w:val="24"/>
@@ -30,11 +30,13 @@
             <w:spacing w:before="1540" w:after="240"/>
             <w:jc w:val="center"/>
             <w:rPr>
+              <w:rFonts w:ascii="微軟正黑體" w:eastAsia="微軟正黑體" w:hAnsi="微軟正黑體"/>
               <w:color w:val="4472C4" w:themeColor="accent1"/>
             </w:rPr>
           </w:pPr>
           <w:r>
             <w:rPr>
+              <w:rFonts w:ascii="微軟正黑體" w:eastAsia="微軟正黑體" w:hAnsi="微軟正黑體"/>
               <w:noProof/>
             </w:rPr>
             <w:drawing>
@@ -90,7 +92,7 @@
         <w:sdt>
           <w:sdtPr>
             <w:rPr>
-              <w:rFonts w:asciiTheme="majorHAnsi" w:eastAsiaTheme="majorEastAsia" w:hAnsiTheme="majorHAnsi" w:cstheme="majorBidi" w:hint="eastAsia"/>
+              <w:rFonts w:ascii="微軟正黑體" w:eastAsia="微軟正黑體" w:hAnsi="微軟正黑體" w:cstheme="majorBidi" w:hint="eastAsia"/>
               <w:caps/>
               <w:color w:val="4472C4" w:themeColor="accent1"/>
               <w:sz w:val="72"/>
@@ -122,7 +124,7 @@
                 <w:spacing w:after="240"/>
                 <w:jc w:val="center"/>
                 <w:rPr>
-                  <w:rFonts w:asciiTheme="majorHAnsi" w:eastAsiaTheme="majorEastAsia" w:hAnsiTheme="majorHAnsi" w:cstheme="majorBidi"/>
+                  <w:rFonts w:ascii="微軟正黑體" w:eastAsia="微軟正黑體" w:hAnsi="微軟正黑體" w:cstheme="majorBidi"/>
                   <w:caps/>
                   <w:color w:val="4472C4" w:themeColor="accent1"/>
                   <w:sz w:val="80"/>
@@ -131,7 +133,7 @@
               </w:pPr>
               <w:r>
                 <w:rPr>
-                  <w:rFonts w:asciiTheme="majorHAnsi" w:eastAsiaTheme="majorEastAsia" w:hAnsiTheme="majorHAnsi" w:cstheme="majorBidi" w:hint="eastAsia"/>
+                  <w:rFonts w:ascii="微軟正黑體" w:eastAsia="微軟正黑體" w:hAnsi="微軟正黑體" w:cstheme="majorBidi" w:hint="eastAsia"/>
                   <w:caps/>
                   <w:color w:val="4472C4" w:themeColor="accent1"/>
                   <w:sz w:val="72"/>
@@ -141,7 +143,7 @@
               </w:r>
               <w:r>
                 <w:rPr>
-                  <w:rFonts w:asciiTheme="majorHAnsi" w:eastAsiaTheme="majorEastAsia" w:hAnsiTheme="majorHAnsi" w:cstheme="majorBidi" w:hint="eastAsia"/>
+                  <w:rFonts w:ascii="微軟正黑體" w:eastAsia="微軟正黑體" w:hAnsi="微軟正黑體" w:cstheme="majorBidi" w:hint="eastAsia"/>
                   <w:caps/>
                   <w:color w:val="4472C4" w:themeColor="accent1"/>
                   <w:sz w:val="72"/>
@@ -155,6 +157,7 @@
         <w:sdt>
           <w:sdtPr>
             <w:rPr>
+              <w:rFonts w:ascii="微軟正黑體" w:eastAsia="微軟正黑體" w:hAnsi="微軟正黑體"/>
               <w:color w:val="4472C4" w:themeColor="accent1"/>
               <w:sz w:val="28"/>
               <w:szCs w:val="28"/>
@@ -174,6 +177,7 @@
                 <w:pStyle w:val="af"/>
                 <w:jc w:val="center"/>
                 <w:rPr>
+                  <w:rFonts w:ascii="微軟正黑體" w:eastAsia="微軟正黑體" w:hAnsi="微軟正黑體"/>
                   <w:color w:val="4472C4" w:themeColor="accent1"/>
                   <w:sz w:val="28"/>
                   <w:szCs w:val="28"/>
@@ -181,7 +185,7 @@
               </w:pPr>
               <w:r>
                 <w:rPr>
-                  <w:rFonts w:hint="eastAsia"/>
+                  <w:rFonts w:ascii="微軟正黑體" w:eastAsia="微軟正黑體" w:hAnsi="微軟正黑體" w:hint="eastAsia"/>
                   <w:color w:val="4472C4" w:themeColor="accent1"/>
                   <w:sz w:val="28"/>
                   <w:szCs w:val="28"/>
@@ -197,11 +201,13 @@
             <w:spacing w:before="480"/>
             <w:jc w:val="center"/>
             <w:rPr>
+              <w:rFonts w:ascii="微軟正黑體" w:eastAsia="微軟正黑體" w:hAnsi="微軟正黑體"/>
               <w:color w:val="4472C4" w:themeColor="accent1"/>
             </w:rPr>
           </w:pPr>
           <w:r>
             <w:rPr>
+              <w:rFonts w:ascii="微軟正黑體" w:eastAsia="微軟正黑體" w:hAnsi="微軟正黑體"/>
               <w:noProof/>
               <w:color w:val="4472C4" w:themeColor="accent1"/>
             </w:rPr>
@@ -617,12 +623,14 @@
           </w:r>
           <w:r>
             <w:rPr>
+              <w:rFonts w:ascii="微軟正黑體" w:eastAsia="微軟正黑體" w:hAnsi="微軟正黑體"/>
               <w:noProof/>
             </w:rPr>
             <w:t xml:space="preserve"> </w:t>
           </w:r>
           <w:r>
             <w:rPr>
+              <w:rFonts w:ascii="微軟正黑體" w:eastAsia="微軟正黑體" w:hAnsi="微軟正黑體"/>
               <w:noProof/>
             </w:rPr>
             <w:drawing>
@@ -698,6 +706,7 @@
     <w:sdt>
       <w:sdtPr>
         <w:rPr>
+          <w:rFonts w:ascii="微軟正黑體" w:eastAsia="微軟正黑體" w:hAnsi="微軟正黑體"/>
           <w:lang w:val="zh-TW"/>
         </w:rPr>
         <w:id w:val="-799080769"/>
@@ -708,7 +717,7 @@
       </w:sdtPr>
       <w:sdtEndPr>
         <w:rPr>
-          <w:rFonts w:asciiTheme="minorHAnsi" w:eastAsiaTheme="minorEastAsia" w:hAnsiTheme="minorHAnsi" w:cstheme="minorBidi"/>
+          <w:rFonts w:cstheme="minorBidi"/>
           <w:b/>
           <w:bCs/>
           <w:color w:val="auto"/>
@@ -722,9 +731,13 @@
         <w:p>
           <w:pPr>
             <w:pStyle w:val="af5"/>
+            <w:rPr>
+              <w:rFonts w:ascii="微軟正黑體" w:eastAsia="微軟正黑體" w:hAnsi="微軟正黑體"/>
+            </w:rPr>
           </w:pPr>
           <w:r>
             <w:rPr>
+              <w:rFonts w:ascii="微軟正黑體" w:eastAsia="微軟正黑體" w:hAnsi="微軟正黑體"/>
               <w:lang w:val="zh-TW"/>
             </w:rPr>
             <w:t>內容</w:t>
@@ -737,56 +750,40 @@
               <w:tab w:val="right" w:leader="dot" w:pos="8296"/>
             </w:tabs>
             <w:rPr>
+              <w:rFonts w:ascii="微軟正黑體" w:eastAsia="微軟正黑體" w:hAnsi="微軟正黑體"/>
               <w:noProof/>
             </w:rPr>
           </w:pPr>
           <w:r>
+            <w:rPr>
+              <w:rFonts w:ascii="微軟正黑體" w:eastAsia="微軟正黑體" w:hAnsi="微軟正黑體"/>
+            </w:rPr>
             <w:fldChar w:fldCharType="begin"/>
           </w:r>
           <w:r>
+            <w:rPr>
+              <w:rFonts w:ascii="微軟正黑體" w:eastAsia="微軟正黑體" w:hAnsi="微軟正黑體"/>
+            </w:rPr>
             <w:instrText xml:space="preserve"> TOC \o "1-3" \h \z \u </w:instrText>
           </w:r>
           <w:r>
+            <w:rPr>
+              <w:rFonts w:ascii="微軟正黑體" w:eastAsia="微軟正黑體" w:hAnsi="微軟正黑體"/>
+            </w:rPr>
             <w:fldChar w:fldCharType="separate"/>
           </w:r>
-          <w:hyperlink w:anchor="_Toc232944189" w:history="1">
+          <w:hyperlink w:anchor="_Toc232947564" w:history="1">
             <w:r>
               <w:rPr>
                 <w:rStyle w:val="af6"/>
+                <w:rFonts w:ascii="微軟正黑體" w:eastAsia="微軟正黑體" w:hAnsi="微軟正黑體"/>
                 <w:noProof/>
               </w:rPr>
-              <w:t>選定的</w:t>
+              <w:t>選定的 TCP 版本名稱及其壅塞控制(congestion control)機制描述</w:t>
             </w:r>
             <w:r>
               <w:rPr>
-                <w:rStyle w:val="af6"/>
-                <w:noProof/>
-              </w:rPr>
-              <w:t xml:space="preserve"> TCP </w:t>
-            </w:r>
-            <w:r>
-              <w:rPr>
-                <w:rStyle w:val="af6"/>
-                <w:noProof/>
-              </w:rPr>
-              <w:t>版本名稱及其壅塞控制</w:t>
-            </w:r>
-            <w:r>
-              <w:rPr>
-                <w:rStyle w:val="af6"/>
-                <w:noProof/>
-              </w:rPr>
-              <w:t>(congestion control)</w:t>
-            </w:r>
-            <w:r>
-              <w:rPr>
-                <w:rStyle w:val="af6"/>
-                <w:noProof/>
-              </w:rPr>
-              <w:t>機制描述</w:t>
-            </w:r>
-            <w:r>
-              <w:rPr>
+                <w:rFonts w:ascii="微軟正黑體" w:eastAsia="微軟正黑體" w:hAnsi="微軟正黑體"/>
                 <w:noProof/>
                 <w:webHidden/>
               </w:rPr>
@@ -794,6 +791,7 @@
             </w:r>
             <w:r>
               <w:rPr>
+                <w:rFonts w:ascii="微軟正黑體" w:eastAsia="微軟正黑體" w:hAnsi="微軟正黑體"/>
                 <w:noProof/>
                 <w:webHidden/>
               </w:rPr>
@@ -801,19 +799,22 @@
             </w:r>
             <w:r>
               <w:rPr>
+                <w:rFonts w:ascii="微軟正黑體" w:eastAsia="微軟正黑體" w:hAnsi="微軟正黑體"/>
                 <w:noProof/>
                 <w:webHidden/>
               </w:rPr>
-              <w:instrText xml:space="preserve"> PAGEREF _Toc232944189 \h </w:instrText>
+              <w:instrText xml:space="preserve"> PAGEREF _Toc232947564 \h </w:instrText>
             </w:r>
             <w:r>
               <w:rPr>
+                <w:rFonts w:ascii="微軟正黑體" w:eastAsia="微軟正黑體" w:hAnsi="微軟正黑體"/>
                 <w:noProof/>
                 <w:webHidden/>
               </w:rPr>
             </w:r>
             <w:r>
               <w:rPr>
+                <w:rFonts w:ascii="微軟正黑體" w:eastAsia="微軟正黑體" w:hAnsi="微軟正黑體"/>
                 <w:noProof/>
                 <w:webHidden/>
               </w:rPr>
@@ -821,13 +822,15 @@
             </w:r>
             <w:r>
               <w:rPr>
+                <w:rFonts w:ascii="微軟正黑體" w:eastAsia="微軟正黑體" w:hAnsi="微軟正黑體"/>
                 <w:noProof/>
                 <w:webHidden/>
               </w:rPr>
-              <w:t>1</w:t>
+              <w:t>2</w:t>
             </w:r>
             <w:r>
               <w:rPr>
+                <w:rFonts w:ascii="微軟正黑體" w:eastAsia="微軟正黑體" w:hAnsi="微軟正黑體"/>
                 <w:noProof/>
                 <w:webHidden/>
               </w:rPr>
@@ -842,19 +845,22 @@
               <w:tab w:val="right" w:leader="dot" w:pos="8296"/>
             </w:tabs>
             <w:rPr>
+              <w:rFonts w:ascii="微軟正黑體" w:eastAsia="微軟正黑體" w:hAnsi="微軟正黑體"/>
               <w:noProof/>
             </w:rPr>
           </w:pPr>
-          <w:hyperlink w:anchor="_Toc232944190" w:history="1">
+          <w:hyperlink w:anchor="_Toc232947565" w:history="1">
             <w:r>
               <w:rPr>
                 <w:rStyle w:val="af6"/>
+                <w:rFonts w:ascii="微軟正黑體" w:eastAsia="微軟正黑體" w:hAnsi="微軟正黑體"/>
                 <w:noProof/>
               </w:rPr>
               <w:t>實驗場景及網路拓撲圖描述</w:t>
             </w:r>
             <w:r>
               <w:rPr>
+                <w:rFonts w:ascii="微軟正黑體" w:eastAsia="微軟正黑體" w:hAnsi="微軟正黑體"/>
                 <w:noProof/>
                 <w:webHidden/>
               </w:rPr>
@@ -862,6 +868,7 @@
             </w:r>
             <w:r>
               <w:rPr>
+                <w:rFonts w:ascii="微軟正黑體" w:eastAsia="微軟正黑體" w:hAnsi="微軟正黑體"/>
                 <w:noProof/>
                 <w:webHidden/>
               </w:rPr>
@@ -869,19 +876,22 @@
             </w:r>
             <w:r>
               <w:rPr>
+                <w:rFonts w:ascii="微軟正黑體" w:eastAsia="微軟正黑體" w:hAnsi="微軟正黑體"/>
                 <w:noProof/>
                 <w:webHidden/>
               </w:rPr>
-              <w:instrText xml:space="preserve"> PAGEREF _Toc232944190 \h </w:instrText>
+              <w:instrText xml:space="preserve"> PAGEREF _Toc232947565 \h </w:instrText>
             </w:r>
             <w:r>
               <w:rPr>
+                <w:rFonts w:ascii="微軟正黑體" w:eastAsia="微軟正黑體" w:hAnsi="微軟正黑體"/>
                 <w:noProof/>
                 <w:webHidden/>
               </w:rPr>
             </w:r>
             <w:r>
               <w:rPr>
+                <w:rFonts w:ascii="微軟正黑體" w:eastAsia="微軟正黑體" w:hAnsi="微軟正黑體"/>
                 <w:noProof/>
                 <w:webHidden/>
               </w:rPr>
@@ -889,13 +899,15 @@
             </w:r>
             <w:r>
               <w:rPr>
+                <w:rFonts w:ascii="微軟正黑體" w:eastAsia="微軟正黑體" w:hAnsi="微軟正黑體"/>
                 <w:noProof/>
                 <w:webHidden/>
               </w:rPr>
-              <w:t>1</w:t>
+              <w:t>3</w:t>
             </w:r>
             <w:r>
               <w:rPr>
+                <w:rFonts w:ascii="微軟正黑體" w:eastAsia="微軟正黑體" w:hAnsi="微軟正黑體"/>
                 <w:noProof/>
                 <w:webHidden/>
               </w:rPr>
@@ -910,19 +922,22 @@
               <w:tab w:val="right" w:leader="dot" w:pos="8296"/>
             </w:tabs>
             <w:rPr>
+              <w:rFonts w:ascii="微軟正黑體" w:eastAsia="微軟正黑體" w:hAnsi="微軟正黑體"/>
               <w:noProof/>
             </w:rPr>
           </w:pPr>
-          <w:hyperlink w:anchor="_Toc232944191" w:history="1">
+          <w:hyperlink w:anchor="_Toc232947566" w:history="1">
             <w:r>
               <w:rPr>
                 <w:rStyle w:val="af6"/>
+                <w:rFonts w:ascii="微軟正黑體" w:eastAsia="微軟正黑體" w:hAnsi="微軟正黑體"/>
                 <w:noProof/>
               </w:rPr>
-              <w:t>效能圖：</w:t>
+              <w:t>效能圖與說明：</w:t>
             </w:r>
             <w:r>
               <w:rPr>
+                <w:rFonts w:ascii="微軟正黑體" w:eastAsia="微軟正黑體" w:hAnsi="微軟正黑體"/>
                 <w:noProof/>
                 <w:webHidden/>
               </w:rPr>
@@ -930,6 +945,7 @@
             </w:r>
             <w:r>
               <w:rPr>
+                <w:rFonts w:ascii="微軟正黑體" w:eastAsia="微軟正黑體" w:hAnsi="微軟正黑體"/>
                 <w:noProof/>
                 <w:webHidden/>
               </w:rPr>
@@ -937,19 +953,22 @@
             </w:r>
             <w:r>
               <w:rPr>
+                <w:rFonts w:ascii="微軟正黑體" w:eastAsia="微軟正黑體" w:hAnsi="微軟正黑體"/>
                 <w:noProof/>
                 <w:webHidden/>
               </w:rPr>
-              <w:instrText xml:space="preserve"> PAGEREF _Toc232944191 \h </w:instrText>
+              <w:instrText xml:space="preserve"> PAGEREF _Toc232947566 \h </w:instrText>
             </w:r>
             <w:r>
               <w:rPr>
+                <w:rFonts w:ascii="微軟正黑體" w:eastAsia="微軟正黑體" w:hAnsi="微軟正黑體"/>
                 <w:noProof/>
                 <w:webHidden/>
               </w:rPr>
             </w:r>
             <w:r>
               <w:rPr>
+                <w:rFonts w:ascii="微軟正黑體" w:eastAsia="微軟正黑體" w:hAnsi="微軟正黑體"/>
                 <w:noProof/>
                 <w:webHidden/>
               </w:rPr>
@@ -957,13 +976,15 @@
             </w:r>
             <w:r>
               <w:rPr>
+                <w:rFonts w:ascii="微軟正黑體" w:eastAsia="微軟正黑體" w:hAnsi="微軟正黑體"/>
                 <w:noProof/>
                 <w:webHidden/>
               </w:rPr>
-              <w:t>3</w:t>
+              <w:t>6</w:t>
             </w:r>
             <w:r>
               <w:rPr>
+                <w:rFonts w:ascii="微軟正黑體" w:eastAsia="微軟正黑體" w:hAnsi="微軟正黑體"/>
                 <w:noProof/>
                 <w:webHidden/>
               </w:rPr>
@@ -978,19 +999,22 @@
               <w:tab w:val="right" w:leader="dot" w:pos="8296"/>
             </w:tabs>
             <w:rPr>
+              <w:rFonts w:ascii="微軟正黑體" w:eastAsia="微軟正黑體" w:hAnsi="微軟正黑體"/>
               <w:noProof/>
             </w:rPr>
           </w:pPr>
-          <w:hyperlink w:anchor="_Toc232944192" w:history="1">
+          <w:hyperlink w:anchor="_Toc232947567" w:history="1">
             <w:r>
               <w:rPr>
                 <w:rStyle w:val="af6"/>
+                <w:rFonts w:ascii="微軟正黑體" w:eastAsia="微軟正黑體" w:hAnsi="微軟正黑體"/>
                 <w:noProof/>
               </w:rPr>
-              <w:t>對效能圖的說明及解釋</w:t>
+              <w:t>心得與其他實作</w:t>
             </w:r>
             <w:r>
               <w:rPr>
+                <w:rFonts w:ascii="微軟正黑體" w:eastAsia="微軟正黑體" w:hAnsi="微軟正黑體"/>
                 <w:noProof/>
                 <w:webHidden/>
               </w:rPr>
@@ -998,6 +1022,7 @@
             </w:r>
             <w:r>
               <w:rPr>
+                <w:rFonts w:ascii="微軟正黑體" w:eastAsia="微軟正黑體" w:hAnsi="微軟正黑體"/>
                 <w:noProof/>
                 <w:webHidden/>
               </w:rPr>
@@ -1005,19 +1030,22 @@
             </w:r>
             <w:r>
               <w:rPr>
+                <w:rFonts w:ascii="微軟正黑體" w:eastAsia="微軟正黑體" w:hAnsi="微軟正黑體"/>
                 <w:noProof/>
                 <w:webHidden/>
               </w:rPr>
-              <w:instrText xml:space="preserve"> PAGEREF _Toc232944192 \h </w:instrText>
+              <w:instrText xml:space="preserve"> PAGEREF _Toc232947567 \h </w:instrText>
             </w:r>
             <w:r>
               <w:rPr>
+                <w:rFonts w:ascii="微軟正黑體" w:eastAsia="微軟正黑體" w:hAnsi="微軟正黑體"/>
                 <w:noProof/>
                 <w:webHidden/>
               </w:rPr>
             </w:r>
             <w:r>
               <w:rPr>
+                <w:rFonts w:ascii="微軟正黑體" w:eastAsia="微軟正黑體" w:hAnsi="微軟正黑體"/>
                 <w:noProof/>
                 <w:webHidden/>
               </w:rPr>
@@ -1025,13 +1053,15 @@
             </w:r>
             <w:r>
               <w:rPr>
+                <w:rFonts w:ascii="微軟正黑體" w:eastAsia="微軟正黑體" w:hAnsi="微軟正黑體"/>
                 <w:noProof/>
                 <w:webHidden/>
               </w:rPr>
-              <w:t>5</w:t>
+              <w:t>8</w:t>
             </w:r>
             <w:r>
               <w:rPr>
+                <w:rFonts w:ascii="微軟正黑體" w:eastAsia="微軟正黑體" w:hAnsi="微軟正黑體"/>
                 <w:noProof/>
                 <w:webHidden/>
               </w:rPr>
@@ -1040,8 +1070,91 @@
           </w:hyperlink>
         </w:p>
         <w:p>
+          <w:pPr>
+            <w:pStyle w:val="11"/>
+            <w:tabs>
+              <w:tab w:val="right" w:leader="dot" w:pos="8296"/>
+            </w:tabs>
+            <w:rPr>
+              <w:rFonts w:ascii="微軟正黑體" w:eastAsia="微軟正黑體" w:hAnsi="微軟正黑體"/>
+              <w:noProof/>
+            </w:rPr>
+          </w:pPr>
+          <w:hyperlink w:anchor="_Toc232947568" w:history="1">
+            <w:r>
+              <w:rPr>
+                <w:rStyle w:val="af6"/>
+                <w:rFonts w:ascii="微軟正黑體" w:eastAsia="微軟正黑體" w:hAnsi="微軟正黑體"/>
+                <w:noProof/>
+              </w:rPr>
+              <w:t>GitHub連結</w:t>
+            </w:r>
+            <w:r>
+              <w:rPr>
+                <w:rFonts w:ascii="微軟正黑體" w:eastAsia="微軟正黑體" w:hAnsi="微軟正黑體"/>
+                <w:noProof/>
+                <w:webHidden/>
+              </w:rPr>
+              <w:tab/>
+            </w:r>
+            <w:r>
+              <w:rPr>
+                <w:rFonts w:ascii="微軟正黑體" w:eastAsia="微軟正黑體" w:hAnsi="微軟正黑體"/>
+                <w:noProof/>
+                <w:webHidden/>
+              </w:rPr>
+              <w:fldChar w:fldCharType="begin"/>
+            </w:r>
+            <w:r>
+              <w:rPr>
+                <w:rFonts w:ascii="微軟正黑體" w:eastAsia="微軟正黑體" w:hAnsi="微軟正黑體"/>
+                <w:noProof/>
+                <w:webHidden/>
+              </w:rPr>
+              <w:instrText xml:space="preserve"> PAGEREF _Toc232947568 \h </w:instrText>
+            </w:r>
+            <w:r>
+              <w:rPr>
+                <w:rFonts w:ascii="微軟正黑體" w:eastAsia="微軟正黑體" w:hAnsi="微軟正黑體"/>
+                <w:noProof/>
+                <w:webHidden/>
+              </w:rPr>
+            </w:r>
+            <w:r>
+              <w:rPr>
+                <w:rFonts w:ascii="微軟正黑體" w:eastAsia="微軟正黑體" w:hAnsi="微軟正黑體"/>
+                <w:noProof/>
+                <w:webHidden/>
+              </w:rPr>
+              <w:fldChar w:fldCharType="separate"/>
+            </w:r>
+            <w:r>
+              <w:rPr>
+                <w:rFonts w:ascii="微軟正黑體" w:eastAsia="微軟正黑體" w:hAnsi="微軟正黑體"/>
+                <w:noProof/>
+                <w:webHidden/>
+              </w:rPr>
+              <w:t>8</w:t>
+            </w:r>
+            <w:r>
+              <w:rPr>
+                <w:rFonts w:ascii="微軟正黑體" w:eastAsia="微軟正黑體" w:hAnsi="微軟正黑體"/>
+                <w:noProof/>
+                <w:webHidden/>
+              </w:rPr>
+              <w:fldChar w:fldCharType="end"/>
+            </w:r>
+          </w:hyperlink>
+        </w:p>
+        <w:p>
+          <w:pPr>
+            <w:rPr>
+              <w:rFonts w:ascii="微軟正黑體" w:eastAsia="微軟正黑體" w:hAnsi="微軟正黑體"/>
+            </w:rPr>
+          </w:pPr>
           <w:r>
             <w:rPr>
+              <w:rFonts w:ascii="微軟正黑體" w:eastAsia="微軟正黑體" w:hAnsi="微軟正黑體"/>
               <w:b/>
               <w:bCs/>
               <w:lang w:val="zh-TW"/>
@@ -1055,80 +1168,686 @@
       <w:pPr>
         <w:widowControl/>
         <w:rPr>
-          <w:rFonts w:asciiTheme="majorHAnsi" w:eastAsiaTheme="majorEastAsia" w:hAnsiTheme="majorHAnsi" w:cstheme="majorBidi"/>
+          <w:rFonts w:ascii="微軟正黑體" w:eastAsia="微軟正黑體" w:hAnsi="微軟正黑體" w:cstheme="majorBidi"/>
           <w:color w:val="2F5496" w:themeColor="accent1" w:themeShade="BF"/>
           <w:sz w:val="48"/>
           <w:szCs w:val="48"/>
         </w:rPr>
       </w:pPr>
-      <w:bookmarkStart w:id="0" w:name="_Toc232944189"/>
-      <w:r>
+      <w:r>
+        <w:rPr>
+          <w:rFonts w:ascii="微軟正黑體" w:eastAsia="微軟正黑體" w:hAnsi="微軟正黑體"/>
+        </w:rPr>
         <w:br w:type="page"/>
       </w:r>
     </w:p>
     <w:p>
       <w:pPr>
         <w:pStyle w:val="1"/>
-      </w:pPr>
-      <w:r>
+        <w:rPr>
+          <w:rFonts w:ascii="微軟正黑體" w:eastAsia="微軟正黑體" w:hAnsi="微軟正黑體"/>
+        </w:rPr>
+      </w:pPr>
+      <w:bookmarkStart w:id="0" w:name="_Toc232947564"/>
+      <w:r>
+        <w:rPr>
+          <w:rFonts w:ascii="微軟正黑體" w:eastAsia="微軟正黑體" w:hAnsi="微軟正黑體"/>
+        </w:rPr>
         <w:lastRenderedPageBreak/>
-        <w:t>選定的</w:t>
-      </w:r>
-      <w:r>
-        <w:t xml:space="preserve"> TCP </w:t>
-      </w:r>
-      <w:r>
-        <w:t>版本名稱及其壅塞控制</w:t>
-      </w:r>
-      <w:r>
-        <w:t>(congestion control)</w:t>
-      </w:r>
-      <w:r>
-        <w:t>機制描述</w:t>
+        <w:t>選定的 TCP 版本名稱及其壅塞控制(congestion control)機制描述</w:t>
       </w:r>
       <w:bookmarkEnd w:id="0"/>
     </w:p>
     <w:p>
       <w:pPr>
-        <w:rPr>
-          <w:rFonts w:ascii="微軟正黑體" w:eastAsia="微軟正黑體" w:hAnsi="微軟正黑體"/>
-        </w:rPr>
-      </w:pPr>
-      <w:r>
-        <w:rPr>
-          <w:rFonts w:ascii="微軟正黑體" w:eastAsia="微軟正黑體" w:hAnsi="微軟正黑體" w:hint="eastAsia"/>
-        </w:rPr>
-        <w:t>TCP-Vegas</w:t>
-      </w:r>
-    </w:p>
-    <w:p>
-      <w:pPr>
-        <w:rPr>
-          <w:rFonts w:ascii="微軟正黑體" w:eastAsia="微軟正黑體" w:hAnsi="微軟正黑體"/>
-        </w:rPr>
-      </w:pPr>
-      <w:r>
-        <w:rPr>
-          <w:rFonts w:ascii="微軟正黑體" w:eastAsia="微軟正黑體" w:hAnsi="微軟正黑體" w:hint="eastAsia"/>
-        </w:rPr>
-        <w:t>機制描述(參考於NS3文件)</w:t>
-      </w:r>
+        <w:ind w:firstLineChars="200" w:firstLine="480"/>
+        <w:rPr>
+          <w:rFonts w:ascii="微軟正黑體" w:eastAsia="微軟正黑體" w:hAnsi="微軟正黑體" w:hint="eastAsia"/>
+        </w:rPr>
+      </w:pPr>
+      <w:r>
+        <w:rPr>
+          <w:rFonts w:ascii="微軟正黑體" w:eastAsia="微軟正黑體" w:hAnsi="微軟正黑體" w:hint="eastAsia"/>
+        </w:rPr>
+        <w:t>選定TCP Vegas。</w:t>
+      </w:r>
+    </w:p>
+    <w:p>
+      <w:pPr>
+        <w:ind w:firstLineChars="200" w:firstLine="480"/>
+        <w:rPr>
+          <w:rFonts w:ascii="微軟正黑體" w:eastAsia="微軟正黑體" w:hAnsi="微軟正黑體"/>
+        </w:rPr>
+      </w:pPr>
+      <w:r>
+        <w:rPr>
+          <w:rFonts w:ascii="微軟正黑體" w:eastAsia="微軟正黑體" w:hAnsi="微軟正黑體" w:hint="eastAsia"/>
+        </w:rPr>
+        <w:t>Vegas</w:t>
+      </w:r>
+      <w:r>
+        <w:rPr>
+          <w:rFonts w:ascii="微軟正黑體" w:eastAsia="微軟正黑體" w:hAnsi="微軟正黑體" w:hint="eastAsia"/>
+        </w:rPr>
+        <w:t>壅塞控制</w:t>
+      </w:r>
+      <w:r>
+        <w:rPr>
+          <w:rFonts w:ascii="微軟正黑體" w:eastAsia="微軟正黑體" w:hAnsi="微軟正黑體" w:hint="eastAsia"/>
+        </w:rPr>
+        <w:t>機制描述(參考於NS3文件</w:t>
+      </w:r>
+      <w:r>
+        <w:rPr>
+          <w:rFonts w:ascii="微軟正黑體" w:eastAsia="微軟正黑體" w:hAnsi="微軟正黑體" w:hint="eastAsia"/>
+        </w:rPr>
+        <w:t>：</w:t>
+      </w:r>
+      <w:hyperlink r:id="rId11" w:history="1">
+        <w:r>
+          <w:rPr>
+            <w:rStyle w:val="af6"/>
+            <w:rFonts w:ascii="微軟正黑體" w:eastAsia="微軟正黑體" w:hAnsi="微軟正黑體"/>
+          </w:rPr>
+          <w:t>https://www.nsnam.org/doxygen/d6/de2/classns3_1_1_tcp_vegas.html</w:t>
+        </w:r>
+      </w:hyperlink>
+    </w:p>
+    <w:p>
+      <w:pPr>
+        <w:rPr>
+          <w:rFonts w:ascii="微軟正黑體" w:eastAsia="微軟正黑體" w:hAnsi="微軟正黑體"/>
+        </w:rPr>
+      </w:pPr>
+      <w:r>
+        <w:rPr>
+          <w:rFonts w:ascii="微軟正黑體" w:eastAsia="微軟正黑體" w:hAnsi="微軟正黑體" w:hint="eastAsia"/>
+        </w:rPr>
+        <w:t>)</w:t>
+      </w:r>
+    </w:p>
+    <w:p>
+      <w:pPr>
+        <w:ind w:firstLineChars="200" w:firstLine="480"/>
+        <w:rPr>
+          <w:rFonts w:ascii="微軟正黑體" w:eastAsia="微軟正黑體" w:hAnsi="微軟正黑體" w:hint="eastAsia"/>
+        </w:rPr>
+      </w:pPr>
+      <w:r>
+        <w:rPr>
+          <w:rFonts w:ascii="微軟正黑體" w:eastAsia="微軟正黑體" w:hAnsi="微軟正黑體"/>
+        </w:rPr>
+        <w:t>TCP Vegas 是一種純粹基於延遲的擁塞控制演算法，它採用主動方案，透過在瓶頸佇列中保持較小的</w:t>
+      </w:r>
+      <w:r>
+        <w:rPr>
+          <w:rFonts w:ascii="微軟正黑體" w:eastAsia="微軟正黑體" w:hAnsi="微軟正黑體"/>
+        </w:rPr>
+        <w:t>封包積壓</w:t>
+      </w:r>
+      <w:r>
+        <w:rPr>
+          <w:rFonts w:ascii="微軟正黑體" w:eastAsia="微軟正黑體" w:hAnsi="微軟正黑體" w:hint="eastAsia"/>
+        </w:rPr>
+        <w:t>(Backlog)</w:t>
+      </w:r>
+      <w:r>
+        <w:rPr>
+          <w:rFonts w:ascii="微軟正黑體" w:eastAsia="微軟正黑體" w:hAnsi="微軟正黑體"/>
+        </w:rPr>
+        <w:t>來防止丟包</w:t>
+      </w:r>
+      <w:r>
+        <w:rPr>
+          <w:rFonts w:ascii="微軟正黑體" w:eastAsia="微軟正黑體" w:hAnsi="微軟正黑體" w:hint="eastAsia"/>
+        </w:rPr>
+        <w:t>，意即主動降低</w:t>
+      </w:r>
+      <w:proofErr w:type="spellStart"/>
+      <w:r>
+        <w:rPr>
+          <w:rFonts w:ascii="微軟正黑體" w:eastAsia="微軟正黑體" w:hAnsi="微軟正黑體" w:hint="eastAsia"/>
+        </w:rPr>
+        <w:t>cwnd</w:t>
+      </w:r>
+      <w:proofErr w:type="spellEnd"/>
+      <w:r>
+        <w:rPr>
+          <w:rFonts w:ascii="微軟正黑體" w:eastAsia="微軟正黑體" w:hAnsi="微軟正黑體" w:hint="eastAsia"/>
+        </w:rPr>
+        <w:t>值來減少壅塞發生</w:t>
+      </w:r>
+      <w:r>
+        <w:rPr>
+          <w:rFonts w:ascii="微軟正黑體" w:eastAsia="微軟正黑體" w:hAnsi="微軟正黑體" w:hint="eastAsia"/>
+        </w:rPr>
+        <w:t>，</w:t>
+      </w:r>
+      <w:proofErr w:type="spellStart"/>
+      <w:r>
+        <w:rPr>
+          <w:rFonts w:ascii="微軟正黑體" w:eastAsia="微軟正黑體" w:hAnsi="微軟正黑體" w:hint="eastAsia"/>
+        </w:rPr>
+        <w:t>BaseRTT</w:t>
+      </w:r>
+      <w:proofErr w:type="spellEnd"/>
+      <w:r>
+        <w:rPr>
+          <w:rFonts w:ascii="微軟正黑體" w:eastAsia="微軟正黑體" w:hAnsi="微軟正黑體" w:hint="eastAsia"/>
+        </w:rPr>
+        <w:t>連線過程中觀測到的最小RTT值。</w:t>
+      </w:r>
+    </w:p>
+    <w:p>
+      <w:pPr>
+        <w:ind w:firstLineChars="200" w:firstLine="480"/>
+        <w:rPr>
+          <w:rFonts w:ascii="微軟正黑體" w:eastAsia="微軟正黑體" w:hAnsi="微軟正黑體"/>
+        </w:rPr>
+      </w:pPr>
+      <w:r>
+        <w:rPr>
+          <w:rFonts w:ascii="微軟正黑體" w:eastAsia="微軟正黑體" w:hAnsi="微軟正黑體"/>
+        </w:rPr>
+        <w:t>Vegas 會持續測量連接的實際吞吐量（如公式 (1) 所示），並與公式 (2) 計算的預期吞吐量進行比較。公式 (3) 中這兩</w:t>
+      </w:r>
+      <w:proofErr w:type="gramStart"/>
+      <w:r>
+        <w:rPr>
+          <w:rFonts w:ascii="微軟正黑體" w:eastAsia="微軟正黑體" w:hAnsi="微軟正黑體"/>
+        </w:rPr>
+        <w:t>個</w:t>
+      </w:r>
+      <w:proofErr w:type="gramEnd"/>
+      <w:r>
+        <w:rPr>
+          <w:rFonts w:ascii="微軟正黑體" w:eastAsia="微軟正黑體" w:hAnsi="微軟正黑體"/>
+        </w:rPr>
+        <w:t>發送速率之間的差異反映了瓶頸處排隊的額外資料包數量。</w:t>
+      </w:r>
+    </w:p>
+    <w:p>
+      <w:pPr>
+        <w:rPr>
+          <w:rFonts w:ascii="Cambria Math" w:eastAsia="微軟正黑體" w:hAnsi="Cambria Math"/>
+          <w:oMath/>
+        </w:rPr>
+      </w:pPr>
+      <m:oMathPara>
+        <m:oMath>
+          <m:r>
+            <w:rPr>
+              <w:rFonts w:ascii="Cambria Math" w:eastAsia="微軟正黑體" w:hAnsi="Cambria Math"/>
+            </w:rPr>
+            <m:t xml:space="preserve">actual = </m:t>
+          </m:r>
+          <m:f>
+            <m:fPr>
+              <m:ctrlPr>
+                <w:rPr>
+                  <w:rFonts w:ascii="Cambria Math" w:eastAsia="微軟正黑體" w:hAnsi="Cambria Math"/>
+                  <w:i/>
+                </w:rPr>
+              </m:ctrlPr>
+            </m:fPr>
+            <m:num>
+              <m:r>
+                <w:rPr>
+                  <w:rFonts w:ascii="Cambria Math" w:eastAsia="微軟正黑體" w:hAnsi="Cambria Math"/>
+                </w:rPr>
+                <m:t>cwnd</m:t>
+              </m:r>
+            </m:num>
+            <m:den>
+              <m:r>
+                <w:rPr>
+                  <w:rFonts w:ascii="Cambria Math" w:eastAsia="微軟正黑體" w:hAnsi="Cambria Math"/>
+                </w:rPr>
+                <m:t>RTT</m:t>
+              </m:r>
+            </m:den>
+          </m:f>
+          <m:r>
+            <w:rPr>
+              <w:rFonts w:ascii="Cambria Math" w:eastAsia="微軟正黑體" w:hAnsi="Cambria Math"/>
+            </w:rPr>
+            <m:t xml:space="preserve">   </m:t>
+          </m:r>
+          <m:r>
+            <w:rPr>
+              <w:rFonts w:ascii="Cambria Math" w:eastAsia="微軟正黑體" w:hAnsi="Cambria Math"/>
+            </w:rPr>
+            <m:t>(1)</m:t>
+          </m:r>
+          <m:r>
+            <w:rPr>
+              <w:rFonts w:ascii="Cambria Math" w:eastAsia="微軟正黑體" w:hAnsi="Cambria Math"/>
+            </w:rPr>
+            <m:t xml:space="preserve">      </m:t>
+          </m:r>
+        </m:oMath>
+      </m:oMathPara>
+    </w:p>
+    <w:p>
+      <w:pPr>
+        <w:rPr>
+          <w:rFonts w:ascii="Cambria Math" w:eastAsia="微軟正黑體" w:hAnsi="Cambria Math"/>
+          <w:oMath/>
+        </w:rPr>
+      </w:pPr>
+      <m:oMathPara>
+        <m:oMath>
+          <m:r>
+            <w:rPr>
+              <w:rFonts w:ascii="Cambria Math" w:eastAsia="微軟正黑體" w:hAnsi="Cambria Math"/>
+            </w:rPr>
+            <m:t xml:space="preserve">expected = </m:t>
+          </m:r>
+          <m:f>
+            <m:fPr>
+              <m:ctrlPr>
+                <w:rPr>
+                  <w:rFonts w:ascii="Cambria Math" w:eastAsia="微軟正黑體" w:hAnsi="Cambria Math"/>
+                  <w:i/>
+                </w:rPr>
+              </m:ctrlPr>
+            </m:fPr>
+            <m:num>
+              <m:r>
+                <w:rPr>
+                  <w:rFonts w:ascii="Cambria Math" w:eastAsia="微軟正黑體" w:hAnsi="Cambria Math"/>
+                </w:rPr>
+                <m:t>cwnd</m:t>
+              </m:r>
+            </m:num>
+            <m:den>
+              <m:r>
+                <w:rPr>
+                  <w:rFonts w:ascii="Cambria Math" w:eastAsia="微軟正黑體" w:hAnsi="Cambria Math"/>
+                </w:rPr>
+                <m:t>BaseRTT</m:t>
+              </m:r>
+            </m:den>
+          </m:f>
+          <m:r>
+            <w:rPr>
+              <w:rFonts w:ascii="Cambria Math" w:eastAsia="微軟正黑體" w:hAnsi="Cambria Math"/>
+            </w:rPr>
+            <m:t xml:space="preserve"> (2)</m:t>
+          </m:r>
+          <m:r>
+            <w:rPr>
+              <w:rFonts w:ascii="Cambria Math" w:eastAsia="微軟正黑體" w:hAnsi="Cambria Math"/>
+            </w:rPr>
+            <m:t xml:space="preserve"> </m:t>
+          </m:r>
+        </m:oMath>
+      </m:oMathPara>
+    </w:p>
+    <w:p>
+      <w:pPr>
+        <w:rPr>
+          <w:rFonts w:ascii="微軟正黑體" w:eastAsia="微軟正黑體" w:hAnsi="微軟正黑體" w:hint="eastAsia"/>
+        </w:rPr>
+      </w:pPr>
+      <m:oMathPara>
+        <m:oMath>
+          <m:r>
+            <w:rPr>
+              <w:rFonts w:ascii="Cambria Math" w:eastAsia="微軟正黑體" w:hAnsi="Cambria Math"/>
+            </w:rPr>
+            <m:t>diff = expected - actua</m:t>
+          </m:r>
+          <m:r>
+            <w:rPr>
+              <w:rFonts w:ascii="Cambria Math" w:eastAsia="微軟正黑體" w:hAnsi="Cambria Math"/>
+            </w:rPr>
+            <m:t>l</m:t>
+          </m:r>
+          <m:r>
+            <w:rPr>
+              <w:rFonts w:ascii="Cambria Math" w:eastAsia="微軟正黑體" w:hAnsi="Cambria Math"/>
+            </w:rPr>
+            <m:t xml:space="preserve"> (3)</m:t>
+          </m:r>
+        </m:oMath>
+      </m:oMathPara>
+    </w:p>
+    <w:p>
+      <w:pPr>
+        <w:rPr>
+          <w:rFonts w:ascii="微軟正黑體" w:eastAsia="微軟正黑體" w:hAnsi="微軟正黑體"/>
+        </w:rPr>
+      </w:pPr>
+      <w:r>
+        <w:rPr>
+          <w:rFonts w:ascii="微軟正黑體" w:eastAsia="微軟正黑體" w:hAnsi="微軟正黑體" w:hint="eastAsia"/>
+        </w:rPr>
+        <w:t xml:space="preserve">    </w:t>
+      </w:r>
+      <w:r>
+        <w:rPr>
+          <w:rFonts w:ascii="微軟正黑體" w:eastAsia="微軟正黑體" w:hAnsi="微軟正黑體" w:hint="eastAsia"/>
+        </w:rPr>
+        <w:t>有三個</w:t>
+      </w:r>
+      <w:r>
+        <w:rPr>
+          <w:rFonts w:ascii="微軟正黑體" w:eastAsia="微軟正黑體" w:hAnsi="微軟正黑體" w:hint="eastAsia"/>
+        </w:rPr>
+        <w:t>參數</w:t>
+      </w:r>
+      <w:r>
+        <w:rPr>
+          <w:rFonts w:ascii="微軟正黑體" w:eastAsia="微軟正黑體" w:hAnsi="微軟正黑體" w:hint="eastAsia"/>
+        </w:rPr>
+        <w:t>值alpha, beta, gamma，</w:t>
+      </w:r>
+      <w:r>
+        <w:rPr>
+          <w:rFonts w:ascii="微軟正黑體" w:eastAsia="微軟正黑體" w:hAnsi="微軟正黑體" w:hint="eastAsia"/>
+        </w:rPr>
+        <w:t>預設為2, 4, 1，Vegas用預期吞吐量</w:t>
+      </w:r>
+      <w:r>
+        <w:rPr>
+          <w:rFonts w:ascii="微軟正黑體" w:eastAsia="微軟正黑體" w:hAnsi="微軟正黑體" w:hint="eastAsia"/>
+        </w:rPr>
+        <w:lastRenderedPageBreak/>
+        <w:t>與實際吞吐量的差異diff 公式(3)來調整</w:t>
+      </w:r>
+      <w:proofErr w:type="spellStart"/>
+      <w:r>
+        <w:rPr>
+          <w:rFonts w:ascii="微軟正黑體" w:eastAsia="微軟正黑體" w:hAnsi="微軟正黑體" w:hint="eastAsia"/>
+        </w:rPr>
+        <w:t>cwnd</w:t>
+      </w:r>
+      <w:proofErr w:type="spellEnd"/>
+      <w:r>
+        <w:rPr>
+          <w:rFonts w:ascii="微軟正黑體" w:eastAsia="微軟正黑體" w:hAnsi="微軟正黑體" w:hint="eastAsia"/>
+        </w:rPr>
+        <w:t>值，目標</w:t>
+      </w:r>
+      <m:oMath>
+        <m:r>
+          <w:rPr>
+            <w:rFonts w:ascii="Cambria Math" w:eastAsia="微軟正黑體" w:hAnsi="Cambria Math"/>
+          </w:rPr>
+          <m:t>alpha</m:t>
+        </m:r>
+        <m:r>
+          <w:rPr>
+            <w:rFonts w:ascii="Cambria Math" w:eastAsia="微軟正黑體" w:hAnsi="Cambria Math"/>
+          </w:rPr>
+          <m:t>≤</m:t>
+        </m:r>
+        <m:r>
+          <w:rPr>
+            <w:rFonts w:ascii="Cambria Math" w:eastAsia="微軟正黑體" w:hAnsi="Cambria Math"/>
+          </w:rPr>
+          <m:t>diff</m:t>
+        </m:r>
+        <m:r>
+          <w:rPr>
+            <w:rFonts w:ascii="Cambria Math" w:eastAsia="微軟正黑體" w:hAnsi="Cambria Math"/>
+          </w:rPr>
+          <m:t>≤</m:t>
+        </m:r>
+        <m:r>
+          <w:rPr>
+            <w:rFonts w:ascii="Cambria Math" w:eastAsia="微軟正黑體" w:hAnsi="Cambria Math"/>
+          </w:rPr>
+          <m:t>beta</m:t>
+        </m:r>
+      </m:oMath>
+      <w:r>
+        <w:rPr>
+          <w:rFonts w:ascii="微軟正黑體" w:eastAsia="微軟正黑體" w:hAnsi="微軟正黑體" w:hint="eastAsia"/>
+        </w:rPr>
+        <w:t>，而</w:t>
+      </w:r>
+      <w:r>
+        <w:rPr>
+          <w:rFonts w:ascii="微軟正黑體" w:eastAsia="微軟正黑體" w:hAnsi="微軟正黑體"/>
+        </w:rPr>
+        <w:t>g</w:t>
+      </w:r>
+      <w:r>
+        <w:rPr>
+          <w:rFonts w:ascii="微軟正黑體" w:eastAsia="微軟正黑體" w:hAnsi="微軟正黑體" w:hint="eastAsia"/>
+        </w:rPr>
+        <w:t>amma與diff用於緩啟動切換到壅塞避免上面。</w:t>
+      </w:r>
+    </w:p>
+    <w:p>
+      <w:pPr>
+        <w:rPr>
+          <w:rFonts w:ascii="微軟正黑體" w:eastAsia="微軟正黑體" w:hAnsi="微軟正黑體" w:hint="eastAsia"/>
+        </w:rPr>
+      </w:pPr>
+      <w:r>
+        <w:rPr>
+          <w:rFonts w:ascii="微軟正黑體" w:eastAsia="微軟正黑體" w:hAnsi="微軟正黑體" w:hint="eastAsia"/>
+        </w:rPr>
+        <w:t xml:space="preserve">    </w:t>
+      </w:r>
+      <w:proofErr w:type="spellStart"/>
+      <w:r>
+        <w:rPr>
+          <w:rFonts w:ascii="微軟正黑體" w:eastAsia="微軟正黑體" w:hAnsi="微軟正黑體"/>
+        </w:rPr>
+        <w:t>C</w:t>
+      </w:r>
+      <w:r>
+        <w:rPr>
+          <w:rFonts w:ascii="微軟正黑體" w:eastAsia="微軟正黑體" w:hAnsi="微軟正黑體" w:hint="eastAsia"/>
+        </w:rPr>
+        <w:t>wnd</w:t>
+      </w:r>
+      <w:proofErr w:type="spellEnd"/>
+      <w:r>
+        <w:rPr>
+          <w:rFonts w:ascii="微軟正黑體" w:eastAsia="微軟正黑體" w:hAnsi="微軟正黑體" w:hint="eastAsia"/>
+        </w:rPr>
+        <w:t>值調整：</w:t>
+      </w:r>
+    </w:p>
+    <w:p>
+      <w:pPr>
+        <w:pStyle w:val="aa"/>
+        <w:numPr>
+          <w:ilvl w:val="0"/>
+          <w:numId w:val="5"/>
+        </w:numPr>
+        <w:rPr>
+          <w:rFonts w:ascii="微軟正黑體" w:eastAsia="微軟正黑體" w:hAnsi="微軟正黑體"/>
+        </w:rPr>
+      </w:pPr>
+      <w:r>
+        <w:rPr>
+          <w:rFonts w:ascii="微軟正黑體" w:eastAsia="微軟正黑體" w:hAnsi="微軟正黑體" w:hint="eastAsia"/>
+        </w:rPr>
+        <w:t>如果</w:t>
+      </w:r>
+      <m:oMath>
+        <m:r>
+          <w:rPr>
+            <w:rFonts w:ascii="Cambria Math" w:eastAsia="微軟正黑體" w:hAnsi="Cambria Math" w:hint="eastAsia"/>
+          </w:rPr>
+          <m:t>diff &lt; alp</m:t>
+        </m:r>
+        <m:r>
+          <w:rPr>
+            <w:rFonts w:ascii="Cambria Math" w:eastAsia="微軟正黑體" w:hAnsi="Cambria Math" w:cs="Cambria Math"/>
+          </w:rPr>
+          <m:t>h</m:t>
+        </m:r>
+        <m:r>
+          <w:rPr>
+            <w:rFonts w:ascii="Cambria Math" w:eastAsia="微軟正黑體" w:hAnsi="Cambria Math" w:hint="eastAsia"/>
+          </w:rPr>
+          <m:t>a</m:t>
+        </m:r>
+      </m:oMath>
+      <w:r>
+        <w:rPr>
+          <w:rFonts w:ascii="微軟正黑體" w:eastAsia="微軟正黑體" w:hAnsi="微軟正黑體" w:hint="eastAsia"/>
+        </w:rPr>
+        <w:t>，網路還沒有明顯壅塞，</w:t>
+      </w:r>
+      <w:proofErr w:type="spellStart"/>
+      <w:r>
+        <w:rPr>
+          <w:rFonts w:ascii="微軟正黑體" w:eastAsia="微軟正黑體" w:hAnsi="微軟正黑體"/>
+        </w:rPr>
+        <w:t>c</w:t>
+      </w:r>
+      <w:r>
+        <w:rPr>
+          <w:rFonts w:ascii="微軟正黑體" w:eastAsia="微軟正黑體" w:hAnsi="微軟正黑體" w:hint="eastAsia"/>
+        </w:rPr>
+        <w:t>wnd</w:t>
+      </w:r>
+      <w:proofErr w:type="spellEnd"/>
+      <w:r>
+        <w:rPr>
+          <w:rFonts w:ascii="微軟正黑體" w:eastAsia="微軟正黑體" w:hAnsi="微軟正黑體" w:hint="eastAsia"/>
+        </w:rPr>
+        <w:t>增加</w:t>
+      </w:r>
+      <w:r>
+        <w:rPr>
+          <w:rFonts w:ascii="微軟正黑體" w:eastAsia="微軟正黑體" w:hAnsi="微軟正黑體" w:hint="eastAsia"/>
+        </w:rPr>
+        <w:t>。</w:t>
+      </w:r>
+    </w:p>
+    <w:p>
+      <w:pPr>
+        <w:pStyle w:val="aa"/>
+        <w:numPr>
+          <w:ilvl w:val="0"/>
+          <w:numId w:val="5"/>
+        </w:numPr>
+        <w:rPr>
+          <w:rFonts w:ascii="微軟正黑體" w:eastAsia="微軟正黑體" w:hAnsi="微軟正黑體"/>
+        </w:rPr>
+      </w:pPr>
+      <w:r>
+        <w:rPr>
+          <w:rFonts w:ascii="微軟正黑體" w:eastAsia="微軟正黑體" w:hAnsi="微軟正黑體" w:hint="eastAsia"/>
+        </w:rPr>
+        <w:t>如果</w:t>
+      </w:r>
+      <m:oMath>
+        <m:r>
+          <w:rPr>
+            <w:rFonts w:ascii="Cambria Math" w:eastAsia="微軟正黑體" w:hAnsi="Cambria Math"/>
+          </w:rPr>
+          <m:t>beta&lt;diff</m:t>
+        </m:r>
+      </m:oMath>
+      <w:r>
+        <w:rPr>
+          <w:rFonts w:ascii="微軟正黑體" w:eastAsia="微軟正黑體" w:hAnsi="微軟正黑體" w:hint="eastAsia"/>
+        </w:rPr>
+        <w:t>，</w:t>
+      </w:r>
+      <w:r>
+        <w:rPr>
+          <w:rFonts w:ascii="微軟正黑體" w:eastAsia="微軟正黑體" w:hAnsi="微軟正黑體" w:hint="eastAsia"/>
+        </w:rPr>
+        <w:t>可能壅塞了，</w:t>
+      </w:r>
+      <w:proofErr w:type="spellStart"/>
+      <w:r>
+        <w:rPr>
+          <w:rFonts w:ascii="微軟正黑體" w:eastAsia="微軟正黑體" w:hAnsi="微軟正黑體" w:hint="eastAsia"/>
+        </w:rPr>
+        <w:t>cwnd</w:t>
+      </w:r>
+      <w:proofErr w:type="spellEnd"/>
+      <w:r>
+        <w:rPr>
+          <w:rFonts w:ascii="微軟正黑體" w:eastAsia="微軟正黑體" w:hAnsi="微軟正黑體" w:hint="eastAsia"/>
+        </w:rPr>
+        <w:t>減少。</w:t>
+      </w:r>
+    </w:p>
+    <w:p>
+      <w:pPr>
+        <w:pStyle w:val="aa"/>
+        <w:numPr>
+          <w:ilvl w:val="0"/>
+          <w:numId w:val="5"/>
+        </w:numPr>
+        <w:rPr>
+          <w:rFonts w:ascii="微軟正黑體" w:eastAsia="微軟正黑體" w:hAnsi="微軟正黑體" w:hint="eastAsia"/>
+          <w:i/>
+        </w:rPr>
+      </w:pPr>
+      <w:r>
+        <w:rPr>
+          <w:rFonts w:ascii="微軟正黑體" w:eastAsia="微軟正黑體" w:hAnsi="微軟正黑體" w:hint="eastAsia"/>
+        </w:rPr>
+        <w:t>如果</w:t>
+      </w:r>
+      <m:oMath>
+        <m:r>
+          <w:rPr>
+            <w:rFonts w:ascii="Cambria Math" w:eastAsia="微軟正黑體" w:hAnsi="Cambria Math"/>
+          </w:rPr>
+          <m:t>alpha≤diff≤beta</m:t>
+        </m:r>
+      </m:oMath>
+      <w:r>
+        <w:rPr>
+          <w:rFonts w:ascii="微軟正黑體" w:eastAsia="微軟正黑體" w:hAnsi="微軟正黑體" w:hint="eastAsia"/>
+        </w:rPr>
+        <w:t>則</w:t>
+      </w:r>
+      <w:proofErr w:type="spellStart"/>
+      <w:r>
+        <w:rPr>
+          <w:rFonts w:ascii="微軟正黑體" w:eastAsia="微軟正黑體" w:hAnsi="微軟正黑體" w:hint="eastAsia"/>
+        </w:rPr>
+        <w:t>cwnd</w:t>
+      </w:r>
+      <w:proofErr w:type="spellEnd"/>
+      <w:r>
+        <w:rPr>
+          <w:rFonts w:ascii="微軟正黑體" w:eastAsia="微軟正黑體" w:hAnsi="微軟正黑體" w:hint="eastAsia"/>
+        </w:rPr>
+        <w:t>不變。</w:t>
+      </w:r>
+    </w:p>
+    <w:p>
+      <w:pPr>
+        <w:rPr>
+          <w:rFonts w:ascii="微軟正黑體" w:eastAsia="微軟正黑體" w:hAnsi="微軟正黑體"/>
+        </w:rPr>
+      </w:pPr>
     </w:p>
     <w:p>
       <w:pPr>
         <w:pStyle w:val="1"/>
-      </w:pPr>
-      <w:bookmarkStart w:id="1" w:name="_Toc232944190"/>
-      <w:r>
-        <w:rPr>
-          <w:rFonts w:hint="eastAsia"/>
+        <w:rPr>
+          <w:rFonts w:ascii="微軟正黑體" w:eastAsia="微軟正黑體" w:hAnsi="微軟正黑體"/>
+        </w:rPr>
+      </w:pPr>
+      <w:bookmarkStart w:id="1" w:name="_Toc232947565"/>
+      <w:r>
+        <w:rPr>
+          <w:rFonts w:ascii="微軟正黑體" w:eastAsia="微軟正黑體" w:hAnsi="微軟正黑體" w:hint="eastAsia"/>
         </w:rPr>
         <w:t>實驗場景及網路</w:t>
       </w:r>
       <w:proofErr w:type="gramStart"/>
       <w:r>
         <w:rPr>
-          <w:rFonts w:hint="eastAsia"/>
+          <w:rFonts w:ascii="微軟正黑體" w:eastAsia="微軟正黑體" w:hAnsi="微軟正黑體" w:hint="eastAsia"/>
         </w:rPr>
         <w:t>拓撲圖描述</w:t>
       </w:r>
@@ -1139,12 +1858,12 @@
       <w:pPr>
         <w:pStyle w:val="a6"/>
         <w:rPr>
-          <w:rFonts w:hint="eastAsia"/>
-        </w:rPr>
-      </w:pPr>
-      <w:r>
-        <w:rPr>
-          <w:rFonts w:hint="eastAsia"/>
+          <w:rFonts w:ascii="微軟正黑體" w:eastAsia="微軟正黑體" w:hAnsi="微軟正黑體" w:hint="eastAsia"/>
+        </w:rPr>
+      </w:pPr>
+      <w:r>
+        <w:rPr>
+          <w:rFonts w:ascii="微軟正黑體" w:eastAsia="微軟正黑體" w:hAnsi="微軟正黑體" w:hint="eastAsia"/>
         </w:rPr>
         <w:t>實驗參數</w:t>
       </w:r>
@@ -1346,6 +2065,7 @@
         <w:rPr>
           <w:rFonts w:ascii="微軟正黑體" w:eastAsia="微軟正黑體" w:hAnsi="微軟正黑體" w:hint="eastAsia"/>
         </w:rPr>
+        <w:lastRenderedPageBreak/>
         <w:t xml:space="preserve">Sender: </w:t>
       </w:r>
       <w:r>
@@ -1484,7 +2204,6 @@
         <w:rPr>
           <w:rFonts w:ascii="微軟正黑體" w:eastAsia="微軟正黑體" w:hAnsi="微軟正黑體" w:hint="eastAsia"/>
         </w:rPr>
-        <w:lastRenderedPageBreak/>
         <w:t xml:space="preserve">Reno: </w:t>
       </w:r>
       <w:r>
@@ -1927,18 +2646,466 @@
     <w:p>
       <w:pPr>
         <w:pStyle w:val="a6"/>
-      </w:pPr>
-      <w:r>
-        <w:rPr>
-          <w:rFonts w:hint="eastAsia"/>
+        <w:rPr>
+          <w:rFonts w:ascii="微軟正黑體" w:eastAsia="微軟正黑體" w:hAnsi="微軟正黑體"/>
+        </w:rPr>
+      </w:pPr>
+      <w:r>
+        <w:rPr>
+          <w:rFonts w:ascii="微軟正黑體" w:eastAsia="微軟正黑體" w:hAnsi="微軟正黑體" w:hint="eastAsia"/>
+        </w:rPr>
+        <w:t>參數說明</w:t>
+      </w:r>
+    </w:p>
+    <w:p>
+      <w:pPr>
+        <w:rPr>
+          <w:rFonts w:ascii="微軟正黑體" w:eastAsia="微軟正黑體" w:hAnsi="微軟正黑體"/>
+        </w:rPr>
+      </w:pPr>
+      <w:r>
+        <w:rPr>
+          <w:rFonts w:ascii="微軟正黑體" w:eastAsia="微軟正黑體" w:hAnsi="微軟正黑體" w:hint="eastAsia"/>
+        </w:rPr>
+        <w:lastRenderedPageBreak/>
+        <w:t xml:space="preserve">    為了使Router成為bottleneck將頻寬設定較小於Leaf值以便造成壅塞進而觀察機制的不同，Buffer Size依照範例給</w:t>
+      </w:r>
+      <w:proofErr w:type="gramStart"/>
+      <w:r>
+        <w:rPr>
+          <w:rFonts w:ascii="微軟正黑體" w:eastAsia="微軟正黑體" w:hAnsi="微軟正黑體" w:hint="eastAsia"/>
+        </w:rPr>
+        <w:t>的值無更動</w:t>
+      </w:r>
+      <w:proofErr w:type="gramEnd"/>
+      <w:r>
+        <w:rPr>
+          <w:rFonts w:ascii="微軟正黑體" w:eastAsia="微軟正黑體" w:hAnsi="微軟正黑體" w:hint="eastAsia"/>
+        </w:rPr>
+        <w:t>也沒有發生錯誤，</w:t>
+      </w:r>
+      <w:r>
+        <w:rPr>
+          <w:rFonts w:ascii="微軟正黑體" w:eastAsia="微軟正黑體" w:hAnsi="微軟正黑體" w:hint="eastAsia"/>
+        </w:rPr>
+        <w:t>模擬時間為了快速實驗設定60秒。</w:t>
+      </w:r>
+    </w:p>
+    <w:p>
+      <w:pPr>
+        <w:rPr>
+          <w:rFonts w:ascii="微軟正黑體" w:eastAsia="微軟正黑體" w:hAnsi="微軟正黑體"/>
+        </w:rPr>
+      </w:pPr>
+      <w:r>
+        <w:rPr>
+          <w:rFonts w:ascii="微軟正黑體" w:eastAsia="微軟正黑體" w:hAnsi="微軟正黑體" w:hint="eastAsia"/>
+        </w:rPr>
+        <w:t xml:space="preserve">        </w:t>
+      </w:r>
+      <w:r>
+        <w:rPr>
+          <w:rFonts w:ascii="微軟正黑體" w:eastAsia="微軟正黑體" w:hAnsi="微軟正黑體" w:hint="eastAsia"/>
+        </w:rPr>
+        <w:t>原本Reno queue也是設定100，在改變</w:t>
+      </w:r>
+      <w:proofErr w:type="gramStart"/>
+      <w:r>
+        <w:rPr>
+          <w:rFonts w:ascii="微軟正黑體" w:eastAsia="微軟正黑體" w:hAnsi="微軟正黑體" w:hint="eastAsia"/>
+        </w:rPr>
+        <w:t>頻寬後發現</w:t>
+      </w:r>
+      <w:proofErr w:type="gramEnd"/>
+      <w:r>
+        <w:rPr>
+          <w:rFonts w:ascii="微軟正黑體" w:eastAsia="微軟正黑體" w:hAnsi="微軟正黑體" w:hint="eastAsia"/>
+        </w:rPr>
+        <w:t>非常不穩定，所以</w:t>
+      </w:r>
+      <w:r>
+        <w:rPr>
+          <w:rFonts w:ascii="微軟正黑體" w:eastAsia="微軟正黑體" w:hAnsi="微軟正黑體" w:hint="eastAsia"/>
+        </w:rPr>
+        <w:t>上網</w:t>
+      </w:r>
+      <w:r>
+        <w:rPr>
+          <w:rFonts w:ascii="微軟正黑體" w:eastAsia="微軟正黑體" w:hAnsi="微軟正黑體" w:hint="eastAsia"/>
+        </w:rPr>
+        <w:t>找公式來算</w:t>
+      </w:r>
+      <w:r>
+        <w:rPr>
+          <w:rFonts w:ascii="微軟正黑體" w:eastAsia="微軟正黑體" w:hAnsi="微軟正黑體" w:hint="eastAsia"/>
+        </w:rPr>
+        <w:t>：</w:t>
+      </w:r>
+    </w:p>
+    <w:p>
+      <w:pPr>
+        <w:pStyle w:val="aa"/>
+        <w:numPr>
+          <w:ilvl w:val="0"/>
+          <w:numId w:val="3"/>
+        </w:numPr>
+        <w:ind w:left="960"/>
+        <w:rPr>
+          <w:rFonts w:ascii="微軟正黑體" w:eastAsia="微軟正黑體" w:hAnsi="微軟正黑體"/>
+        </w:rPr>
+      </w:pPr>
+      <w:r>
+        <w:rPr>
+          <w:rFonts w:ascii="微軟正黑體" w:eastAsia="微軟正黑體" w:hAnsi="微軟正黑體" w:hint="eastAsia"/>
+        </w:rPr>
+        <w:t>RTT = 2*(1 + 20 + 1) = 44ms</w:t>
+      </w:r>
+    </w:p>
+    <w:p>
+      <w:pPr>
+        <w:pStyle w:val="aa"/>
+        <w:numPr>
+          <w:ilvl w:val="0"/>
+          <w:numId w:val="3"/>
+        </w:numPr>
+        <w:ind w:left="960"/>
+        <w:rPr>
+          <w:rFonts w:ascii="微軟正黑體" w:eastAsia="微軟正黑體" w:hAnsi="微軟正黑體"/>
+        </w:rPr>
+      </w:pPr>
+      <w:r>
+        <w:rPr>
+          <w:rFonts w:ascii="微軟正黑體" w:eastAsia="微軟正黑體" w:hAnsi="微軟正黑體" w:hint="eastAsia"/>
+        </w:rPr>
+        <w:t xml:space="preserve">Bottleneck = 10Mbps = </w:t>
+      </w:r>
+      <w:r>
+        <w:rPr>
+          <w:rFonts w:ascii="微軟正黑體" w:eastAsia="微軟正黑體" w:hAnsi="微軟正黑體"/>
+        </w:rPr>
+        <w:t>10,000,000 bps</w:t>
+      </w:r>
+    </w:p>
+    <w:p>
+      <w:pPr>
+        <w:pStyle w:val="aa"/>
+        <w:numPr>
+          <w:ilvl w:val="0"/>
+          <w:numId w:val="3"/>
+        </w:numPr>
+        <w:ind w:left="960"/>
+        <w:rPr>
+          <w:rFonts w:ascii="微軟正黑體" w:eastAsia="微軟正黑體" w:hAnsi="微軟正黑體"/>
+        </w:rPr>
+      </w:pPr>
+      <w:r>
+        <w:rPr>
+          <w:rFonts w:ascii="微軟正黑體" w:eastAsia="微軟正黑體" w:hAnsi="微軟正黑體"/>
+        </w:rPr>
+        <w:t>BDP (Bits)： 10,000,000 bps * 0.044 s = 440,000 Bits = 55,000 Bytes</w:t>
+      </w:r>
+    </w:p>
+    <w:p>
+      <w:pPr>
+        <w:pStyle w:val="aa"/>
+        <w:numPr>
+          <w:ilvl w:val="0"/>
+          <w:numId w:val="3"/>
+        </w:numPr>
+        <w:ind w:left="960"/>
+        <w:rPr>
+          <w:rFonts w:ascii="微軟正黑體" w:eastAsia="微軟正黑體" w:hAnsi="微軟正黑體"/>
+        </w:rPr>
+      </w:pPr>
+      <w:proofErr w:type="gramStart"/>
+      <w:r>
+        <w:rPr>
+          <w:rFonts w:ascii="微軟正黑體" w:eastAsia="微軟正黑體" w:hAnsi="微軟正黑體"/>
+        </w:rPr>
+        <w:t>封包數</w:t>
+      </w:r>
+      <w:proofErr w:type="gramEnd"/>
+      <w:r>
+        <w:rPr>
+          <w:rFonts w:ascii="微軟正黑體" w:eastAsia="微軟正黑體" w:hAnsi="微軟正黑體"/>
+        </w:rPr>
+        <w:t xml:space="preserve"> (Packets)： 55,000 Bytes / 14</w:t>
+      </w:r>
+      <w:r>
+        <w:rPr>
+          <w:rFonts w:ascii="微軟正黑體" w:eastAsia="微軟正黑體" w:hAnsi="微軟正黑體" w:hint="eastAsia"/>
+        </w:rPr>
+        <w:t>60</w:t>
+      </w:r>
+      <w:r>
+        <w:rPr>
+          <w:rFonts w:ascii="微軟正黑體" w:eastAsia="微軟正黑體" w:hAnsi="微軟正黑體"/>
+        </w:rPr>
+        <w:t xml:space="preserve"> Bytes (MSS) </w:t>
+      </w:r>
+      <w:r>
+        <w:rPr>
+          <w:rFonts w:ascii="Cambria Math" w:eastAsia="微軟正黑體" w:hAnsi="Cambria Math" w:cs="Cambria Math"/>
+        </w:rPr>
+        <w:t>≈</w:t>
+      </w:r>
+      <w:r>
+        <w:rPr>
+          <w:rFonts w:ascii="微軟正黑體" w:eastAsia="微軟正黑體" w:hAnsi="微軟正黑體"/>
+        </w:rPr>
+        <w:t xml:space="preserve"> 38 個封包。</w:t>
+      </w:r>
+    </w:p>
+    <w:p>
+      <w:pPr>
+        <w:rPr>
+          <w:rFonts w:ascii="微軟正黑體" w:eastAsia="微軟正黑體" w:hAnsi="微軟正黑體"/>
+        </w:rPr>
+      </w:pPr>
+    </w:p>
+    <w:p>
+      <w:pPr>
+        <w:rPr>
+          <w:rFonts w:ascii="微軟正黑體" w:eastAsia="微軟正黑體" w:hAnsi="微軟正黑體"/>
+        </w:rPr>
+      </w:pPr>
+      <w:r>
+        <w:rPr>
+          <w:rFonts w:ascii="微軟正黑體" w:eastAsia="微軟正黑體" w:hAnsi="微軟正黑體" w:hint="eastAsia"/>
+        </w:rPr>
+        <w:t xml:space="preserve">    </w:t>
+      </w:r>
+      <w:r>
+        <w:rPr>
+          <w:rFonts w:ascii="微軟正黑體" w:eastAsia="微軟正黑體" w:hAnsi="微軟正黑體" w:hint="eastAsia"/>
+        </w:rPr>
+        <w:t>Segment 大小</w:t>
+      </w:r>
+      <w:r>
+        <w:rPr>
+          <w:rFonts w:ascii="微軟正黑體" w:eastAsia="微軟正黑體" w:hAnsi="微軟正黑體" w:hint="eastAsia"/>
+        </w:rPr>
+        <w:t>按照乙太網路的MTU = 1500減去TCP Header 40 = 1460</w:t>
+      </w:r>
+      <w:r>
+        <w:rPr>
+          <w:rFonts w:ascii="微軟正黑體" w:eastAsia="微軟正黑體" w:hAnsi="微軟正黑體"/>
+        </w:rPr>
+        <w:t xml:space="preserve"> </w:t>
+      </w:r>
+      <w:r>
+        <w:rPr>
+          <w:rFonts w:ascii="微軟正黑體" w:eastAsia="微軟正黑體" w:hAnsi="微軟正黑體"/>
+        </w:rPr>
+        <w:t>bytes</w:t>
+      </w:r>
+      <w:r>
+        <w:rPr>
+          <w:rFonts w:ascii="微軟正黑體" w:eastAsia="微軟正黑體" w:hAnsi="微軟正黑體" w:hint="eastAsia"/>
+        </w:rPr>
+        <w:t>。</w:t>
+      </w:r>
+    </w:p>
+    <w:p>
+      <w:pPr>
+        <w:rPr>
+          <w:rFonts w:ascii="微軟正黑體" w:eastAsia="微軟正黑體" w:hAnsi="微軟正黑體"/>
+        </w:rPr>
+      </w:pPr>
+      <w:r>
+        <w:rPr>
+          <w:rFonts w:ascii="微軟正黑體" w:eastAsia="微軟正黑體" w:hAnsi="微軟正黑體"/>
+        </w:rPr>
+        <w:tab/>
+      </w:r>
+      <w:r>
+        <w:rPr>
+          <w:rFonts w:ascii="微軟正黑體" w:eastAsia="微軟正黑體" w:hAnsi="微軟正黑體" w:hint="eastAsia"/>
+        </w:rPr>
+        <w:t>SACK按照範例啟用使Reno可以利用。</w:t>
+      </w:r>
+    </w:p>
+    <w:p>
+      <w:pPr>
+        <w:rPr>
+          <w:rFonts w:ascii="微軟正黑體" w:eastAsia="微軟正黑體" w:hAnsi="微軟正黑體"/>
+        </w:rPr>
+      </w:pPr>
+      <w:r>
+        <w:rPr>
+          <w:rFonts w:ascii="微軟正黑體" w:eastAsia="微軟正黑體" w:hAnsi="微軟正黑體"/>
+        </w:rPr>
+        <w:tab/>
+      </w:r>
+      <w:r>
+        <w:rPr>
+          <w:rFonts w:ascii="微軟正黑體" w:eastAsia="微軟正黑體" w:hAnsi="微軟正黑體" w:hint="eastAsia"/>
+        </w:rPr>
+        <w:t>CWND</w:t>
+      </w:r>
+      <w:r>
+        <w:rPr>
+          <w:rFonts w:ascii="微軟正黑體" w:eastAsia="微軟正黑體" w:hAnsi="微軟正黑體" w:hint="eastAsia"/>
+        </w:rPr>
+        <w:t>按</w:t>
+      </w:r>
+      <w:r>
+        <w:rPr>
+          <w:rFonts w:ascii="微軟正黑體" w:eastAsia="微軟正黑體" w:hAnsi="微軟正黑體" w:hint="eastAsia"/>
+        </w:rPr>
+        <w:t>照範例設定為10</w:t>
+      </w:r>
+      <w:r>
+        <w:rPr>
+          <w:rFonts w:ascii="微軟正黑體" w:eastAsia="微軟正黑體" w:hAnsi="微軟正黑體" w:hint="eastAsia"/>
+        </w:rPr>
+        <w:t>。</w:t>
+      </w:r>
+    </w:p>
+    <w:p>
+      <w:pPr>
+        <w:pStyle w:val="aa"/>
+        <w:ind w:left="0" w:firstLineChars="200" w:firstLine="480"/>
+        <w:rPr>
+          <w:rFonts w:ascii="微軟正黑體" w:eastAsia="微軟正黑體" w:hAnsi="微軟正黑體"/>
+        </w:rPr>
+      </w:pPr>
+      <w:r>
+        <w:rPr>
+          <w:rFonts w:ascii="微軟正黑體" w:eastAsia="微軟正黑體" w:hAnsi="微軟正黑體" w:hint="eastAsia"/>
+        </w:rPr>
+        <w:t>V</w:t>
+      </w:r>
+      <w:r>
+        <w:rPr>
+          <w:rFonts w:ascii="微軟正黑體" w:eastAsia="微軟正黑體" w:hAnsi="微軟正黑體" w:hint="eastAsia"/>
+        </w:rPr>
+        <w:t>egas預設設定alpha, beta, gamma</w:t>
+      </w:r>
+      <w:r>
+        <w:rPr>
+          <w:rFonts w:ascii="微軟正黑體" w:eastAsia="微軟正黑體" w:hAnsi="微軟正黑體" w:hint="eastAsia"/>
+        </w:rPr>
+        <w:t>(2, 4, 1)</w:t>
+      </w:r>
+      <w:r>
+        <w:rPr>
+          <w:rFonts w:ascii="微軟正黑體" w:eastAsia="微軟正黑體" w:hAnsi="微軟正黑體" w:hint="eastAsia"/>
+        </w:rPr>
+        <w:t>發現吞吐量</w:t>
+      </w:r>
+      <w:r>
+        <w:rPr>
+          <w:rFonts w:ascii="微軟正黑體" w:eastAsia="微軟正黑體" w:hAnsi="微軟正黑體" w:hint="eastAsia"/>
+        </w:rPr>
+        <w:t>離10Mbps的理</w:t>
+      </w:r>
+      <w:r>
+        <w:rPr>
+          <w:rFonts w:ascii="微軟正黑體" w:eastAsia="微軟正黑體" w:hAnsi="微軟正黑體" w:hint="eastAsia"/>
+        </w:rPr>
+        <w:lastRenderedPageBreak/>
+        <w:t>論值有段距離</w:t>
+      </w:r>
+      <w:r>
+        <w:rPr>
+          <w:rFonts w:ascii="微軟正黑體" w:eastAsia="微軟正黑體" w:hAnsi="微軟正黑體" w:hint="eastAsia"/>
+        </w:rPr>
+        <w:t>，所以用2~5倍來測試，</w:t>
+      </w:r>
+      <w:r>
+        <w:rPr>
+          <w:rFonts w:ascii="微軟正黑體" w:eastAsia="微軟正黑體" w:hAnsi="微軟正黑體" w:hint="eastAsia"/>
+        </w:rPr>
+        <w:t>4</w:t>
+      </w:r>
+      <w:r>
+        <w:rPr>
+          <w:rFonts w:ascii="微軟正黑體" w:eastAsia="微軟正黑體" w:hAnsi="微軟正黑體" w:hint="eastAsia"/>
+        </w:rPr>
+        <w:t>倍幾乎沒有繼續成長，5倍反而造成延遲(</w:t>
+      </w:r>
+      <w:r>
+        <w:rPr>
+          <w:rFonts w:ascii="微軟正黑體" w:eastAsia="微軟正黑體" w:hAnsi="微軟正黑體"/>
+        </w:rPr>
+        <w:t>q</w:t>
+      </w:r>
+      <w:r>
+        <w:rPr>
+          <w:rFonts w:ascii="微軟正黑體" w:eastAsia="微軟正黑體" w:hAnsi="微軟正黑體" w:hint="eastAsia"/>
+        </w:rPr>
+        <w:t>ueue size 變動)，所以設定為</w:t>
+      </w:r>
+      <w:r>
+        <w:rPr>
+          <w:rFonts w:ascii="微軟正黑體" w:eastAsia="微軟正黑體" w:hAnsi="微軟正黑體"/>
+        </w:rPr>
+        <w:t>(</w:t>
+      </w:r>
+      <w:r>
+        <w:rPr>
+          <w:rFonts w:ascii="微軟正黑體" w:eastAsia="微軟正黑體" w:hAnsi="微軟正黑體" w:hint="eastAsia"/>
+        </w:rPr>
+        <w:t>8, 16, 4)。</w:t>
+      </w:r>
+    </w:p>
+    <w:p>
+      <w:pPr>
+        <w:pStyle w:val="aa"/>
+        <w:ind w:left="0" w:firstLineChars="200" w:firstLine="480"/>
+        <w:rPr>
+          <w:rFonts w:ascii="微軟正黑體" w:eastAsia="微軟正黑體" w:hAnsi="微軟正黑體" w:hint="eastAsia"/>
+        </w:rPr>
+      </w:pPr>
+      <w:r>
+        <w:rPr>
+          <w:rFonts w:ascii="微軟正黑體" w:eastAsia="微軟正黑體" w:hAnsi="微軟正黑體" w:hint="eastAsia"/>
+        </w:rPr>
+        <w:t>為了改變throughput跟queue，分別加入UDP封包干擾，</w:t>
+      </w:r>
+      <w:r>
+        <w:rPr>
+          <w:rFonts w:ascii="微軟正黑體" w:eastAsia="微軟正黑體" w:hAnsi="微軟正黑體"/>
+        </w:rPr>
+        <w:t>L</w:t>
+      </w:r>
+      <w:r>
+        <w:rPr>
+          <w:rFonts w:ascii="微軟正黑體" w:eastAsia="微軟正黑體" w:hAnsi="微軟正黑體" w:hint="eastAsia"/>
+        </w:rPr>
+        <w:t>eaf頻寬&gt;Router頻寬</w:t>
+      </w:r>
+      <w:r>
+        <w:rPr>
+          <w:rFonts w:ascii="微軟正黑體" w:eastAsia="微軟正黑體" w:hAnsi="微軟正黑體" w:hint="eastAsia"/>
+        </w:rPr>
+        <w:t>，並從第15秒開始產生用來觀測遇到壅塞的狀態跟平常的狀態差異。</w:t>
+      </w:r>
+    </w:p>
+    <w:p>
+      <w:pPr>
+        <w:pStyle w:val="a6"/>
+        <w:rPr>
+          <w:rFonts w:ascii="微軟正黑體" w:eastAsia="微軟正黑體" w:hAnsi="微軟正黑體"/>
+        </w:rPr>
+      </w:pPr>
+      <w:r>
+        <w:rPr>
+          <w:rFonts w:ascii="微軟正黑體" w:eastAsia="微軟正黑體" w:hAnsi="微軟正黑體" w:hint="eastAsia"/>
         </w:rPr>
         <w:t>拓樸圖</w:t>
       </w:r>
     </w:p>
     <w:p>
-      <w:r>
-        <w:rPr>
-          <w:rFonts w:hint="eastAsia"/>
+      <w:pPr>
+        <w:rPr>
+          <w:rFonts w:ascii="微軟正黑體" w:eastAsia="微軟正黑體" w:hAnsi="微軟正黑體"/>
+        </w:rPr>
+      </w:pPr>
+      <w:r>
+        <w:rPr>
+          <w:rFonts w:ascii="微軟正黑體" w:eastAsia="微軟正黑體" w:hAnsi="微軟正黑體" w:hint="eastAsia"/>
           <w:noProof/>
         </w:rPr>
         <w:drawing>
@@ -1957,7 +3124,7 @@
                     <pic:cNvPicPr/>
                   </pic:nvPicPr>
                   <pic:blipFill>
-                    <a:blip r:embed="rId11">
+                    <a:blip r:embed="rId12">
                       <a:extLst>
                         <a:ext uri="{28A0092B-C50C-407E-A947-70E740481C1C}">
                           <a14:useLocalDpi xmlns:a14="http://schemas.microsoft.com/office/drawing/2010/main" val="0"/>
@@ -1988,13 +3155,14 @@
       <w:pPr>
         <w:jc w:val="center"/>
         <w:rPr>
+          <w:rFonts w:ascii="微軟正黑體" w:eastAsia="微軟正黑體" w:hAnsi="微軟正黑體"/>
           <w:b/>
           <w:bCs/>
         </w:rPr>
       </w:pPr>
       <w:r>
         <w:rPr>
-          <w:rFonts w:hint="eastAsia"/>
+          <w:rFonts w:ascii="微軟正黑體" w:eastAsia="微軟正黑體" w:hAnsi="微軟正黑體" w:hint="eastAsia"/>
           <w:b/>
           <w:bCs/>
         </w:rPr>
@@ -2002,7 +3170,7 @@
       </w:r>
       <w:r>
         <w:rPr>
-          <w:rFonts w:hint="eastAsia"/>
+          <w:rFonts w:ascii="微軟正黑體" w:eastAsia="微軟正黑體" w:hAnsi="微軟正黑體" w:hint="eastAsia"/>
           <w:b/>
           <w:bCs/>
         </w:rPr>
@@ -2010,7 +3178,7 @@
       </w:r>
       <w:r>
         <w:rPr>
-          <w:rFonts w:hint="eastAsia"/>
+          <w:rFonts w:ascii="微軟正黑體" w:eastAsia="微軟正黑體" w:hAnsi="微軟正黑體" w:hint="eastAsia"/>
           <w:b/>
           <w:bCs/>
         </w:rPr>
@@ -2018,7 +3186,7 @@
       </w:r>
       <w:r>
         <w:rPr>
-          <w:rFonts w:hint="eastAsia"/>
+          <w:rFonts w:ascii="微軟正黑體" w:eastAsia="微軟正黑體" w:hAnsi="微軟正黑體" w:hint="eastAsia"/>
           <w:b/>
           <w:bCs/>
         </w:rPr>
@@ -2029,165 +3197,105 @@
       <w:pPr>
         <w:jc w:val="center"/>
         <w:rPr>
-          <w:rFonts w:hint="eastAsia"/>
-        </w:rPr>
-      </w:pPr>
-    </w:p>
-    <w:p>
-      <w:pPr>
-        <w:rPr>
-          <w:rFonts w:hint="eastAsia"/>
-        </w:rPr>
-      </w:pPr>
-      <w:r>
-        <w:rPr>
-          <w:rFonts w:hint="eastAsia"/>
-        </w:rPr>
-        <w:t xml:space="preserve">    </w:t>
-      </w:r>
-      <w:r>
-        <w:rPr>
-          <w:rFonts w:hint="eastAsia"/>
-        </w:rPr>
-        <w:t>由圖一、網路拓樸圖可以知道，我們有兩個</w:t>
-      </w:r>
-      <w:r>
+          <w:rFonts w:ascii="微軟正黑體" w:eastAsia="微軟正黑體" w:hAnsi="微軟正黑體" w:hint="eastAsia"/>
+        </w:rPr>
+      </w:pPr>
+    </w:p>
+    <w:p>
+      <w:pPr>
+        <w:rPr>
+          <w:rFonts w:ascii="微軟正黑體" w:eastAsia="微軟正黑體" w:hAnsi="微軟正黑體" w:hint="eastAsia"/>
+        </w:rPr>
+      </w:pPr>
+      <w:r>
+        <w:rPr>
+          <w:rFonts w:ascii="微軟正黑體" w:eastAsia="微軟正黑體" w:hAnsi="微軟正黑體" w:hint="eastAsia"/>
+        </w:rPr>
+        <w:t xml:space="preserve">    由圖一、網路拓樸圖可以知道，我們有兩個</w:t>
+      </w:r>
+      <w:r>
+        <w:rPr>
+          <w:rFonts w:ascii="微軟正黑體" w:eastAsia="微軟正黑體" w:hAnsi="微軟正黑體"/>
+        </w:rPr>
         <w:t>R</w:t>
       </w:r>
       <w:r>
         <w:rPr>
-          <w:rFonts w:hint="eastAsia"/>
-        </w:rPr>
-        <w:t>outer</w:t>
-      </w:r>
-      <w:r>
-        <w:rPr>
-          <w:rFonts w:hint="eastAsia"/>
-        </w:rPr>
-        <w:t>作為骨幹網路以及一個</w:t>
+          <w:rFonts w:ascii="微軟正黑體" w:eastAsia="微軟正黑體" w:hAnsi="微軟正黑體" w:hint="eastAsia"/>
+        </w:rPr>
+        <w:t>outer作為骨幹網路以及一個</w:t>
       </w:r>
       <w:proofErr w:type="gramStart"/>
       <w:r>
         <w:rPr>
-          <w:rFonts w:hint="eastAsia"/>
+          <w:rFonts w:ascii="微軟正黑體" w:eastAsia="微軟正黑體" w:hAnsi="微軟正黑體" w:hint="eastAsia"/>
         </w:rPr>
         <w:t>傳送端跟一個</w:t>
       </w:r>
       <w:proofErr w:type="gramEnd"/>
       <w:r>
         <w:rPr>
-          <w:rFonts w:hint="eastAsia"/>
-        </w:rPr>
-        <w:t>接收端，參考範例的設計，而效能瓶頸點在於</w:t>
-      </w:r>
-      <w:r>
-        <w:rPr>
-          <w:rFonts w:hint="eastAsia"/>
-        </w:rPr>
-        <w:t>Router 1</w:t>
-      </w:r>
-      <w:r>
-        <w:rPr>
-          <w:rFonts w:hint="eastAsia"/>
-        </w:rPr>
-        <w:t>到</w:t>
-      </w:r>
-      <w:r>
-        <w:rPr>
-          <w:rFonts w:hint="eastAsia"/>
-        </w:rPr>
-        <w:t>Router 2</w:t>
+          <w:rFonts w:ascii="微軟正黑體" w:eastAsia="微軟正黑體" w:hAnsi="微軟正黑體" w:hint="eastAsia"/>
+        </w:rPr>
+        <w:t>接收端，參考範例的設計，而效能瓶頸點在於Router 1到Router 2</w:t>
       </w:r>
       <w:proofErr w:type="gramStart"/>
       <w:r>
         <w:rPr>
-          <w:rFonts w:hint="eastAsia"/>
+          <w:rFonts w:ascii="微軟正黑體" w:eastAsia="微軟正黑體" w:hAnsi="微軟正黑體" w:hint="eastAsia"/>
         </w:rPr>
         <w:t>之間，</w:t>
       </w:r>
       <w:proofErr w:type="gramEnd"/>
       <w:r>
         <w:rPr>
-          <w:rFonts w:hint="eastAsia"/>
+          <w:rFonts w:ascii="微軟正黑體" w:eastAsia="微軟正黑體" w:hAnsi="微軟正黑體" w:hint="eastAsia"/>
         </w:rPr>
         <w:t>由於傳送端以</w:t>
       </w:r>
       <w:r>
+        <w:rPr>
+          <w:rFonts w:ascii="微軟正黑體" w:eastAsia="微軟正黑體" w:hAnsi="微軟正黑體"/>
+        </w:rPr>
         <w:t>1</w:t>
       </w:r>
       <w:r>
         <w:rPr>
-          <w:rFonts w:hint="eastAsia"/>
+          <w:rFonts w:ascii="微軟正黑體" w:eastAsia="微軟正黑體" w:hAnsi="微軟正黑體" w:hint="eastAsia"/>
         </w:rPr>
         <w:t>5Mbps, 1ms delay</w:t>
       </w:r>
       <w:proofErr w:type="gramStart"/>
       <w:r>
         <w:rPr>
-          <w:rFonts w:hint="eastAsia"/>
+          <w:rFonts w:ascii="微軟正黑體" w:eastAsia="微軟正黑體" w:hAnsi="微軟正黑體" w:hint="eastAsia"/>
         </w:rPr>
         <w:t>得頻寬送</w:t>
       </w:r>
       <w:proofErr w:type="gramEnd"/>
       <w:r>
         <w:rPr>
-          <w:rFonts w:hint="eastAsia"/>
-        </w:rPr>
-        <w:t>資料而</w:t>
-      </w:r>
-      <w:r>
-        <w:rPr>
-          <w:rFonts w:hint="eastAsia"/>
-        </w:rPr>
-        <w:t>Backbone</w:t>
-      </w:r>
-      <w:r>
-        <w:rPr>
-          <w:rFonts w:hint="eastAsia"/>
-        </w:rPr>
-        <w:t>網路中只有</w:t>
-      </w:r>
-      <w:r>
-        <w:rPr>
-          <w:rFonts w:hint="eastAsia"/>
-        </w:rPr>
-        <w:t>10Mbps, 20ms delay</w:t>
-      </w:r>
-      <w:r>
-        <w:rPr>
-          <w:rFonts w:hint="eastAsia"/>
-        </w:rPr>
-        <w:t>的狀況所以用最大頻寬的</w:t>
+          <w:rFonts w:ascii="微軟正黑體" w:eastAsia="微軟正黑體" w:hAnsi="微軟正黑體" w:hint="eastAsia"/>
+        </w:rPr>
+        <w:t>資料而Backbone網路中只有10Mbps, 20ms delay的狀況所以用最大頻寬的</w:t>
       </w:r>
       <w:proofErr w:type="spellStart"/>
       <w:r>
         <w:rPr>
-          <w:rFonts w:hint="eastAsia"/>
+          <w:rFonts w:ascii="微軟正黑體" w:eastAsia="微軟正黑體" w:hAnsi="微軟正黑體" w:hint="eastAsia"/>
         </w:rPr>
         <w:t>cwnd</w:t>
       </w:r>
       <w:proofErr w:type="spellEnd"/>
       <w:r>
         <w:rPr>
-          <w:rFonts w:hint="eastAsia"/>
-        </w:rPr>
-        <w:t>值的方式傳送的話勢必會造成</w:t>
-      </w:r>
-      <w:r>
-        <w:rPr>
-          <w:rFonts w:hint="eastAsia"/>
-        </w:rPr>
-        <w:t>queue</w:t>
-      </w:r>
-      <w:r>
-        <w:rPr>
-          <w:rFonts w:hint="eastAsia"/>
-        </w:rPr>
-        <w:t>的改變</w:t>
-      </w:r>
-      <w:r>
-        <w:rPr>
-          <w:rFonts w:hint="eastAsia"/>
+          <w:rFonts w:ascii="微軟正黑體" w:eastAsia="微軟正黑體" w:hAnsi="微軟正黑體" w:hint="eastAsia"/>
+        </w:rPr>
+        <w:t>值的方式傳送的話勢必會造成queue的改變</w:t>
+      </w:r>
+      <w:r>
+        <w:rPr>
+          <w:rFonts w:ascii="微軟正黑體" w:eastAsia="微軟正黑體" w:hAnsi="微軟正黑體" w:hint="eastAsia"/>
         </w:rPr>
         <w:t>與壅塞。</w:t>
       </w:r>
@@ -2195,79 +3303,48 @@
     <w:p>
       <w:pPr>
         <w:pStyle w:val="1"/>
-      </w:pPr>
-      <w:bookmarkStart w:id="2" w:name="_Toc232944191"/>
-      <w:r>
-        <w:rPr>
-          <w:rFonts w:hint="eastAsia"/>
-        </w:rPr>
-        <w:t>效能圖：</w:t>
+        <w:rPr>
+          <w:rFonts w:ascii="微軟正黑體" w:eastAsia="微軟正黑體" w:hAnsi="微軟正黑體"/>
+        </w:rPr>
+      </w:pPr>
+      <w:bookmarkStart w:id="2" w:name="_Toc232947566"/>
+      <w:r>
+        <w:rPr>
+          <w:rFonts w:ascii="微軟正黑體" w:eastAsia="微軟正黑體" w:hAnsi="微軟正黑體" w:hint="eastAsia"/>
+        </w:rPr>
+        <w:lastRenderedPageBreak/>
+        <w:t>效能圖</w:t>
+      </w:r>
+      <w:r>
+        <w:rPr>
+          <w:rFonts w:ascii="微軟正黑體" w:eastAsia="微軟正黑體" w:hAnsi="微軟正黑體" w:hint="eastAsia"/>
+        </w:rPr>
+        <w:t>與說明</w:t>
+      </w:r>
+      <w:r>
+        <w:rPr>
+          <w:rFonts w:ascii="微軟正黑體" w:eastAsia="微軟正黑體" w:hAnsi="微軟正黑體" w:hint="eastAsia"/>
+        </w:rPr>
+        <w:t>：</w:t>
       </w:r>
       <w:bookmarkEnd w:id="2"/>
     </w:p>
     <w:p>
-      <w:r>
-        <w:rPr>
-          <w:rFonts w:hint="eastAsia"/>
-        </w:rPr>
-        <w:t xml:space="preserve">window size </w:t>
-      </w:r>
-      <w:r>
-        <w:rPr>
-          <w:rFonts w:hint="eastAsia"/>
-        </w:rPr>
-        <w:t>變化、</w:t>
-      </w:r>
-      <w:r>
-        <w:rPr>
-          <w:rFonts w:hint="eastAsia"/>
-        </w:rPr>
-        <w:t xml:space="preserve">throughput </w:t>
-      </w:r>
-      <w:r>
-        <w:rPr>
-          <w:rFonts w:hint="eastAsia"/>
-        </w:rPr>
-        <w:t>變化、</w:t>
-      </w:r>
-      <w:r>
-        <w:rPr>
-          <w:rFonts w:hint="eastAsia"/>
-        </w:rPr>
-        <w:t xml:space="preserve">bottleneck </w:t>
-      </w:r>
-      <w:r>
-        <w:rPr>
-          <w:rFonts w:hint="eastAsia"/>
-        </w:rPr>
-        <w:t>的</w:t>
-      </w:r>
-      <w:r>
-        <w:rPr>
-          <w:rFonts w:hint="eastAsia"/>
-        </w:rPr>
-        <w:t xml:space="preserve"> queue length </w:t>
-      </w:r>
-      <w:r>
-        <w:rPr>
-          <w:rFonts w:hint="eastAsia"/>
-        </w:rPr>
-        <w:t>變化。</w:t>
-      </w:r>
-    </w:p>
-    <w:p>
       <w:pPr>
         <w:jc w:val="center"/>
         <w:rPr>
-          <w:rFonts w:hint="eastAsia"/>
-        </w:rPr>
-      </w:pPr>
-      <w:r>
-        <w:rPr>
+          <w:rFonts w:ascii="微軟正黑體" w:eastAsia="微軟正黑體" w:hAnsi="微軟正黑體"/>
+          <w:b/>
+          <w:bCs/>
+        </w:rPr>
+      </w:pPr>
+      <w:r>
+        <w:rPr>
+          <w:rFonts w:ascii="微軟正黑體" w:eastAsia="微軟正黑體" w:hAnsi="微軟正黑體"/>
           <w:noProof/>
         </w:rPr>
         <w:drawing>
-          <wp:inline distT="0" distB="0" distL="0" distR="0" wp14:anchorId="4BE5353E" wp14:editId="2FED9B34">
+          <wp:inline distT="0" distB="0" distL="0" distR="0" wp14:anchorId="4BE5353E" wp14:editId="4A81FA27">
             <wp:extent cx="5274310" cy="3515995"/>
             <wp:effectExtent l="0" t="0" r="2540" b="8255"/>
             <wp:docPr id="1724775441" name="圖片 4"/>
@@ -2282,7 +3359,7 @@
                     <pic:cNvPicPr/>
                   </pic:nvPicPr>
                   <pic:blipFill>
-                    <a:blip r:embed="rId12" cstate="print">
+                    <a:blip r:embed="rId13" cstate="print">
                       <a:extLst>
                         <a:ext uri="{28A0092B-C50C-407E-A947-70E740481C1C}">
                           <a14:useLocalDpi xmlns:a14="http://schemas.microsoft.com/office/drawing/2010/main" val="0"/>
@@ -2310,7 +3387,7 @@
       </w:r>
       <w:r>
         <w:rPr>
-          <w:rFonts w:hint="eastAsia"/>
+          <w:rFonts w:ascii="微軟正黑體" w:eastAsia="微軟正黑體" w:hAnsi="微軟正黑體" w:hint="eastAsia"/>
           <w:b/>
           <w:bCs/>
         </w:rPr>
@@ -2318,7 +3395,7 @@
       </w:r>
       <w:r>
         <w:rPr>
-          <w:rFonts w:hint="eastAsia"/>
+          <w:rFonts w:ascii="微軟正黑體" w:eastAsia="微軟正黑體" w:hAnsi="微軟正黑體" w:hint="eastAsia"/>
           <w:b/>
           <w:bCs/>
         </w:rPr>
@@ -2326,38 +3403,27 @@
       </w:r>
       <w:r>
         <w:rPr>
-          <w:rFonts w:hint="eastAsia"/>
+          <w:rFonts w:ascii="微軟正黑體" w:eastAsia="微軟正黑體" w:hAnsi="微軟正黑體" w:hint="eastAsia"/>
           <w:b/>
           <w:bCs/>
         </w:rPr>
-        <w:t>、</w:t>
-      </w:r>
-      <w:r>
-        <w:rPr>
-          <w:rFonts w:hint="eastAsia"/>
-          <w:b/>
-          <w:bCs/>
-        </w:rPr>
-        <w:t>Reno, Vegas</w:t>
-      </w:r>
-      <w:r>
-        <w:rPr>
-          <w:rFonts w:hint="eastAsia"/>
-          <w:b/>
-          <w:bCs/>
-        </w:rPr>
-        <w:t>分開觀察</w:t>
-      </w:r>
-    </w:p>
-    <w:p>
-      <w:r>
-        <w:rPr>
-          <w:rFonts w:hint="eastAsia"/>
+        <w:t>、Reno, Vegas分開觀察</w:t>
+      </w:r>
+    </w:p>
+    <w:p>
+      <w:pPr>
+        <w:rPr>
+          <w:rFonts w:ascii="微軟正黑體" w:eastAsia="微軟正黑體" w:hAnsi="微軟正黑體"/>
+        </w:rPr>
+      </w:pPr>
+      <w:r>
+        <w:rPr>
+          <w:rFonts w:ascii="微軟正黑體" w:eastAsia="微軟正黑體" w:hAnsi="微軟正黑體" w:hint="eastAsia"/>
           <w:noProof/>
         </w:rPr>
         <w:lastRenderedPageBreak/>
         <w:drawing>
-          <wp:inline distT="0" distB="0" distL="0" distR="0" wp14:anchorId="70FAA2E5" wp14:editId="15F9EC5E">
+          <wp:inline distT="0" distB="0" distL="0" distR="0" wp14:anchorId="70FAA2E5" wp14:editId="3164C39A">
             <wp:extent cx="5274310" cy="6329045"/>
             <wp:effectExtent l="0" t="0" r="2540" b="0"/>
             <wp:docPr id="93203778" name="圖片 3"/>
@@ -2372,7 +3438,7 @@
                     <pic:cNvPicPr/>
                   </pic:nvPicPr>
                   <pic:blipFill>
-                    <a:blip r:embed="rId13" cstate="print">
+                    <a:blip r:embed="rId14" cstate="print">
                       <a:extLst>
                         <a:ext uri="{28A0092B-C50C-407E-A947-70E740481C1C}">
                           <a14:useLocalDpi xmlns:a14="http://schemas.microsoft.com/office/drawing/2010/main" val="0"/>
@@ -2403,44 +3469,38 @@
       <w:pPr>
         <w:jc w:val="center"/>
         <w:rPr>
-          <w:rFonts w:hint="eastAsia"/>
-        </w:rPr>
-      </w:pPr>
-      <w:r>
-        <w:rPr>
-          <w:rFonts w:hint="eastAsia"/>
+          <w:rFonts w:ascii="微軟正黑體" w:eastAsia="微軟正黑體" w:hAnsi="微軟正黑體"/>
           <w:b/>
           <w:bCs/>
         </w:rPr>
-        <w:t>圖</w:t>
-      </w:r>
-      <w:r>
-        <w:rPr>
-          <w:rFonts w:hint="eastAsia"/>
+      </w:pPr>
+      <w:r>
+        <w:rPr>
+          <w:rFonts w:ascii="微軟正黑體" w:eastAsia="微軟正黑體" w:hAnsi="微軟正黑體" w:hint="eastAsia"/>
           <w:b/>
           <w:bCs/>
         </w:rPr>
-        <w:t>三</w:t>
-      </w:r>
-      <w:r>
-        <w:rPr>
-          <w:rFonts w:hint="eastAsia"/>
+        <w:t>圖</w:t>
+      </w:r>
+      <w:r>
+        <w:rPr>
+          <w:rFonts w:ascii="微軟正黑體" w:eastAsia="微軟正黑體" w:hAnsi="微軟正黑體" w:hint="eastAsia"/>
           <w:b/>
           <w:bCs/>
         </w:rPr>
-        <w:t>、</w:t>
-      </w:r>
-      <w:r>
-        <w:rPr>
-          <w:rFonts w:hint="eastAsia"/>
+        <w:t>三</w:t>
+      </w:r>
+      <w:r>
+        <w:rPr>
+          <w:rFonts w:ascii="微軟正黑體" w:eastAsia="微軟正黑體" w:hAnsi="微軟正黑體" w:hint="eastAsia"/>
           <w:b/>
           <w:bCs/>
         </w:rPr>
-        <w:t>Reno, Vegas</w:t>
-      </w:r>
-      <w:r>
-        <w:rPr>
-          <w:rFonts w:hint="eastAsia"/>
+        <w:t>、Reno, Vegas</w:t>
+      </w:r>
+      <w:r>
+        <w:rPr>
+          <w:rFonts w:ascii="微軟正黑體" w:eastAsia="微軟正黑體" w:hAnsi="微軟正黑體" w:hint="eastAsia"/>
           <w:b/>
           <w:bCs/>
         </w:rPr>
@@ -2448,7 +3508,7 @@
       </w:r>
       <w:r>
         <w:rPr>
-          <w:rFonts w:hint="eastAsia"/>
+          <w:rFonts w:ascii="微軟正黑體" w:eastAsia="微軟正黑體" w:hAnsi="微軟正黑體" w:hint="eastAsia"/>
           <w:b/>
           <w:bCs/>
         </w:rPr>
@@ -2457,406 +3517,540 @@
     </w:p>
     <w:p>
       <w:pPr>
+        <w:rPr>
+          <w:rFonts w:ascii="微軟正黑體" w:eastAsia="微軟正黑體" w:hAnsi="微軟正黑體" w:hint="eastAsia"/>
+        </w:rPr>
+      </w:pPr>
+      <w:r>
+        <w:rPr>
+          <w:rFonts w:ascii="微軟正黑體" w:eastAsia="微軟正黑體" w:hAnsi="微軟正黑體" w:hint="eastAsia"/>
+          <w:b/>
+          <w:bCs/>
+        </w:rPr>
+        <w:t xml:space="preserve">   </w:t>
+      </w:r>
+      <w:r>
+        <w:rPr>
+          <w:rFonts w:ascii="微軟正黑體" w:eastAsia="微軟正黑體" w:hAnsi="微軟正黑體" w:hint="eastAsia"/>
+        </w:rPr>
+        <w:t xml:space="preserve"> 畫圖的Python程式碼由Gemini Pro慷慨贊助</w:t>
+      </w:r>
+      <w:r>
+        <w:rPr>
+          <w:rFonts w:ascii="微軟正黑體" w:eastAsia="微軟正黑體" w:hAnsi="微軟正黑體" w:hint="eastAsia"/>
+        </w:rPr>
+        <w:t>，由於</w:t>
+      </w:r>
+      <w:r>
+        <w:rPr>
+          <w:rFonts w:ascii="微軟正黑體" w:eastAsia="微軟正黑體" w:hAnsi="微軟正黑體"/>
+        </w:rPr>
+        <w:t>V</w:t>
+      </w:r>
+      <w:r>
+        <w:rPr>
+          <w:rFonts w:ascii="微軟正黑體" w:eastAsia="微軟正黑體" w:hAnsi="微軟正黑體" w:hint="eastAsia"/>
+        </w:rPr>
+        <w:t>egas queue沒有變動所以事件</w:t>
+      </w:r>
+      <w:proofErr w:type="gramStart"/>
+      <w:r>
+        <w:rPr>
+          <w:rFonts w:ascii="微軟正黑體" w:eastAsia="微軟正黑體" w:hAnsi="微軟正黑體" w:hint="eastAsia"/>
+        </w:rPr>
+        <w:t>捕抓為空</w:t>
+      </w:r>
+      <w:proofErr w:type="gramEnd"/>
+      <w:r>
+        <w:rPr>
+          <w:rFonts w:ascii="微軟正黑體" w:eastAsia="微軟正黑體" w:hAnsi="微軟正黑體" w:hint="eastAsia"/>
+        </w:rPr>
+        <w:t>，</w:t>
+      </w:r>
+      <w:proofErr w:type="gramStart"/>
+      <w:r>
+        <w:rPr>
+          <w:rFonts w:ascii="微軟正黑體" w:eastAsia="微軟正黑體" w:hAnsi="微軟正黑體" w:hint="eastAsia"/>
+        </w:rPr>
+        <w:t>所以用捕</w:t>
+      </w:r>
+      <w:proofErr w:type="gramEnd"/>
+      <w:r>
+        <w:rPr>
+          <w:rFonts w:ascii="微軟正黑體" w:eastAsia="微軟正黑體" w:hAnsi="微軟正黑體" w:hint="eastAsia"/>
+        </w:rPr>
+        <w:t>0的方式繪製</w:t>
+      </w:r>
+      <w:r>
+        <w:rPr>
+          <w:rFonts w:ascii="微軟正黑體" w:eastAsia="微軟正黑體" w:hAnsi="微軟正黑體" w:hint="eastAsia"/>
+        </w:rPr>
+        <w:t>，</w:t>
+      </w:r>
+      <w:proofErr w:type="spellStart"/>
+      <w:r>
+        <w:rPr>
+          <w:rFonts w:ascii="微軟正黑體" w:eastAsia="微軟正黑體" w:hAnsi="微軟正黑體"/>
+        </w:rPr>
+        <w:t>c</w:t>
+      </w:r>
+      <w:r>
+        <w:rPr>
+          <w:rFonts w:ascii="微軟正黑體" w:eastAsia="微軟正黑體" w:hAnsi="微軟正黑體" w:hint="eastAsia"/>
+        </w:rPr>
+        <w:t>wnd</w:t>
+      </w:r>
+      <w:proofErr w:type="spellEnd"/>
+      <w:r>
+        <w:rPr>
+          <w:rFonts w:ascii="微軟正黑體" w:eastAsia="微軟正黑體" w:hAnsi="微軟正黑體" w:hint="eastAsia"/>
+        </w:rPr>
+        <w:t>值在前15秒穩定時也是用補充的方式來補足缺失。</w:t>
+      </w:r>
+    </w:p>
+    <w:p>
+      <w:pPr>
+        <w:rPr>
+          <w:rFonts w:ascii="微軟正黑體" w:eastAsia="微軟正黑體" w:hAnsi="微軟正黑體"/>
+        </w:rPr>
+      </w:pPr>
+      <w:r>
+        <w:rPr>
+          <w:rFonts w:ascii="微軟正黑體" w:eastAsia="微軟正黑體" w:hAnsi="微軟正黑體" w:hint="eastAsia"/>
+        </w:rPr>
+        <w:lastRenderedPageBreak/>
+        <w:t xml:space="preserve">    </w:t>
+      </w:r>
+      <w:r>
+        <w:rPr>
+          <w:rFonts w:ascii="微軟正黑體" w:eastAsia="微軟正黑體" w:hAnsi="微軟正黑體" w:hint="eastAsia"/>
+        </w:rPr>
+        <w:t>依據圖二、圖三可以知道，Vegas在Alpha, Beta, Gamma設定為8, 16, 4</w:t>
+      </w:r>
+      <w:proofErr w:type="gramStart"/>
+      <w:r>
+        <w:rPr>
+          <w:rFonts w:ascii="微軟正黑體" w:eastAsia="微軟正黑體" w:hAnsi="微軟正黑體" w:hint="eastAsia"/>
+        </w:rPr>
+        <w:t>十</w:t>
+      </w:r>
+      <w:proofErr w:type="gramEnd"/>
+      <w:r>
+        <w:rPr>
+          <w:rFonts w:ascii="微軟正黑體" w:eastAsia="微軟正黑體" w:hAnsi="微軟正黑體" w:hint="eastAsia"/>
+        </w:rPr>
+        <w:t>於環境中吞吐量幾乎與具有SACK的Linux Reno一樣好，且其探索平穩到理論最高值就停止成長穩定於10Mbps左右</w:t>
+      </w:r>
+      <w:r>
+        <w:rPr>
+          <w:rFonts w:ascii="微軟正黑體" w:eastAsia="微軟正黑體" w:hAnsi="微軟正黑體" w:hint="eastAsia"/>
+        </w:rPr>
+        <w:t>，而</w:t>
+      </w:r>
+      <w:r>
+        <w:rPr>
+          <w:rFonts w:ascii="微軟正黑體" w:eastAsia="微軟正黑體" w:hAnsi="微軟正黑體"/>
+        </w:rPr>
+        <w:t>R</w:t>
+      </w:r>
+      <w:r>
+        <w:rPr>
+          <w:rFonts w:ascii="微軟正黑體" w:eastAsia="微軟正黑體" w:hAnsi="微軟正黑體" w:hint="eastAsia"/>
+        </w:rPr>
+        <w:t>eno則</w:t>
+      </w:r>
+      <w:proofErr w:type="gramStart"/>
+      <w:r>
+        <w:rPr>
+          <w:rFonts w:ascii="微軟正黑體" w:eastAsia="微軟正黑體" w:hAnsi="微軟正黑體" w:hint="eastAsia"/>
+        </w:rPr>
+        <w:t>使緩啟動衝</w:t>
+      </w:r>
+      <w:proofErr w:type="gramEnd"/>
+      <w:r>
+        <w:rPr>
+          <w:rFonts w:ascii="微軟正黑體" w:eastAsia="微軟正黑體" w:hAnsi="微軟正黑體" w:hint="eastAsia"/>
+        </w:rPr>
+        <w:t>過頭遇到Time-out</w:t>
+      </w:r>
+      <w:proofErr w:type="gramStart"/>
+      <w:r>
+        <w:rPr>
+          <w:rFonts w:ascii="微軟正黑體" w:eastAsia="微軟正黑體" w:hAnsi="微軟正黑體" w:hint="eastAsia"/>
+        </w:rPr>
+        <w:t>而歸並更改</w:t>
+      </w:r>
+      <w:proofErr w:type="gramEnd"/>
+      <w:r>
+        <w:rPr>
+          <w:rFonts w:ascii="微軟正黑體" w:eastAsia="微軟正黑體" w:hAnsi="微軟正黑體" w:hint="eastAsia"/>
+        </w:rPr>
+        <w:t>slow start threshold成一半才達到平衡且有時會有波動。</w:t>
+      </w:r>
+    </w:p>
+    <w:p>
+      <w:pPr>
+        <w:rPr>
+          <w:rFonts w:ascii="微軟正黑體" w:eastAsia="微軟正黑體" w:hAnsi="微軟正黑體"/>
+        </w:rPr>
+      </w:pPr>
+      <w:r>
+        <w:rPr>
+          <w:rFonts w:ascii="微軟正黑體" w:eastAsia="微軟正黑體" w:hAnsi="微軟正黑體" w:hint="eastAsia"/>
+        </w:rPr>
+        <w:t xml:space="preserve">    UDP Packet 在第15秒開始出現隨機傳送(On/Off, </w:t>
+      </w:r>
+      <w:proofErr w:type="spellStart"/>
+      <w:r>
+        <w:rPr>
+          <w:rFonts w:ascii="微軟正黑體" w:eastAsia="微軟正黑體" w:hAnsi="微軟正黑體"/>
+        </w:rPr>
+        <w:t>OnOffHelper</w:t>
+      </w:r>
+      <w:proofErr w:type="spellEnd"/>
+      <w:r>
+        <w:rPr>
+          <w:rFonts w:ascii="微軟正黑體" w:eastAsia="微軟正黑體" w:hAnsi="微軟正黑體" w:hint="eastAsia"/>
+        </w:rPr>
+        <w:t>)，其頻寬為5Mbps相當於Bottleneck的一半，可以看到兩者的反應，</w:t>
+      </w:r>
+      <w:proofErr w:type="spellStart"/>
+      <w:r>
+        <w:rPr>
+          <w:rFonts w:ascii="微軟正黑體" w:eastAsia="微軟正黑體" w:hAnsi="微軟正黑體"/>
+        </w:rPr>
+        <w:t>c</w:t>
+      </w:r>
+      <w:r>
+        <w:rPr>
+          <w:rFonts w:ascii="微軟正黑體" w:eastAsia="微軟正黑體" w:hAnsi="微軟正黑體" w:hint="eastAsia"/>
+        </w:rPr>
+        <w:t>wnd</w:t>
+      </w:r>
+      <w:proofErr w:type="spellEnd"/>
+      <w:r>
+        <w:rPr>
+          <w:rFonts w:ascii="微軟正黑體" w:eastAsia="微軟正黑體" w:hAnsi="微軟正黑體" w:hint="eastAsia"/>
+        </w:rPr>
+        <w:t>跟Throughput開始震盪，但可以看到</w:t>
+      </w:r>
+      <w:r>
+        <w:rPr>
+          <w:rFonts w:ascii="微軟正黑體" w:eastAsia="微軟正黑體" w:hAnsi="微軟正黑體"/>
+        </w:rPr>
+        <w:t>V</w:t>
+      </w:r>
+      <w:r>
+        <w:rPr>
+          <w:rFonts w:ascii="微軟正黑體" w:eastAsia="微軟正黑體" w:hAnsi="微軟正黑體" w:hint="eastAsia"/>
+        </w:rPr>
+        <w:t>egas的幅度較小。</w:t>
+      </w:r>
+    </w:p>
+    <w:p>
+      <w:pPr>
+        <w:rPr>
+          <w:rFonts w:ascii="微軟正黑體" w:eastAsia="微軟正黑體" w:hAnsi="微軟正黑體" w:hint="eastAsia"/>
+        </w:rPr>
+      </w:pPr>
+      <w:r>
+        <w:rPr>
+          <w:rFonts w:ascii="微軟正黑體" w:eastAsia="微軟正黑體" w:hAnsi="微軟正黑體" w:hint="eastAsia"/>
+        </w:rPr>
+        <w:t xml:space="preserve">    Queue值Reno震盪大，且到第15秒以後頻率更加快，而Vegas則是始終為0的穩定策略，主動的偵測與計算最大值並降低</w:t>
+      </w:r>
+      <w:proofErr w:type="spellStart"/>
+      <w:r>
+        <w:rPr>
+          <w:rFonts w:ascii="微軟正黑體" w:eastAsia="微軟正黑體" w:hAnsi="微軟正黑體"/>
+        </w:rPr>
+        <w:t>c</w:t>
+      </w:r>
+      <w:r>
+        <w:rPr>
+          <w:rFonts w:ascii="微軟正黑體" w:eastAsia="微軟正黑體" w:hAnsi="微軟正黑體" w:hint="eastAsia"/>
+        </w:rPr>
+        <w:t>wnd</w:t>
+      </w:r>
+      <w:proofErr w:type="spellEnd"/>
+      <w:r>
+        <w:rPr>
+          <w:rFonts w:ascii="微軟正黑體" w:eastAsia="微軟正黑體" w:hAnsi="微軟正黑體" w:hint="eastAsia"/>
+        </w:rPr>
+        <w:t>值在此有明顯的優勢。</w:t>
+      </w:r>
+    </w:p>
+    <w:p>
+      <w:pPr>
         <w:pStyle w:val="1"/>
-      </w:pPr>
-      <w:bookmarkStart w:id="3" w:name="_Toc232944192"/>
-      <w:r>
-        <w:rPr>
-          <w:rFonts w:hint="eastAsia"/>
-        </w:rPr>
-        <w:t>對效能圖的說明及解釋</w:t>
+        <w:rPr>
+          <w:rFonts w:ascii="微軟正黑體" w:eastAsia="微軟正黑體" w:hAnsi="微軟正黑體"/>
+        </w:rPr>
+      </w:pPr>
+      <w:bookmarkStart w:id="3" w:name="_Toc232947567"/>
+      <w:r>
+        <w:rPr>
+          <w:rFonts w:ascii="微軟正黑體" w:eastAsia="微軟正黑體" w:hAnsi="微軟正黑體" w:hint="eastAsia"/>
+        </w:rPr>
+        <w:t>心得與其他實作</w:t>
       </w:r>
       <w:bookmarkEnd w:id="3"/>
     </w:p>
     <w:p>
-      <w:r>
-        <w:rPr>
-          <w:rFonts w:hint="eastAsia"/>
-        </w:rPr>
-        <w:t>尤其需重點說明與</w:t>
-      </w:r>
-      <w:r>
-        <w:rPr>
-          <w:rFonts w:hint="eastAsia"/>
-        </w:rPr>
-        <w:t xml:space="preserve"> TCP Reno </w:t>
-      </w:r>
-      <w:r>
-        <w:rPr>
-          <w:rFonts w:hint="eastAsia"/>
-        </w:rPr>
-        <w:t>的相異之處及解釋原因。</w:t>
-      </w:r>
-    </w:p>
-    <w:p>
-      <w:r>
-        <w:rPr>
-          <w:rFonts w:hint="eastAsia"/>
-        </w:rPr>
-        <w:t>未改變</w:t>
-      </w:r>
-      <w:r>
-        <w:rPr>
-          <w:rFonts w:hint="eastAsia"/>
-        </w:rPr>
-        <w:t>throughput</w:t>
-      </w:r>
-      <w:r>
-        <w:rPr>
-          <w:rFonts w:hint="eastAsia"/>
-        </w:rPr>
-        <w:t>跟</w:t>
-      </w:r>
-      <w:r>
-        <w:rPr>
-          <w:rFonts w:hint="eastAsia"/>
-        </w:rPr>
-        <w:t>queue</w:t>
-      </w:r>
-      <w:r>
-        <w:rPr>
-          <w:rFonts w:hint="eastAsia"/>
-        </w:rPr>
-        <w:t>，分別加入</w:t>
-      </w:r>
-      <w:r>
-        <w:rPr>
-          <w:rFonts w:hint="eastAsia"/>
-        </w:rPr>
-        <w:t>UDP</w:t>
-      </w:r>
-      <w:r>
-        <w:rPr>
-          <w:rFonts w:hint="eastAsia"/>
-        </w:rPr>
-        <w:t>封包干擾，</w:t>
-      </w:r>
-      <w:r>
-        <w:t>L</w:t>
-      </w:r>
-      <w:r>
-        <w:rPr>
-          <w:rFonts w:hint="eastAsia"/>
-        </w:rPr>
-        <w:t>eaf</w:t>
-      </w:r>
-      <w:r>
-        <w:rPr>
-          <w:rFonts w:hint="eastAsia"/>
-        </w:rPr>
-        <w:t>頻寬</w:t>
-      </w:r>
-      <w:r>
-        <w:rPr>
-          <w:rFonts w:hint="eastAsia"/>
-        </w:rPr>
-        <w:t>&gt;Router</w:t>
-      </w:r>
-      <w:r>
-        <w:rPr>
-          <w:rFonts w:hint="eastAsia"/>
-        </w:rPr>
-        <w:t>頻寬</w:t>
-      </w:r>
-      <w:r>
-        <w:rPr>
-          <w:rFonts w:hint="eastAsia"/>
-        </w:rPr>
-        <w:t>。</w:t>
-      </w:r>
-    </w:p>
-    <w:p>
-      <w:r>
-        <w:rPr>
-          <w:rFonts w:hint="eastAsia"/>
+      <w:pPr>
+        <w:rPr>
+          <w:rFonts w:ascii="微軟正黑體" w:eastAsia="微軟正黑體" w:hAnsi="微軟正黑體"/>
+        </w:rPr>
+      </w:pPr>
+      <w:r>
+        <w:rPr>
+          <w:rFonts w:ascii="微軟正黑體" w:eastAsia="微軟正黑體" w:hAnsi="微軟正黑體" w:hint="eastAsia"/>
+        </w:rPr>
+        <w:t xml:space="preserve">    在本次實驗中，最初使用Ubuntu做雙系統進行NS3 3.47的模擬，後來發現到文書處理有些不方便，而想起強化學習的TCP研究做法，最後把</w:t>
+      </w:r>
+      <w:r>
+        <w:rPr>
+          <w:rFonts w:ascii="微軟正黑體" w:eastAsia="微軟正黑體" w:hAnsi="微軟正黑體"/>
+        </w:rPr>
+        <w:t>N</w:t>
+      </w:r>
+      <w:r>
+        <w:rPr>
+          <w:rFonts w:ascii="微軟正黑體" w:eastAsia="微軟正黑體" w:hAnsi="微軟正黑體" w:hint="eastAsia"/>
+        </w:rPr>
+        <w:t>S3裝到Docker上面使用掛載資料家的方式進行編譯使用，這樣坐起來可移植且簡單使用(CLI介面)。</w:t>
+      </w:r>
+    </w:p>
+    <w:p>
+      <w:pPr>
+        <w:rPr>
+          <w:rFonts w:ascii="微軟正黑體" w:eastAsia="微軟正黑體" w:hAnsi="微軟正黑體"/>
+        </w:rPr>
+      </w:pPr>
+      <w:r>
+        <w:rPr>
+          <w:rFonts w:ascii="微軟正黑體" w:eastAsia="微軟正黑體" w:hAnsi="微軟正黑體" w:hint="eastAsia"/>
+        </w:rPr>
+        <w:t xml:space="preserve">    NS3的學習難度感覺頗高，對文件的觀看還未熟悉，初學157頁，進階</w:t>
+      </w:r>
+      <w:r>
+        <w:rPr>
+          <w:rFonts w:ascii="微軟正黑體" w:eastAsia="微軟正黑體" w:hAnsi="微軟正黑體" w:hint="eastAsia"/>
         </w:rPr>
         <w:lastRenderedPageBreak/>
-        <w:t>一開始按照</w:t>
+        <w:t>335頁，模組庫739頁，而單獨從</w:t>
+      </w:r>
+      <w:r>
+        <w:rPr>
+          <w:rFonts w:ascii="微軟正黑體" w:eastAsia="微軟正黑體" w:hAnsi="微軟正黑體"/>
+        </w:rPr>
+        <w:t>e</w:t>
+      </w:r>
+      <w:r>
+        <w:rPr>
+          <w:rFonts w:ascii="微軟正黑體" w:eastAsia="微軟正黑體" w:hAnsi="微軟正黑體" w:hint="eastAsia"/>
+        </w:rPr>
+        <w:t>xample修改程式可以短期完成配合網路搜尋與AI問答可以達成</w:t>
+      </w:r>
+      <w:r>
+        <w:rPr>
+          <w:rFonts w:ascii="微軟正黑體" w:eastAsia="微軟正黑體" w:hAnsi="微軟正黑體" w:hint="eastAsia"/>
+        </w:rPr>
+        <w:t>，</w:t>
+      </w:r>
+      <w:r>
+        <w:rPr>
+          <w:rFonts w:ascii="微軟正黑體" w:eastAsia="微軟正黑體" w:hAnsi="微軟正黑體"/>
+        </w:rPr>
+        <w:t>V</w:t>
+      </w:r>
+      <w:r>
+        <w:rPr>
+          <w:rFonts w:ascii="微軟正黑體" w:eastAsia="微軟正黑體" w:hAnsi="微軟正黑體" w:hint="eastAsia"/>
+        </w:rPr>
+        <w:t>egas論文也還沒看完</w:t>
+      </w:r>
+      <w:r>
+        <w:rPr>
+          <w:rFonts w:ascii="微軟正黑體" w:eastAsia="微軟正黑體" w:hAnsi="微軟正黑體" w:hint="eastAsia"/>
+        </w:rPr>
+        <w:t>，稍微有了解事件驅動的意思，其中</w:t>
+      </w:r>
+      <w:r>
+        <w:rPr>
+          <w:rFonts w:ascii="微軟正黑體" w:eastAsia="微軟正黑體" w:hAnsi="微軟正黑體" w:hint="eastAsia"/>
+        </w:rPr>
+        <w:t>一開始沒加入UDP時Vegas甚至只有前面不到1秒的時間有</w:t>
       </w:r>
       <w:proofErr w:type="spellStart"/>
       <w:r>
         <w:rPr>
-          <w:rFonts w:hint="eastAsia"/>
+          <w:rFonts w:ascii="微軟正黑體" w:eastAsia="微軟正黑體" w:hAnsi="微軟正黑體" w:hint="eastAsia"/>
+        </w:rPr>
+        <w:t>cwnd</w:t>
+      </w:r>
+      <w:proofErr w:type="spellEnd"/>
+      <w:r>
+        <w:rPr>
+          <w:rFonts w:ascii="微軟正黑體" w:eastAsia="微軟正黑體" w:hAnsi="微軟正黑體" w:hint="eastAsia"/>
+        </w:rPr>
+        <w:t>值，只能用補充的方式，因為其機制的關係滿意</w:t>
+      </w:r>
+      <w:proofErr w:type="spellStart"/>
+      <w:r>
+        <w:rPr>
+          <w:rFonts w:ascii="微軟正黑體" w:eastAsia="微軟正黑體" w:hAnsi="微軟正黑體"/>
+        </w:rPr>
+        <w:t>c</w:t>
+      </w:r>
+      <w:r>
+        <w:rPr>
+          <w:rFonts w:ascii="微軟正黑體" w:eastAsia="微軟正黑體" w:hAnsi="微軟正黑體" w:hint="eastAsia"/>
+        </w:rPr>
+        <w:t>wnd</w:t>
+      </w:r>
+      <w:proofErr w:type="spellEnd"/>
+      <w:r>
+        <w:rPr>
+          <w:rFonts w:ascii="微軟正黑體" w:eastAsia="微軟正黑體" w:hAnsi="微軟正黑體" w:hint="eastAsia"/>
+        </w:rPr>
+        <w:t>值而環境又沒有變動就抓不到。</w:t>
+      </w:r>
+    </w:p>
+    <w:p>
+      <w:pPr>
+        <w:rPr>
+          <w:rFonts w:ascii="微軟正黑體" w:eastAsia="微軟正黑體" w:hAnsi="微軟正黑體"/>
+        </w:rPr>
+      </w:pPr>
+      <w:r>
+        <w:rPr>
+          <w:rFonts w:ascii="微軟正黑體" w:eastAsia="微軟正黑體" w:hAnsi="微軟正黑體" w:hint="eastAsia"/>
+        </w:rPr>
+        <w:t xml:space="preserve">    最終在裝Docker時使用NS3 3.48也成功從</w:t>
+      </w:r>
+      <w:proofErr w:type="spellStart"/>
+      <w:r>
+        <w:rPr>
+          <w:rFonts w:ascii="微軟正黑體" w:eastAsia="微軟正黑體" w:hAnsi="微軟正黑體" w:hint="eastAsia"/>
+        </w:rPr>
+        <w:t>tcp</w:t>
+      </w:r>
+      <w:proofErr w:type="spellEnd"/>
+      <w:r>
+        <w:rPr>
+          <w:rFonts w:ascii="微軟正黑體" w:eastAsia="微軟正黑體" w:hAnsi="微軟正黑體" w:hint="eastAsia"/>
+        </w:rPr>
+        <w:t>-</w:t>
+      </w:r>
+      <w:proofErr w:type="spellStart"/>
+      <w:r>
+        <w:rPr>
+          <w:rFonts w:ascii="微軟正黑體" w:eastAsia="微軟正黑體" w:hAnsi="微軟正黑體" w:hint="eastAsia"/>
+        </w:rPr>
+        <w:t>linux</w:t>
+      </w:r>
+      <w:proofErr w:type="spellEnd"/>
+      <w:r>
+        <w:rPr>
+          <w:rFonts w:ascii="微軟正黑體" w:eastAsia="微軟正黑體" w:hAnsi="微軟正黑體" w:hint="eastAsia"/>
+        </w:rPr>
+        <w:t>-reno範例改出</w:t>
+      </w:r>
+      <w:proofErr w:type="spellStart"/>
+      <w:r>
+        <w:rPr>
+          <w:rFonts w:ascii="微軟正黑體" w:eastAsia="微軟正黑體" w:hAnsi="微軟正黑體" w:hint="eastAsia"/>
+        </w:rPr>
+        <w:t>linux</w:t>
+      </w:r>
+      <w:proofErr w:type="spellEnd"/>
+      <w:r>
+        <w:rPr>
+          <w:rFonts w:ascii="微軟正黑體" w:eastAsia="微軟正黑體" w:hAnsi="微軟正黑體" w:hint="eastAsia"/>
+        </w:rPr>
+        <w:t xml:space="preserve"> reno, </w:t>
+      </w:r>
+      <w:proofErr w:type="spellStart"/>
+      <w:r>
+        <w:rPr>
+          <w:rFonts w:ascii="微軟正黑體" w:eastAsia="微軟正黑體" w:hAnsi="微軟正黑體" w:hint="eastAsia"/>
         </w:rPr>
         <w:t>vegas</w:t>
       </w:r>
       <w:proofErr w:type="spellEnd"/>
       <w:r>
         <w:rPr>
-          <w:rFonts w:hint="eastAsia"/>
-        </w:rPr>
-        <w:t>預設設定</w:t>
-      </w:r>
-      <w:r>
-        <w:rPr>
-          <w:rFonts w:hint="eastAsia"/>
-        </w:rPr>
-        <w:t>alpha, beta, gamma</w:t>
-      </w:r>
-      <w:r>
-        <w:rPr>
-          <w:rFonts w:hint="eastAsia"/>
-        </w:rPr>
-        <w:t>發現吞吐量不佳，所以用</w:t>
-      </w:r>
-      <w:r>
-        <w:rPr>
-          <w:rFonts w:hint="eastAsia"/>
-        </w:rPr>
-        <w:t>2</w:t>
-      </w:r>
-      <w:r>
-        <w:rPr>
-          <w:rFonts w:hint="eastAsia"/>
-        </w:rPr>
-        <w:t>~5</w:t>
-      </w:r>
-      <w:r>
-        <w:rPr>
-          <w:rFonts w:hint="eastAsia"/>
-        </w:rPr>
-        <w:t>倍來測試</w:t>
-      </w:r>
-      <w:r>
-        <w:rPr>
-          <w:rFonts w:hint="eastAsia"/>
-        </w:rPr>
-        <w:t>，</w:t>
-      </w:r>
-      <w:r>
-        <w:rPr>
-          <w:rFonts w:hint="eastAsia"/>
-        </w:rPr>
-        <w:t>3</w:t>
-      </w:r>
-      <w:r>
-        <w:rPr>
-          <w:rFonts w:hint="eastAsia"/>
-        </w:rPr>
-        <w:t>，</w:t>
-      </w:r>
-      <w:r>
-        <w:rPr>
-          <w:rFonts w:hint="eastAsia"/>
-        </w:rPr>
-        <w:t>4</w:t>
-      </w:r>
-      <w:r>
-        <w:rPr>
-          <w:rFonts w:hint="eastAsia"/>
-        </w:rPr>
-        <w:t>倍幾乎沒有繼續成長，</w:t>
-      </w:r>
-      <w:r>
-        <w:rPr>
-          <w:rFonts w:hint="eastAsia"/>
-        </w:rPr>
-        <w:t>5</w:t>
-      </w:r>
-      <w:r>
-        <w:rPr>
-          <w:rFonts w:hint="eastAsia"/>
-        </w:rPr>
-        <w:t>倍反而造成延遲</w:t>
-      </w:r>
-      <w:r>
-        <w:rPr>
-          <w:rFonts w:hint="eastAsia"/>
-        </w:rPr>
-        <w:t>(</w:t>
-      </w:r>
-      <w:r>
-        <w:t>q</w:t>
-      </w:r>
-      <w:r>
-        <w:rPr>
-          <w:rFonts w:hint="eastAsia"/>
-        </w:rPr>
-        <w:t xml:space="preserve">ueue size </w:t>
-      </w:r>
-      <w:r>
-        <w:rPr>
-          <w:rFonts w:hint="eastAsia"/>
-        </w:rPr>
-        <w:t>變動</w:t>
-      </w:r>
-      <w:r>
-        <w:rPr>
-          <w:rFonts w:hint="eastAsia"/>
-        </w:rPr>
-        <w:t>)</w:t>
-      </w:r>
-      <w:r>
-        <w:rPr>
-          <w:rFonts w:hint="eastAsia"/>
-        </w:rPr>
-        <w:t>，所以設定為</w:t>
-      </w:r>
-      <w:r>
-        <w:t>(</w:t>
-      </w:r>
-      <w:r>
-        <w:rPr>
-          <w:rFonts w:hint="eastAsia"/>
-        </w:rPr>
-        <w:t>8, 16, 4)</w:t>
-      </w:r>
-      <w:r>
-        <w:rPr>
-          <w:rFonts w:hint="eastAsia"/>
-        </w:rPr>
-        <w:t>。</w:t>
-      </w:r>
-    </w:p>
-    <w:p>
-      <w:r>
-        <w:rPr>
-          <w:rFonts w:hint="eastAsia"/>
-        </w:rPr>
-        <w:t>原本</w:t>
-      </w:r>
-      <w:r>
-        <w:rPr>
-          <w:rFonts w:hint="eastAsia"/>
-        </w:rPr>
-        <w:t>Reno queue</w:t>
-      </w:r>
-      <w:r>
-        <w:rPr>
-          <w:rFonts w:hint="eastAsia"/>
-        </w:rPr>
-        <w:t>也是設定</w:t>
-      </w:r>
-      <w:r>
-        <w:rPr>
-          <w:rFonts w:hint="eastAsia"/>
-        </w:rPr>
-        <w:t>100</w:t>
-      </w:r>
-      <w:r>
-        <w:rPr>
-          <w:rFonts w:hint="eastAsia"/>
-        </w:rPr>
-        <w:t>，在改變</w:t>
-      </w:r>
-      <w:proofErr w:type="gramStart"/>
-      <w:r>
-        <w:rPr>
-          <w:rFonts w:hint="eastAsia"/>
-        </w:rPr>
-        <w:t>頻寬後發現</w:t>
-      </w:r>
-      <w:proofErr w:type="gramEnd"/>
-      <w:r>
-        <w:rPr>
-          <w:rFonts w:hint="eastAsia"/>
-        </w:rPr>
-        <w:t>非常不穩定，所以找公式來算</w:t>
-      </w:r>
-    </w:p>
-    <w:p>
-      <w:pPr>
-        <w:pStyle w:val="aa"/>
-        <w:numPr>
-          <w:ilvl w:val="0"/>
-          <w:numId w:val="3"/>
-        </w:numPr>
-      </w:pPr>
-      <w:r>
-        <w:rPr>
-          <w:rFonts w:hint="eastAsia"/>
-        </w:rPr>
-        <w:t>RTT = 2*(1 + 20 + 1) = 44ms</w:t>
-      </w:r>
-    </w:p>
-    <w:p>
-      <w:pPr>
-        <w:pStyle w:val="aa"/>
-        <w:numPr>
-          <w:ilvl w:val="0"/>
-          <w:numId w:val="3"/>
-        </w:numPr>
-      </w:pPr>
-      <w:r>
-        <w:rPr>
-          <w:rFonts w:hint="eastAsia"/>
-        </w:rPr>
-        <w:t xml:space="preserve">Bottleneck = 10Mbps = </w:t>
-      </w:r>
-      <w:r>
-        <w:t>10,000,000 bps</w:t>
-      </w:r>
-    </w:p>
-    <w:p>
-      <w:pPr>
-        <w:pStyle w:val="aa"/>
-        <w:numPr>
-          <w:ilvl w:val="0"/>
-          <w:numId w:val="3"/>
-        </w:numPr>
-      </w:pPr>
-      <w:r>
-        <w:t>BDP (Bits)</w:t>
-      </w:r>
-      <w:r>
-        <w:t>：</w:t>
-      </w:r>
-      <w:r>
-        <w:t xml:space="preserve"> 10,000,000 bps * 0.044 s = 440,000 Bits = 55,000 Bytes</w:t>
-      </w:r>
-    </w:p>
-    <w:p>
-      <w:pPr>
-        <w:pStyle w:val="aa"/>
-        <w:numPr>
-          <w:ilvl w:val="0"/>
-          <w:numId w:val="3"/>
-        </w:numPr>
-      </w:pPr>
-      <w:proofErr w:type="gramStart"/>
-      <w:r>
-        <w:t>封包數</w:t>
-      </w:r>
-      <w:proofErr w:type="gramEnd"/>
-      <w:r>
-        <w:t xml:space="preserve"> (Packets)</w:t>
-      </w:r>
-      <w:r>
-        <w:t>：</w:t>
-      </w:r>
-      <w:r>
-        <w:t xml:space="preserve"> 55,000 Bytes / 14</w:t>
-      </w:r>
-      <w:r>
-        <w:rPr>
-          <w:rFonts w:hint="eastAsia"/>
-        </w:rPr>
-        <w:t>60</w:t>
-      </w:r>
-      <w:r>
-        <w:t xml:space="preserve"> Bytes (MSS) ≈ 38 </w:t>
-      </w:r>
-      <w:r>
-        <w:t>個封包。</w:t>
-      </w:r>
-      <w:r>
-        <w:rPr>
-          <w:rFonts w:hint="eastAsia"/>
-        </w:rPr>
-        <w:t>(</w:t>
-      </w:r>
-      <w:r>
-        <w:t>37.671232876712328767123287671233</w:t>
-      </w:r>
-      <w:r>
-        <w:rPr>
-          <w:rFonts w:hint="eastAsia"/>
-        </w:rPr>
-        <w:t>)</w:t>
+          <w:rFonts w:ascii="微軟正黑體" w:eastAsia="微軟正黑體" w:hAnsi="微軟正黑體" w:hint="eastAsia"/>
+        </w:rPr>
+        <w:t>的實驗環境，</w:t>
+      </w:r>
+      <w:proofErr w:type="spellStart"/>
+      <w:r>
+        <w:rPr>
+          <w:rFonts w:ascii="微軟正黑體" w:eastAsia="微軟正黑體" w:hAnsi="微軟正黑體"/>
+        </w:rPr>
+        <w:t>v</w:t>
+      </w:r>
+      <w:r>
+        <w:rPr>
+          <w:rFonts w:ascii="微軟正黑體" w:eastAsia="微軟正黑體" w:hAnsi="微軟正黑體" w:hint="eastAsia"/>
+        </w:rPr>
+        <w:t>egas</w:t>
+      </w:r>
+      <w:proofErr w:type="spellEnd"/>
+      <w:r>
+        <w:rPr>
+          <w:rFonts w:ascii="微軟正黑體" w:eastAsia="微軟正黑體" w:hAnsi="微軟正黑體" w:hint="eastAsia"/>
+        </w:rPr>
+        <w:t>沒有範例但設計在</w:t>
+      </w:r>
+      <w:proofErr w:type="spellStart"/>
+      <w:r>
+        <w:rPr>
+          <w:rFonts w:ascii="微軟正黑體" w:eastAsia="微軟正黑體" w:hAnsi="微軟正黑體" w:hint="eastAsia"/>
+        </w:rPr>
+        <w:t>src</w:t>
+      </w:r>
+      <w:proofErr w:type="spellEnd"/>
+      <w:r>
+        <w:rPr>
+          <w:rFonts w:ascii="微軟正黑體" w:eastAsia="微軟正黑體" w:hAnsi="微軟正黑體" w:hint="eastAsia"/>
+        </w:rPr>
+        <w:t>/internet中有實作所以可以呼叫。</w:t>
+      </w:r>
+    </w:p>
+    <w:p>
+      <w:pPr>
+        <w:pStyle w:val="1"/>
+        <w:rPr>
+          <w:rFonts w:ascii="微軟正黑體" w:eastAsia="微軟正黑體" w:hAnsi="微軟正黑體"/>
+        </w:rPr>
+      </w:pPr>
+      <w:bookmarkStart w:id="4" w:name="_Toc232947568"/>
+      <w:r>
+        <w:rPr>
+          <w:rFonts w:ascii="微軟正黑體" w:eastAsia="微軟正黑體" w:hAnsi="微軟正黑體" w:hint="eastAsia"/>
+        </w:rPr>
+        <w:t>GitHub連結</w:t>
+      </w:r>
+      <w:bookmarkEnd w:id="4"/>
+    </w:p>
+    <w:p>
+      <w:pPr>
+        <w:rPr>
+          <w:rFonts w:ascii="微軟正黑體" w:eastAsia="微軟正黑體" w:hAnsi="微軟正黑體" w:hint="eastAsia"/>
+        </w:rPr>
+      </w:pPr>
+      <w:r>
+        <w:rPr>
+          <w:rFonts w:ascii="微軟正黑體" w:eastAsia="微軟正黑體" w:hAnsi="微軟正黑體"/>
+        </w:rPr>
+        <w:t>https://github.com/WilliamChen2002/NP_Final_Report_NS3_Docker.git</w:t>
       </w:r>
     </w:p>
     <w:sectPr>
-      <w:footerReference w:type="default" r:id="rId14"/>
+      <w:footerReference w:type="default" r:id="rId15"/>
       <w:pgSz w:w="11906" w:h="16838"/>
       <w:pgMar w:top="1440" w:right="1800" w:bottom="1440" w:left="1800" w:header="851" w:footer="992" w:gutter="0"/>
       <w:pgNumType w:start="0"/>
@@ -2987,6 +4181,92 @@
     </w:lvl>
   </w:abstractNum>
   <w:abstractNum w:abstractNumId="1" w15:restartNumberingAfterBreak="0">
+    <w:nsid w:val="052748DA"/>
+    <w:multiLevelType w:val="hybridMultilevel"/>
+    <w:tmpl w:val="48E623CE"/>
+    <w:lvl w:ilvl="0" w:tplc="0409000F">
+      <w:start w:val="1"/>
+      <w:numFmt w:val="decimal"/>
+      <w:lvlText w:val="%1."/>
+      <w:lvlJc w:val="left"/>
+      <w:pPr>
+        <w:ind w:left="480" w:hanging="480"/>
+      </w:pPr>
+    </w:lvl>
+    <w:lvl w:ilvl="1" w:tplc="04090019" w:tentative="1">
+      <w:start w:val="1"/>
+      <w:numFmt w:val="ideographTraditional"/>
+      <w:lvlText w:val="%2、"/>
+      <w:lvlJc w:val="left"/>
+      <w:pPr>
+        <w:ind w:left="960" w:hanging="480"/>
+      </w:pPr>
+    </w:lvl>
+    <w:lvl w:ilvl="2" w:tplc="0409001B" w:tentative="1">
+      <w:start w:val="1"/>
+      <w:numFmt w:val="lowerRoman"/>
+      <w:lvlText w:val="%3."/>
+      <w:lvlJc w:val="right"/>
+      <w:pPr>
+        <w:ind w:left="1440" w:hanging="480"/>
+      </w:pPr>
+    </w:lvl>
+    <w:lvl w:ilvl="3" w:tplc="0409000F" w:tentative="1">
+      <w:start w:val="1"/>
+      <w:numFmt w:val="decimal"/>
+      <w:lvlText w:val="%4."/>
+      <w:lvlJc w:val="left"/>
+      <w:pPr>
+        <w:ind w:left="1920" w:hanging="480"/>
+      </w:pPr>
+    </w:lvl>
+    <w:lvl w:ilvl="4" w:tplc="04090019" w:tentative="1">
+      <w:start w:val="1"/>
+      <w:numFmt w:val="ideographTraditional"/>
+      <w:lvlText w:val="%5、"/>
+      <w:lvlJc w:val="left"/>
+      <w:pPr>
+        <w:ind w:left="2400" w:hanging="480"/>
+      </w:pPr>
+    </w:lvl>
+    <w:lvl w:ilvl="5" w:tplc="0409001B" w:tentative="1">
+      <w:start w:val="1"/>
+      <w:numFmt w:val="lowerRoman"/>
+      <w:lvlText w:val="%6."/>
+      <w:lvlJc w:val="right"/>
+      <w:pPr>
+        <w:ind w:left="2880" w:hanging="480"/>
+      </w:pPr>
+    </w:lvl>
+    <w:lvl w:ilvl="6" w:tplc="0409000F" w:tentative="1">
+      <w:start w:val="1"/>
+      <w:numFmt w:val="decimal"/>
+      <w:lvlText w:val="%7."/>
+      <w:lvlJc w:val="left"/>
+      <w:pPr>
+        <w:ind w:left="3360" w:hanging="480"/>
+      </w:pPr>
+    </w:lvl>
+    <w:lvl w:ilvl="7" w:tplc="04090019" w:tentative="1">
+      <w:start w:val="1"/>
+      <w:numFmt w:val="ideographTraditional"/>
+      <w:lvlText w:val="%8、"/>
+      <w:lvlJc w:val="left"/>
+      <w:pPr>
+        <w:ind w:left="3840" w:hanging="480"/>
+      </w:pPr>
+    </w:lvl>
+    <w:lvl w:ilvl="8" w:tplc="0409001B" w:tentative="1">
+      <w:start w:val="1"/>
+      <w:numFmt w:val="lowerRoman"/>
+      <w:lvlText w:val="%9."/>
+      <w:lvlJc w:val="right"/>
+      <w:pPr>
+        <w:ind w:left="4320" w:hanging="480"/>
+      </w:pPr>
+    </w:lvl>
+  </w:abstractNum>
+  <w:abstractNum w:abstractNumId="2" w15:restartNumberingAfterBreak="0">
     <w:nsid w:val="13DD3020"/>
     <w:multiLevelType w:val="hybridMultilevel"/>
     <w:tmpl w:val="FF669F80"/>
@@ -3099,7 +4379,96 @@
       </w:rPr>
     </w:lvl>
   </w:abstractNum>
-  <w:abstractNum w:abstractNumId="2" w15:restartNumberingAfterBreak="0">
+  <w:abstractNum w:abstractNumId="3" w15:restartNumberingAfterBreak="0">
+    <w:nsid w:val="45E82AB2"/>
+    <w:multiLevelType w:val="hybridMultilevel"/>
+    <w:tmpl w:val="69241DB4"/>
+    <w:lvl w:ilvl="0" w:tplc="76925EDA">
+      <w:start w:val="1"/>
+      <w:numFmt w:val="decimal"/>
+      <w:lvlText w:val="%1."/>
+      <w:lvlJc w:val="left"/>
+      <w:pPr>
+        <w:ind w:left="1200" w:hanging="360"/>
+      </w:pPr>
+      <w:rPr>
+        <w:rFonts w:hint="default"/>
+      </w:rPr>
+    </w:lvl>
+    <w:lvl w:ilvl="1" w:tplc="04090019" w:tentative="1">
+      <w:start w:val="1"/>
+      <w:numFmt w:val="ideographTraditional"/>
+      <w:lvlText w:val="%2、"/>
+      <w:lvlJc w:val="left"/>
+      <w:pPr>
+        <w:ind w:left="1800" w:hanging="480"/>
+      </w:pPr>
+    </w:lvl>
+    <w:lvl w:ilvl="2" w:tplc="0409001B" w:tentative="1">
+      <w:start w:val="1"/>
+      <w:numFmt w:val="lowerRoman"/>
+      <w:lvlText w:val="%3."/>
+      <w:lvlJc w:val="right"/>
+      <w:pPr>
+        <w:ind w:left="2280" w:hanging="480"/>
+      </w:pPr>
+    </w:lvl>
+    <w:lvl w:ilvl="3" w:tplc="0409000F" w:tentative="1">
+      <w:start w:val="1"/>
+      <w:numFmt w:val="decimal"/>
+      <w:lvlText w:val="%4."/>
+      <w:lvlJc w:val="left"/>
+      <w:pPr>
+        <w:ind w:left="2760" w:hanging="480"/>
+      </w:pPr>
+    </w:lvl>
+    <w:lvl w:ilvl="4" w:tplc="04090019" w:tentative="1">
+      <w:start w:val="1"/>
+      <w:numFmt w:val="ideographTraditional"/>
+      <w:lvlText w:val="%5、"/>
+      <w:lvlJc w:val="left"/>
+      <w:pPr>
+        <w:ind w:left="3240" w:hanging="480"/>
+      </w:pPr>
+    </w:lvl>
+    <w:lvl w:ilvl="5" w:tplc="0409001B" w:tentative="1">
+      <w:start w:val="1"/>
+      <w:numFmt w:val="lowerRoman"/>
+      <w:lvlText w:val="%6."/>
+      <w:lvlJc w:val="right"/>
+      <w:pPr>
+        <w:ind w:left="3720" w:hanging="480"/>
+      </w:pPr>
+    </w:lvl>
+    <w:lvl w:ilvl="6" w:tplc="0409000F" w:tentative="1">
+      <w:start w:val="1"/>
+      <w:numFmt w:val="decimal"/>
+      <w:lvlText w:val="%7."/>
+      <w:lvlJc w:val="left"/>
+      <w:pPr>
+        <w:ind w:left="4200" w:hanging="480"/>
+      </w:pPr>
+    </w:lvl>
+    <w:lvl w:ilvl="7" w:tplc="04090019" w:tentative="1">
+      <w:start w:val="1"/>
+      <w:numFmt w:val="ideographTraditional"/>
+      <w:lvlText w:val="%8、"/>
+      <w:lvlJc w:val="left"/>
+      <w:pPr>
+        <w:ind w:left="4680" w:hanging="480"/>
+      </w:pPr>
+    </w:lvl>
+    <w:lvl w:ilvl="8" w:tplc="0409001B" w:tentative="1">
+      <w:start w:val="1"/>
+      <w:numFmt w:val="lowerRoman"/>
+      <w:lvlText w:val="%9."/>
+      <w:lvlJc w:val="right"/>
+      <w:pPr>
+        <w:ind w:left="5160" w:hanging="480"/>
+      </w:pPr>
+    </w:lvl>
+  </w:abstractNum>
+  <w:abstractNum w:abstractNumId="4" w15:restartNumberingAfterBreak="0">
     <w:nsid w:val="65DE4976"/>
     <w:multiLevelType w:val="hybridMultilevel"/>
     <w:tmpl w:val="6DD62398"/>
@@ -3189,10 +4558,16 @@
     <w:abstractNumId w:val="0"/>
   </w:num>
   <w:num w:numId="2" w16cid:durableId="227234476">
+    <w:abstractNumId w:val="4"/>
+  </w:num>
+  <w:num w:numId="3" w16cid:durableId="144245192">
     <w:abstractNumId w:val="2"/>
   </w:num>
-  <w:num w:numId="3" w16cid:durableId="144245192">
+  <w:num w:numId="4" w16cid:durableId="1040982364">
     <w:abstractNumId w:val="1"/>
+  </w:num>
+  <w:num w:numId="5" w16cid:durableId="1689674789">
+    <w:abstractNumId w:val="3"/>
   </w:num>
 </w:numbering>
 </file>
@@ -3803,7 +5178,6 @@
   <w:style w:type="character" w:default="1" w:styleId="a1">
     <w:name w:val="Default Paragraph Font"/>
     <w:uiPriority w:val="1"/>
-    <w:semiHidden/>
     <w:unhideWhenUsed/>
   </w:style>
   <w:style w:type="table" w:default="1" w:styleId="a2">
@@ -4257,6 +5631,28 @@
       <w:u w:val="single"/>
     </w:rPr>
   </w:style>
+  <w:style w:type="character" w:styleId="af7">
+    <w:name w:val="Placeholder Text"/>
+    <w:basedOn w:val="a1"/>
+    <w:uiPriority w:val="99"/>
+    <w:semiHidden/>
+    <w:rsid w:val="00797F4C"/>
+    <w:rPr>
+      <w:color w:val="666666"/>
+    </w:rPr>
+  </w:style>
+  <w:style w:type="character" w:styleId="af8">
+    <w:name w:val="Unresolved Mention"/>
+    <w:basedOn w:val="a1"/>
+    <w:uiPriority w:val="99"/>
+    <w:semiHidden/>
+    <w:unhideWhenUsed/>
+    <w:rsid w:val="00797F4C"/>
+    <w:rPr>
+      <w:color w:val="605E5C"/>
+      <w:shd w:val="clear" w:color="auto" w:fill="E1DFDD"/>
+    </w:rPr>
+  </w:style>
 </w:styles>
 </file>
 
@@ -4418,6 +5814,13 @@
     <w:pitch w:val="variable"/>
     <w:sig w:usb0="000002A7" w:usb1="28CF4400" w:usb2="00000016" w:usb3="00000000" w:csb0="00100009" w:csb1="00000000"/>
   </w:font>
+  <w:font w:name="Cambria Math">
+    <w:panose1 w:val="02040503050406030204"/>
+    <w:charset w:val="00"/>
+    <w:family w:val="roman"/>
+    <w:pitch w:val="variable"/>
+    <w:sig w:usb0="E00006FF" w:usb1="420024FF" w:usb2="02000000" w:usb3="00000000" w:csb0="0000019F" w:csb1="00000000"/>
+  </w:font>
   <w:font w:name="Aptos">
     <w:charset w:val="00"/>
     <w:family w:val="swiss"/>
@@ -4459,7 +5862,7 @@
   </w:compat>
   <w:rsids>
     <w:rsidRoot w:val="00E13840"/>
-    <w:rsid w:val="0081420F"/>
+    <w:rsid w:val="00056E5F"/>
     <w:rsid w:val="00941B57"/>
     <w:rsid w:val="00E13840"/>
   </w:rsids>
@@ -4929,6 +6332,16 @@
       <w:widowControl w:val="0"/>
     </w:pPr>
   </w:style>
+  <w:style w:type="character" w:styleId="a3">
+    <w:name w:val="Placeholder Text"/>
+    <w:basedOn w:val="a0"/>
+    <w:uiPriority w:val="99"/>
+    <w:semiHidden/>
+    <w:rsid w:val="00E13840"/>
+    <w:rPr>
+      <w:color w:val="666666"/>
+    </w:rPr>
+  </w:style>
 </w:styles>
 </file>
 

</xml_diff>

<commit_message>
[fix] Incorrect word choice.
</commit_message>
<xml_diff>
--- a/期末專題.docx
+++ b/期末專題.docx
@@ -7,6 +7,10 @@
         <w:rPr>
           <w:rFonts w:ascii="微軟正黑體" w:eastAsia="微軟正黑體" w:hAnsi="微軟正黑體"/>
           <w:color w:val="4472C4" w:themeColor="accent1"/>
+          <w:kern w:val="2"/>
+          <w:sz w:val="24"/>
+          <w:szCs w:val="24"/>
+          <w14:ligatures w14:val="standardContextual"/>
         </w:rPr>
         <w:id w:val="1890068514"/>
         <w:docPartObj>
@@ -17,10 +21,6 @@
       <w:sdtEndPr>
         <w:rPr>
           <w:color w:val="auto"/>
-          <w:kern w:val="2"/>
-          <w:sz w:val="24"/>
-          <w:szCs w:val="24"/>
-          <w14:ligatures w14:val="standardContextual"/>
         </w:rPr>
       </w:sdtEndPr>
       <w:sdtContent>
@@ -40,7 +40,7 @@
               <w:noProof/>
             </w:rPr>
             <w:drawing>
-              <wp:inline distT="0" distB="0" distL="0" distR="0" wp14:anchorId="1B1CC6A2" wp14:editId="62F49B88">
+              <wp:inline distT="0" distB="0" distL="0" distR="0" wp14:anchorId="1B1CC6A2" wp14:editId="46126265">
                 <wp:extent cx="1357630" cy="1357630"/>
                 <wp:effectExtent l="0" t="0" r="0" b="0"/>
                 <wp:docPr id="2053796832" name="圖片 1"/>
@@ -706,8 +706,13 @@
     <w:sdt>
       <w:sdtPr>
         <w:rPr>
-          <w:rFonts w:ascii="微軟正黑體" w:eastAsia="微軟正黑體" w:hAnsi="微軟正黑體"/>
+          <w:rFonts w:ascii="微軟正黑體" w:eastAsia="微軟正黑體" w:hAnsi="微軟正黑體" w:cstheme="minorBidi"/>
+          <w:color w:val="auto"/>
+          <w:kern w:val="2"/>
+          <w:sz w:val="24"/>
+          <w:szCs w:val="24"/>
           <w:lang w:val="zh-TW"/>
+          <w14:ligatures w14:val="standardContextual"/>
         </w:rPr>
         <w:id w:val="-799080769"/>
         <w:docPartObj>
@@ -717,14 +722,8 @@
       </w:sdtPr>
       <w:sdtEndPr>
         <w:rPr>
-          <w:rFonts w:cstheme="minorBidi"/>
           <w:b/>
           <w:bCs/>
-          <w:color w:val="auto"/>
-          <w:kern w:val="2"/>
-          <w:sz w:val="24"/>
-          <w:szCs w:val="24"/>
-          <w14:ligatures w14:val="standardContextual"/>
         </w:rPr>
       </w:sdtEndPr>
       <w:sdtContent>
@@ -1202,7 +1201,7 @@
       <w:pPr>
         <w:ind w:firstLineChars="200" w:firstLine="480"/>
         <w:rPr>
-          <w:rFonts w:ascii="微軟正黑體" w:eastAsia="微軟正黑體" w:hAnsi="微軟正黑體" w:hint="eastAsia"/>
+          <w:rFonts w:ascii="微軟正黑體" w:eastAsia="微軟正黑體" w:hAnsi="微軟正黑體"/>
         </w:rPr>
       </w:pPr>
       <w:r>
@@ -1270,7 +1269,7 @@
       <w:pPr>
         <w:ind w:firstLineChars="200" w:firstLine="480"/>
         <w:rPr>
-          <w:rFonts w:ascii="微軟正黑體" w:eastAsia="微軟正黑體" w:hAnsi="微軟正黑體" w:hint="eastAsia"/>
+          <w:rFonts w:ascii="微軟正黑體" w:eastAsia="微軟正黑體" w:hAnsi="微軟正黑體"/>
         </w:rPr>
       </w:pPr>
       <w:r>
@@ -1301,21 +1300,7 @@
         <w:rPr>
           <w:rFonts w:ascii="微軟正黑體" w:eastAsia="微軟正黑體" w:hAnsi="微軟正黑體" w:hint="eastAsia"/>
         </w:rPr>
-        <w:t>，意即主動降低</w:t>
-      </w:r>
-      <w:proofErr w:type="spellStart"/>
-      <w:r>
-        <w:rPr>
-          <w:rFonts w:ascii="微軟正黑體" w:eastAsia="微軟正黑體" w:hAnsi="微軟正黑體" w:hint="eastAsia"/>
-        </w:rPr>
-        <w:t>cwnd</w:t>
-      </w:r>
-      <w:proofErr w:type="spellEnd"/>
-      <w:r>
-        <w:rPr>
-          <w:rFonts w:ascii="微軟正黑體" w:eastAsia="微軟正黑體" w:hAnsi="微軟正黑體" w:hint="eastAsia"/>
-        </w:rPr>
-        <w:t>值來減少壅塞發生</w:t>
+        <w:t>，意即主動降低cwnd值來減少壅塞發生</w:t>
       </w:r>
       <w:r>
         <w:rPr>
@@ -1323,19 +1308,11 @@
         </w:rPr>
         <w:t>，</w:t>
       </w:r>
-      <w:proofErr w:type="spellStart"/>
-      <w:r>
-        <w:rPr>
-          <w:rFonts w:ascii="微軟正黑體" w:eastAsia="微軟正黑體" w:hAnsi="微軟正黑體" w:hint="eastAsia"/>
-        </w:rPr>
-        <w:t>BaseRTT</w:t>
-      </w:r>
-      <w:proofErr w:type="spellEnd"/>
-      <w:r>
-        <w:rPr>
-          <w:rFonts w:ascii="微軟正黑體" w:eastAsia="微軟正黑體" w:hAnsi="微軟正黑體" w:hint="eastAsia"/>
-        </w:rPr>
-        <w:t>連線過程中觀測到的最小RTT值。</w:t>
+      <w:r>
+        <w:rPr>
+          <w:rFonts w:ascii="微軟正黑體" w:eastAsia="微軟正黑體" w:hAnsi="微軟正黑體" w:hint="eastAsia"/>
+        </w:rPr>
+        <w:t>BaseRTT連線過程中觀測到的最小RTT值。</w:t>
       </w:r>
     </w:p>
     <w:p>
@@ -1349,21 +1326,7 @@
         <w:rPr>
           <w:rFonts w:ascii="微軟正黑體" w:eastAsia="微軟正黑體" w:hAnsi="微軟正黑體"/>
         </w:rPr>
-        <w:t>Vegas 會持續測量連接的實際吞吐量（如公式 (1) 所示），並與公式 (2) 計算的預期吞吐量進行比較。公式 (3) 中這兩</w:t>
-      </w:r>
-      <w:proofErr w:type="gramStart"/>
-      <w:r>
-        <w:rPr>
-          <w:rFonts w:ascii="微軟正黑體" w:eastAsia="微軟正黑體" w:hAnsi="微軟正黑體"/>
-        </w:rPr>
-        <w:t>個</w:t>
-      </w:r>
-      <w:proofErr w:type="gramEnd"/>
-      <w:r>
-        <w:rPr>
-          <w:rFonts w:ascii="微軟正黑體" w:eastAsia="微軟正黑體" w:hAnsi="微軟正黑體"/>
-        </w:rPr>
-        <w:t>發送速率之間的差異反映了瓶頸處排隊的額外資料包數量。</w:t>
+        <w:t>Vegas 會持續測量連接的實際吞吐量（如公式 (1) 所示），並與公式 (2) 計算的預期吞吐量進行比較。公式 (3) 中這兩個發送速率之間的差異反映了瓶頸處排隊的額外資料包數量。</w:t>
       </w:r>
     </w:p>
     <w:p>
@@ -1411,19 +1374,7 @@
             <w:rPr>
               <w:rFonts w:ascii="Cambria Math" w:eastAsia="微軟正黑體" w:hAnsi="Cambria Math"/>
             </w:rPr>
-            <m:t xml:space="preserve">   </m:t>
-          </m:r>
-          <m:r>
-            <w:rPr>
-              <w:rFonts w:ascii="Cambria Math" w:eastAsia="微軟正黑體" w:hAnsi="Cambria Math"/>
-            </w:rPr>
-            <m:t>(1)</m:t>
-          </m:r>
-          <m:r>
-            <w:rPr>
-              <w:rFonts w:ascii="Cambria Math" w:eastAsia="微軟正黑體" w:hAnsi="Cambria Math"/>
-            </w:rPr>
-            <m:t xml:space="preserve">      </m:t>
+            <m:t xml:space="preserve">   (1)      </m:t>
           </m:r>
         </m:oMath>
       </m:oMathPara>
@@ -1473,13 +1424,7 @@
             <w:rPr>
               <w:rFonts w:ascii="Cambria Math" w:eastAsia="微軟正黑體" w:hAnsi="Cambria Math"/>
             </w:rPr>
-            <m:t xml:space="preserve"> (2)</m:t>
-          </m:r>
-          <m:r>
-            <w:rPr>
-              <w:rFonts w:ascii="Cambria Math" w:eastAsia="微軟正黑體" w:hAnsi="Cambria Math"/>
-            </w:rPr>
-            <m:t xml:space="preserve"> </m:t>
+            <m:t xml:space="preserve"> (2) </m:t>
           </m:r>
         </m:oMath>
       </m:oMathPara>
@@ -1487,7 +1432,7 @@
     <w:p>
       <w:pPr>
         <w:rPr>
-          <w:rFonts w:ascii="微軟正黑體" w:eastAsia="微軟正黑體" w:hAnsi="微軟正黑體" w:hint="eastAsia"/>
+          <w:rFonts w:ascii="微軟正黑體" w:eastAsia="微軟正黑體" w:hAnsi="微軟正黑體"/>
         </w:rPr>
       </w:pPr>
       <m:oMathPara>
@@ -1496,19 +1441,7 @@
             <w:rPr>
               <w:rFonts w:ascii="Cambria Math" w:eastAsia="微軟正黑體" w:hAnsi="Cambria Math"/>
             </w:rPr>
-            <m:t>diff = expected - actua</m:t>
-          </m:r>
-          <m:r>
-            <w:rPr>
-              <w:rFonts w:ascii="Cambria Math" w:eastAsia="微軟正黑體" w:hAnsi="Cambria Math"/>
-            </w:rPr>
-            <m:t>l</m:t>
-          </m:r>
-          <m:r>
-            <w:rPr>
-              <w:rFonts w:ascii="Cambria Math" w:eastAsia="微軟正黑體" w:hAnsi="Cambria Math"/>
-            </w:rPr>
-            <m:t xml:space="preserve"> (3)</m:t>
+            <m:t>diff = expected - actual (3)</m:t>
           </m:r>
         </m:oMath>
       </m:oMathPara>
@@ -1554,52 +1487,14 @@
           <w:rFonts w:ascii="微軟正黑體" w:eastAsia="微軟正黑體" w:hAnsi="微軟正黑體" w:hint="eastAsia"/>
         </w:rPr>
         <w:lastRenderedPageBreak/>
-        <w:t>與實際吞吐量的差異diff 公式(3)來調整</w:t>
-      </w:r>
-      <w:proofErr w:type="spellStart"/>
-      <w:r>
-        <w:rPr>
-          <w:rFonts w:ascii="微軟正黑體" w:eastAsia="微軟正黑體" w:hAnsi="微軟正黑體" w:hint="eastAsia"/>
-        </w:rPr>
-        <w:t>cwnd</w:t>
-      </w:r>
-      <w:proofErr w:type="spellEnd"/>
-      <w:r>
-        <w:rPr>
-          <w:rFonts w:ascii="微軟正黑體" w:eastAsia="微軟正黑體" w:hAnsi="微軟正黑體" w:hint="eastAsia"/>
-        </w:rPr>
-        <w:t>值，目標</w:t>
+        <w:t>與實際吞吐量的差異diff 公式(3)來調整cwnd值，目標</w:t>
       </w:r>
       <m:oMath>
         <m:r>
           <w:rPr>
             <w:rFonts w:ascii="Cambria Math" w:eastAsia="微軟正黑體" w:hAnsi="Cambria Math"/>
           </w:rPr>
-          <m:t>alpha</m:t>
-        </m:r>
-        <m:r>
-          <w:rPr>
-            <w:rFonts w:ascii="Cambria Math" w:eastAsia="微軟正黑體" w:hAnsi="Cambria Math"/>
-          </w:rPr>
-          <m:t>≤</m:t>
-        </m:r>
-        <m:r>
-          <w:rPr>
-            <w:rFonts w:ascii="Cambria Math" w:eastAsia="微軟正黑體" w:hAnsi="Cambria Math"/>
-          </w:rPr>
-          <m:t>diff</m:t>
-        </m:r>
-        <m:r>
-          <w:rPr>
-            <w:rFonts w:ascii="Cambria Math" w:eastAsia="微軟正黑體" w:hAnsi="Cambria Math"/>
-          </w:rPr>
-          <m:t>≤</m:t>
-        </m:r>
-        <m:r>
-          <w:rPr>
-            <w:rFonts w:ascii="Cambria Math" w:eastAsia="微軟正黑體" w:hAnsi="Cambria Math"/>
-          </w:rPr>
-          <m:t>beta</m:t>
+          <m:t>alpha≤diff≤beta</m:t>
         </m:r>
       </m:oMath>
       <w:r>
@@ -1624,7 +1519,7 @@
     <w:p>
       <w:pPr>
         <w:rPr>
-          <w:rFonts w:ascii="微軟正黑體" w:eastAsia="微軟正黑體" w:hAnsi="微軟正黑體" w:hint="eastAsia"/>
+          <w:rFonts w:ascii="微軟正黑體" w:eastAsia="微軟正黑體" w:hAnsi="微軟正黑體"/>
         </w:rPr>
       </w:pPr>
       <w:r>
@@ -1633,7 +1528,6 @@
         </w:rPr>
         <w:t xml:space="preserve">    </w:t>
       </w:r>
-      <w:proofErr w:type="spellStart"/>
       <w:r>
         <w:rPr>
           <w:rFonts w:ascii="微軟正黑體" w:eastAsia="微軟正黑體" w:hAnsi="微軟正黑體"/>
@@ -1644,14 +1538,7 @@
         <w:rPr>
           <w:rFonts w:ascii="微軟正黑體" w:eastAsia="微軟正黑體" w:hAnsi="微軟正黑體" w:hint="eastAsia"/>
         </w:rPr>
-        <w:t>wnd</w:t>
-      </w:r>
-      <w:proofErr w:type="spellEnd"/>
-      <w:r>
-        <w:rPr>
-          <w:rFonts w:ascii="微軟正黑體" w:eastAsia="微軟正黑體" w:hAnsi="微軟正黑體" w:hint="eastAsia"/>
-        </w:rPr>
-        <w:t>值調整：</w:t>
+        <w:t>wnd值調整：</w:t>
       </w:r>
     </w:p>
     <w:p>
@@ -1697,7 +1584,6 @@
         </w:rPr>
         <w:t>，網路還沒有明顯壅塞，</w:t>
       </w:r>
-      <w:proofErr w:type="spellStart"/>
       <w:r>
         <w:rPr>
           <w:rFonts w:ascii="微軟正黑體" w:eastAsia="微軟正黑體" w:hAnsi="微軟正黑體"/>
@@ -1708,14 +1594,7 @@
         <w:rPr>
           <w:rFonts w:ascii="微軟正黑體" w:eastAsia="微軟正黑體" w:hAnsi="微軟正黑體" w:hint="eastAsia"/>
         </w:rPr>
-        <w:t>wnd</w:t>
-      </w:r>
-      <w:proofErr w:type="spellEnd"/>
-      <w:r>
-        <w:rPr>
-          <w:rFonts w:ascii="微軟正黑體" w:eastAsia="微軟正黑體" w:hAnsi="微軟正黑體" w:hint="eastAsia"/>
-        </w:rPr>
-        <w:t>增加</w:t>
+        <w:t>wnd增加</w:t>
       </w:r>
       <w:r>
         <w:rPr>
@@ -1759,21 +1638,7 @@
         <w:rPr>
           <w:rFonts w:ascii="微軟正黑體" w:eastAsia="微軟正黑體" w:hAnsi="微軟正黑體" w:hint="eastAsia"/>
         </w:rPr>
-        <w:t>可能壅塞了，</w:t>
-      </w:r>
-      <w:proofErr w:type="spellStart"/>
-      <w:r>
-        <w:rPr>
-          <w:rFonts w:ascii="微軟正黑體" w:eastAsia="微軟正黑體" w:hAnsi="微軟正黑體" w:hint="eastAsia"/>
-        </w:rPr>
-        <w:t>cwnd</w:t>
-      </w:r>
-      <w:proofErr w:type="spellEnd"/>
-      <w:r>
-        <w:rPr>
-          <w:rFonts w:ascii="微軟正黑體" w:eastAsia="微軟正黑體" w:hAnsi="微軟正黑體" w:hint="eastAsia"/>
-        </w:rPr>
-        <w:t>減少。</w:t>
+        <w:t>可能壅塞了，cwnd減少。</w:t>
       </w:r>
     </w:p>
     <w:p>
@@ -1784,7 +1649,7 @@
           <w:numId w:val="5"/>
         </w:numPr>
         <w:rPr>
-          <w:rFonts w:ascii="微軟正黑體" w:eastAsia="微軟正黑體" w:hAnsi="微軟正黑體" w:hint="eastAsia"/>
+          <w:rFonts w:ascii="微軟正黑體" w:eastAsia="微軟正黑體" w:hAnsi="微軟正黑體"/>
           <w:i/>
         </w:rPr>
       </w:pPr>
@@ -1806,21 +1671,7 @@
         <w:rPr>
           <w:rFonts w:ascii="微軟正黑體" w:eastAsia="微軟正黑體" w:hAnsi="微軟正黑體" w:hint="eastAsia"/>
         </w:rPr>
-        <w:t>則</w:t>
-      </w:r>
-      <w:proofErr w:type="spellStart"/>
-      <w:r>
-        <w:rPr>
-          <w:rFonts w:ascii="微軟正黑體" w:eastAsia="微軟正黑體" w:hAnsi="微軟正黑體" w:hint="eastAsia"/>
-        </w:rPr>
-        <w:t>cwnd</w:t>
-      </w:r>
-      <w:proofErr w:type="spellEnd"/>
-      <w:r>
-        <w:rPr>
-          <w:rFonts w:ascii="微軟正黑體" w:eastAsia="微軟正黑體" w:hAnsi="微軟正黑體" w:hint="eastAsia"/>
-        </w:rPr>
-        <w:t>不變。</w:t>
+        <w:t>則cwnd不變。</w:t>
       </w:r>
     </w:p>
     <w:p>
@@ -1842,23 +1693,15 @@
         <w:rPr>
           <w:rFonts w:ascii="微軟正黑體" w:eastAsia="微軟正黑體" w:hAnsi="微軟正黑體" w:hint="eastAsia"/>
         </w:rPr>
-        <w:t>實驗場景及網路</w:t>
-      </w:r>
-      <w:proofErr w:type="gramStart"/>
-      <w:r>
-        <w:rPr>
-          <w:rFonts w:ascii="微軟正黑體" w:eastAsia="微軟正黑體" w:hAnsi="微軟正黑體" w:hint="eastAsia"/>
-        </w:rPr>
-        <w:t>拓撲圖描述</w:t>
+        <w:t>實驗場景及網路拓撲圖描述</w:t>
       </w:r>
       <w:bookmarkEnd w:id="1"/>
-      <w:proofErr w:type="gramEnd"/>
     </w:p>
     <w:p>
       <w:pPr>
         <w:pStyle w:val="a6"/>
         <w:rPr>
-          <w:rFonts w:ascii="微軟正黑體" w:eastAsia="微軟正黑體" w:hAnsi="微軟正黑體" w:hint="eastAsia"/>
+          <w:rFonts w:ascii="微軟正黑體" w:eastAsia="微軟正黑體" w:hAnsi="微軟正黑體"/>
         </w:rPr>
       </w:pPr>
       <w:r>
@@ -1885,7 +1728,6 @@
         </w:rPr>
         <w:t>Router</w:t>
       </w:r>
-      <w:proofErr w:type="gramStart"/>
       <w:r>
         <w:rPr>
           <w:rFonts w:ascii="微軟正黑體" w:eastAsia="微軟正黑體" w:hAnsi="微軟正黑體" w:hint="eastAsia"/>
@@ -1898,7 +1740,6 @@
         </w:rPr>
         <w:t>(</w:t>
       </w:r>
-      <w:proofErr w:type="gramEnd"/>
       <w:r>
         <w:rPr>
           <w:rFonts w:ascii="微軟正黑體" w:eastAsia="微軟正黑體" w:hAnsi="微軟正黑體"/>
@@ -2474,14 +2315,7 @@
         <w:rPr>
           <w:rFonts w:ascii="微軟正黑體" w:eastAsia="微軟正黑體" w:hAnsi="微軟正黑體" w:hint="eastAsia"/>
         </w:rPr>
-        <w:t xml:space="preserve">Gamma </w:t>
-      </w:r>
-      <w:proofErr w:type="gramStart"/>
-      <w:r>
-        <w:rPr>
-          <w:rFonts w:ascii="微軟正黑體" w:eastAsia="微軟正黑體" w:hAnsi="微軟正黑體" w:hint="eastAsia"/>
-        </w:rPr>
-        <w:t xml:space="preserve">= </w:t>
+        <w:t xml:space="preserve">Gamma = </w:t>
       </w:r>
       <w:r>
         <w:rPr>
@@ -2495,7 +2329,6 @@
         </w:rPr>
         <w:t>3</w:t>
       </w:r>
-      <w:proofErr w:type="gramEnd"/>
     </w:p>
     <w:p>
       <w:pPr>
@@ -2598,19 +2431,11 @@
         </w:rPr>
         <w:t xml:space="preserve"> </w:t>
       </w:r>
-      <w:proofErr w:type="gramStart"/>
-      <w:r>
-        <w:rPr>
-          <w:rFonts w:ascii="微軟正黑體" w:eastAsia="微軟正黑體" w:hAnsi="微軟正黑體" w:hint="eastAsia"/>
-        </w:rPr>
-        <w:t>KB(</w:t>
-      </w:r>
-      <w:proofErr w:type="gramEnd"/>
-      <w:r>
-        <w:rPr>
-          <w:rFonts w:ascii="微軟正黑體" w:eastAsia="微軟正黑體" w:hAnsi="微軟正黑體" w:hint="eastAsia"/>
-        </w:rPr>
-        <w:t>1024)</w:t>
+      <w:r>
+        <w:rPr>
+          <w:rFonts w:ascii="微軟正黑體" w:eastAsia="微軟正黑體" w:hAnsi="微軟正黑體" w:hint="eastAsia"/>
+        </w:rPr>
+        <w:t>KB(1024)</w:t>
       </w:r>
     </w:p>
     <w:p>
@@ -2668,21 +2493,7 @@
           <w:rFonts w:ascii="微軟正黑體" w:eastAsia="微軟正黑體" w:hAnsi="微軟正黑體" w:hint="eastAsia"/>
         </w:rPr>
         <w:lastRenderedPageBreak/>
-        <w:t xml:space="preserve">    為了使Router成為bottleneck將頻寬設定較小於Leaf值以便造成壅塞進而觀察機制的不同，Buffer Size依照範例給</w:t>
-      </w:r>
-      <w:proofErr w:type="gramStart"/>
-      <w:r>
-        <w:rPr>
-          <w:rFonts w:ascii="微軟正黑體" w:eastAsia="微軟正黑體" w:hAnsi="微軟正黑體" w:hint="eastAsia"/>
-        </w:rPr>
-        <w:t>的值無更動</w:t>
-      </w:r>
-      <w:proofErr w:type="gramEnd"/>
-      <w:r>
-        <w:rPr>
-          <w:rFonts w:ascii="微軟正黑體" w:eastAsia="微軟正黑體" w:hAnsi="微軟正黑體" w:hint="eastAsia"/>
-        </w:rPr>
-        <w:t>也沒有發生錯誤，</w:t>
+        <w:t xml:space="preserve">    為了使Router成為bottleneck將頻寬設定較小於Leaf值以便造成壅塞進而觀察機制的不同，Buffer Size依照範例給的值無更動也沒有發生錯誤，</w:t>
       </w:r>
       <w:r>
         <w:rPr>
@@ -2701,27 +2512,7 @@
         <w:rPr>
           <w:rFonts w:ascii="微軟正黑體" w:eastAsia="微軟正黑體" w:hAnsi="微軟正黑體" w:hint="eastAsia"/>
         </w:rPr>
-        <w:t xml:space="preserve">        </w:t>
-      </w:r>
-      <w:r>
-        <w:rPr>
-          <w:rFonts w:ascii="微軟正黑體" w:eastAsia="微軟正黑體" w:hAnsi="微軟正黑體" w:hint="eastAsia"/>
-        </w:rPr>
-        <w:t>原本Reno queue也是設定100，在改變</w:t>
-      </w:r>
-      <w:proofErr w:type="gramStart"/>
-      <w:r>
-        <w:rPr>
-          <w:rFonts w:ascii="微軟正黑體" w:eastAsia="微軟正黑體" w:hAnsi="微軟正黑體" w:hint="eastAsia"/>
-        </w:rPr>
-        <w:t>頻寬後發現</w:t>
-      </w:r>
-      <w:proofErr w:type="gramEnd"/>
-      <w:r>
-        <w:rPr>
-          <w:rFonts w:ascii="微軟正黑體" w:eastAsia="微軟正黑體" w:hAnsi="微軟正黑體" w:hint="eastAsia"/>
-        </w:rPr>
-        <w:t>非常不穩定，所以</w:t>
+        <w:t xml:space="preserve">        原本Reno queue也是設定100，在改變頻寬後發現非常不穩定，所以</w:t>
       </w:r>
       <w:r>
         <w:rPr>
@@ -2817,19 +2608,11 @@
           <w:rFonts w:ascii="微軟正黑體" w:eastAsia="微軟正黑體" w:hAnsi="微軟正黑體"/>
         </w:rPr>
       </w:pPr>
-      <w:proofErr w:type="gramStart"/>
-      <w:r>
-        <w:rPr>
-          <w:rFonts w:ascii="微軟正黑體" w:eastAsia="微軟正黑體" w:hAnsi="微軟正黑體"/>
-        </w:rPr>
-        <w:t>封包數</w:t>
-      </w:r>
-      <w:proofErr w:type="gramEnd"/>
-      <w:r>
-        <w:rPr>
-          <w:rFonts w:ascii="微軟正黑體" w:eastAsia="微軟正黑體" w:hAnsi="微軟正黑體"/>
-        </w:rPr>
-        <w:t xml:space="preserve"> (Packets)： 55,000 Bytes / 14</w:t>
+      <w:r>
+        <w:rPr>
+          <w:rFonts w:ascii="微軟正黑體" w:eastAsia="微軟正黑體" w:hAnsi="微軟正黑體"/>
+        </w:rPr>
+        <w:t>封包數 (Packets)： 55,000 Bytes / 14</w:t>
       </w:r>
       <w:r>
         <w:rPr>
@@ -2873,31 +2656,13 @@
         <w:rPr>
           <w:rFonts w:ascii="微軟正黑體" w:eastAsia="微軟正黑體" w:hAnsi="微軟正黑體" w:hint="eastAsia"/>
         </w:rPr>
-        <w:t xml:space="preserve">    </w:t>
-      </w:r>
-      <w:r>
-        <w:rPr>
-          <w:rFonts w:ascii="微軟正黑體" w:eastAsia="微軟正黑體" w:hAnsi="微軟正黑體" w:hint="eastAsia"/>
-        </w:rPr>
-        <w:t>Segment 大小</w:t>
-      </w:r>
-      <w:r>
-        <w:rPr>
-          <w:rFonts w:ascii="微軟正黑體" w:eastAsia="微軟正黑體" w:hAnsi="微軟正黑體" w:hint="eastAsia"/>
-        </w:rPr>
-        <w:t>按照乙太網路的MTU = 1500減去TCP Header 40 = 1460</w:t>
-      </w:r>
-      <w:r>
-        <w:rPr>
-          <w:rFonts w:ascii="微軟正黑體" w:eastAsia="微軟正黑體" w:hAnsi="微軟正黑體"/>
-        </w:rPr>
-        <w:t xml:space="preserve"> </w:t>
-      </w:r>
-      <w:r>
-        <w:rPr>
-          <w:rFonts w:ascii="微軟正黑體" w:eastAsia="微軟正黑體" w:hAnsi="微軟正黑體"/>
-        </w:rPr>
-        <w:t>bytes</w:t>
+        <w:t xml:space="preserve">    Segment 大小按照乙太網路的MTU = 1500減去TCP Header 40 = 1460</w:t>
+      </w:r>
+      <w:r>
+        <w:rPr>
+          <w:rFonts w:ascii="微軟正黑體" w:eastAsia="微軟正黑體" w:hAnsi="微軟正黑體"/>
+        </w:rPr>
+        <w:t xml:space="preserve"> bytes</w:t>
       </w:r>
       <w:r>
         <w:rPr>
@@ -2941,19 +2706,7 @@
         <w:rPr>
           <w:rFonts w:ascii="微軟正黑體" w:eastAsia="微軟正黑體" w:hAnsi="微軟正黑體" w:hint="eastAsia"/>
         </w:rPr>
-        <w:t>CWND</w:t>
-      </w:r>
-      <w:r>
-        <w:rPr>
-          <w:rFonts w:ascii="微軟正黑體" w:eastAsia="微軟正黑體" w:hAnsi="微軟正黑體" w:hint="eastAsia"/>
-        </w:rPr>
-        <w:t>按</w:t>
-      </w:r>
-      <w:r>
-        <w:rPr>
-          <w:rFonts w:ascii="微軟正黑體" w:eastAsia="微軟正黑體" w:hAnsi="微軟正黑體" w:hint="eastAsia"/>
-        </w:rPr>
-        <w:t>照範例設定為10</w:t>
+        <w:t>CWND按照範例設定為10</w:t>
       </w:r>
       <w:r>
         <w:rPr>
@@ -3055,7 +2808,7 @@
         <w:pStyle w:val="aa"/>
         <w:ind w:left="0" w:firstLineChars="200" w:firstLine="480"/>
         <w:rPr>
-          <w:rFonts w:ascii="微軟正黑體" w:eastAsia="微軟正黑體" w:hAnsi="微軟正黑體" w:hint="eastAsia"/>
+          <w:rFonts w:ascii="微軟正黑體" w:eastAsia="微軟正黑體" w:hAnsi="微軟正黑體"/>
         </w:rPr>
       </w:pPr>
       <w:r>
@@ -3166,45 +2919,21 @@
           <w:b/>
           <w:bCs/>
         </w:rPr>
-        <w:t>圖</w:t>
-      </w:r>
-      <w:r>
-        <w:rPr>
-          <w:rFonts w:ascii="微軟正黑體" w:eastAsia="微軟正黑體" w:hAnsi="微軟正黑體" w:hint="eastAsia"/>
-          <w:b/>
-          <w:bCs/>
-        </w:rPr>
-        <w:t>一</w:t>
-      </w:r>
-      <w:r>
-        <w:rPr>
-          <w:rFonts w:ascii="微軟正黑體" w:eastAsia="微軟正黑體" w:hAnsi="微軟正黑體" w:hint="eastAsia"/>
-          <w:b/>
-          <w:bCs/>
-        </w:rPr>
-        <w:t>、</w:t>
-      </w:r>
-      <w:r>
-        <w:rPr>
-          <w:rFonts w:ascii="微軟正黑體" w:eastAsia="微軟正黑體" w:hAnsi="微軟正黑體" w:hint="eastAsia"/>
-          <w:b/>
-          <w:bCs/>
-        </w:rPr>
-        <w:t>網路拓樸圖</w:t>
+        <w:t>圖一、網路拓樸圖</w:t>
       </w:r>
     </w:p>
     <w:p>
       <w:pPr>
         <w:jc w:val="center"/>
         <w:rPr>
-          <w:rFonts w:ascii="微軟正黑體" w:eastAsia="微軟正黑體" w:hAnsi="微軟正黑體" w:hint="eastAsia"/>
-        </w:rPr>
-      </w:pPr>
-    </w:p>
-    <w:p>
-      <w:pPr>
-        <w:rPr>
-          <w:rFonts w:ascii="微軟正黑體" w:eastAsia="微軟正黑體" w:hAnsi="微軟正黑體" w:hint="eastAsia"/>
+          <w:rFonts w:ascii="微軟正黑體" w:eastAsia="微軟正黑體" w:hAnsi="微軟正黑體"/>
+        </w:rPr>
+      </w:pPr>
+    </w:p>
+    <w:p>
+      <w:pPr>
+        <w:rPr>
+          <w:rFonts w:ascii="微軟正黑體" w:eastAsia="微軟正黑體" w:hAnsi="微軟正黑體"/>
         </w:rPr>
       </w:pPr>
       <w:r>
@@ -3223,35 +2952,7 @@
         <w:rPr>
           <w:rFonts w:ascii="微軟正黑體" w:eastAsia="微軟正黑體" w:hAnsi="微軟正黑體" w:hint="eastAsia"/>
         </w:rPr>
-        <w:t>outer作為骨幹網路以及一個</w:t>
-      </w:r>
-      <w:proofErr w:type="gramStart"/>
-      <w:r>
-        <w:rPr>
-          <w:rFonts w:ascii="微軟正黑體" w:eastAsia="微軟正黑體" w:hAnsi="微軟正黑體" w:hint="eastAsia"/>
-        </w:rPr>
-        <w:t>傳送端跟一個</w:t>
-      </w:r>
-      <w:proofErr w:type="gramEnd"/>
-      <w:r>
-        <w:rPr>
-          <w:rFonts w:ascii="微軟正黑體" w:eastAsia="微軟正黑體" w:hAnsi="微軟正黑體" w:hint="eastAsia"/>
-        </w:rPr>
-        <w:t>接收端，參考範例的設計，而效能瓶頸點在於Router 1到Router 2</w:t>
-      </w:r>
-      <w:proofErr w:type="gramStart"/>
-      <w:r>
-        <w:rPr>
-          <w:rFonts w:ascii="微軟正黑體" w:eastAsia="微軟正黑體" w:hAnsi="微軟正黑體" w:hint="eastAsia"/>
-        </w:rPr>
-        <w:t>之間，</w:t>
-      </w:r>
-      <w:proofErr w:type="gramEnd"/>
-      <w:r>
-        <w:rPr>
-          <w:rFonts w:ascii="微軟正黑體" w:eastAsia="微軟正黑體" w:hAnsi="微軟正黑體" w:hint="eastAsia"/>
-        </w:rPr>
-        <w:t>由於傳送端以</w:t>
+        <w:t>outer作為骨幹網路以及一個傳送端跟一個接收端，參考範例的設計，而效能瓶頸點在於Router 1到Router 2之間，由於傳送端以</w:t>
       </w:r>
       <w:r>
         <w:rPr>
@@ -3263,35 +2964,7 @@
         <w:rPr>
           <w:rFonts w:ascii="微軟正黑體" w:eastAsia="微軟正黑體" w:hAnsi="微軟正黑體" w:hint="eastAsia"/>
         </w:rPr>
-        <w:t>5Mbps, 1ms delay</w:t>
-      </w:r>
-      <w:proofErr w:type="gramStart"/>
-      <w:r>
-        <w:rPr>
-          <w:rFonts w:ascii="微軟正黑體" w:eastAsia="微軟正黑體" w:hAnsi="微軟正黑體" w:hint="eastAsia"/>
-        </w:rPr>
-        <w:t>得頻寬送</w:t>
-      </w:r>
-      <w:proofErr w:type="gramEnd"/>
-      <w:r>
-        <w:rPr>
-          <w:rFonts w:ascii="微軟正黑體" w:eastAsia="微軟正黑體" w:hAnsi="微軟正黑體" w:hint="eastAsia"/>
-        </w:rPr>
-        <w:t>資料而Backbone網路中只有10Mbps, 20ms delay的狀況所以用最大頻寬的</w:t>
-      </w:r>
-      <w:proofErr w:type="spellStart"/>
-      <w:r>
-        <w:rPr>
-          <w:rFonts w:ascii="微軟正黑體" w:eastAsia="微軟正黑體" w:hAnsi="微軟正黑體" w:hint="eastAsia"/>
-        </w:rPr>
-        <w:t>cwnd</w:t>
-      </w:r>
-      <w:proofErr w:type="spellEnd"/>
-      <w:r>
-        <w:rPr>
-          <w:rFonts w:ascii="微軟正黑體" w:eastAsia="微軟正黑體" w:hAnsi="微軟正黑體" w:hint="eastAsia"/>
-        </w:rPr>
-        <w:t>值的方式傳送的話勢必會造成queue的改變</w:t>
+        <w:t>5Mbps, 1ms delay得頻寬送資料而Backbone網路中只有10Mbps, 20ms delay的狀況所以用最大頻寬的cwnd值的方式傳送的話勢必會造成queue的改變</w:t>
       </w:r>
       <w:r>
         <w:rPr>
@@ -3496,37 +3169,21 @@
           <w:b/>
           <w:bCs/>
         </w:rPr>
-        <w:t>、Reno, Vegas</w:t>
-      </w:r>
+        <w:t>、Reno, Vegas結合觀察</w:t>
+      </w:r>
+    </w:p>
+    <w:p>
+      <w:pPr>
+        <w:rPr>
+          <w:rFonts w:ascii="微軟正黑體" w:eastAsia="微軟正黑體" w:hAnsi="微軟正黑體"/>
+        </w:rPr>
+      </w:pPr>
       <w:r>
         <w:rPr>
           <w:rFonts w:ascii="微軟正黑體" w:eastAsia="微軟正黑體" w:hAnsi="微軟正黑體" w:hint="eastAsia"/>
           <w:b/>
           <w:bCs/>
         </w:rPr>
-        <w:t>結合</w:t>
-      </w:r>
-      <w:r>
-        <w:rPr>
-          <w:rFonts w:ascii="微軟正黑體" w:eastAsia="微軟正黑體" w:hAnsi="微軟正黑體" w:hint="eastAsia"/>
-          <w:b/>
-          <w:bCs/>
-        </w:rPr>
-        <w:t>觀察</w:t>
-      </w:r>
-    </w:p>
-    <w:p>
-      <w:pPr>
-        <w:rPr>
-          <w:rFonts w:ascii="微軟正黑體" w:eastAsia="微軟正黑體" w:hAnsi="微軟正黑體" w:hint="eastAsia"/>
-        </w:rPr>
-      </w:pPr>
-      <w:r>
-        <w:rPr>
-          <w:rFonts w:ascii="微軟正黑體" w:eastAsia="微軟正黑體" w:hAnsi="微軟正黑體" w:hint="eastAsia"/>
-          <w:b/>
-          <w:bCs/>
-        </w:rPr>
         <w:t xml:space="preserve">   </w:t>
       </w:r>
       <w:r>
@@ -3551,43 +3208,26 @@
         <w:rPr>
           <w:rFonts w:ascii="微軟正黑體" w:eastAsia="微軟正黑體" w:hAnsi="微軟正黑體" w:hint="eastAsia"/>
         </w:rPr>
-        <w:t>egas queue沒有變動所以事件</w:t>
-      </w:r>
-      <w:proofErr w:type="gramStart"/>
-      <w:r>
-        <w:rPr>
-          <w:rFonts w:ascii="微軟正黑體" w:eastAsia="微軟正黑體" w:hAnsi="微軟正黑體" w:hint="eastAsia"/>
-        </w:rPr>
-        <w:t>捕抓為空</w:t>
-      </w:r>
-      <w:proofErr w:type="gramEnd"/>
+        <w:t>egas queue沒有變動所以事件捕抓為空，所以用</w:t>
+      </w:r>
+      <w:r>
+        <w:rPr>
+          <w:rFonts w:ascii="微軟正黑體" w:eastAsia="微軟正黑體" w:hAnsi="微軟正黑體" w:hint="eastAsia"/>
+        </w:rPr>
+        <w:t>補</w:t>
+      </w:r>
+      <w:r>
+        <w:rPr>
+          <w:rFonts w:ascii="微軟正黑體" w:eastAsia="微軟正黑體" w:hAnsi="微軟正黑體" w:hint="eastAsia"/>
+        </w:rPr>
+        <w:t>0的方式繪製</w:t>
+      </w:r>
       <w:r>
         <w:rPr>
           <w:rFonts w:ascii="微軟正黑體" w:eastAsia="微軟正黑體" w:hAnsi="微軟正黑體" w:hint="eastAsia"/>
         </w:rPr>
         <w:t>，</w:t>
       </w:r>
-      <w:proofErr w:type="gramStart"/>
-      <w:r>
-        <w:rPr>
-          <w:rFonts w:ascii="微軟正黑體" w:eastAsia="微軟正黑體" w:hAnsi="微軟正黑體" w:hint="eastAsia"/>
-        </w:rPr>
-        <w:t>所以用捕</w:t>
-      </w:r>
-      <w:proofErr w:type="gramEnd"/>
-      <w:r>
-        <w:rPr>
-          <w:rFonts w:ascii="微軟正黑體" w:eastAsia="微軟正黑體" w:hAnsi="微軟正黑體" w:hint="eastAsia"/>
-        </w:rPr>
-        <w:t>0的方式繪製</w:t>
-      </w:r>
-      <w:r>
-        <w:rPr>
-          <w:rFonts w:ascii="微軟正黑體" w:eastAsia="微軟正黑體" w:hAnsi="微軟正黑體" w:hint="eastAsia"/>
-        </w:rPr>
-        <w:t>，</w:t>
-      </w:r>
-      <w:proofErr w:type="spellStart"/>
       <w:r>
         <w:rPr>
           <w:rFonts w:ascii="微軟正黑體" w:eastAsia="微軟正黑體" w:hAnsi="微軟正黑體"/>
@@ -3598,14 +3238,7 @@
         <w:rPr>
           <w:rFonts w:ascii="微軟正黑體" w:eastAsia="微軟正黑體" w:hAnsi="微軟正黑體" w:hint="eastAsia"/>
         </w:rPr>
-        <w:t>wnd</w:t>
-      </w:r>
-      <w:proofErr w:type="spellEnd"/>
-      <w:r>
-        <w:rPr>
-          <w:rFonts w:ascii="微軟正黑體" w:eastAsia="微軟正黑體" w:hAnsi="微軟正黑體" w:hint="eastAsia"/>
-        </w:rPr>
-        <w:t>值在前15秒穩定時也是用補充的方式來補足缺失。</w:t>
+        <w:t>wnd值在前15秒穩定時也是用補充的方式來補足缺失。</w:t>
       </w:r>
     </w:p>
     <w:p>
@@ -3627,19 +3260,11 @@
         </w:rPr>
         <w:t>依據圖二、圖三可以知道，Vegas在Alpha, Beta, Gamma設定為8, 16, 4</w:t>
       </w:r>
-      <w:proofErr w:type="gramStart"/>
-      <w:r>
-        <w:rPr>
-          <w:rFonts w:ascii="微軟正黑體" w:eastAsia="微軟正黑體" w:hAnsi="微軟正黑體" w:hint="eastAsia"/>
-        </w:rPr>
-        <w:t>十</w:t>
-      </w:r>
-      <w:proofErr w:type="gramEnd"/>
-      <w:r>
-        <w:rPr>
-          <w:rFonts w:ascii="微軟正黑體" w:eastAsia="微軟正黑體" w:hAnsi="微軟正黑體" w:hint="eastAsia"/>
-        </w:rPr>
-        <w:t>於環境中吞吐量幾乎與具有SACK的Linux Reno一樣好，且其探索平穩到理論最高值就停止成長穩定於10Mbps左右</w:t>
+      <w:r>
+        <w:rPr>
+          <w:rFonts w:ascii="微軟正黑體" w:eastAsia="微軟正黑體" w:hAnsi="微軟正黑體" w:hint="eastAsia"/>
+        </w:rPr>
+        <w:t>十於環境中吞吐量幾乎與具有SACK的Linux Reno一樣好，且其探索平穩到理論最高值就停止成長穩定於10Mbps左右</w:t>
       </w:r>
       <w:r>
         <w:rPr>
@@ -3657,35 +3282,7 @@
         <w:rPr>
           <w:rFonts w:ascii="微軟正黑體" w:eastAsia="微軟正黑體" w:hAnsi="微軟正黑體" w:hint="eastAsia"/>
         </w:rPr>
-        <w:t>eno則</w:t>
-      </w:r>
-      <w:proofErr w:type="gramStart"/>
-      <w:r>
-        <w:rPr>
-          <w:rFonts w:ascii="微軟正黑體" w:eastAsia="微軟正黑體" w:hAnsi="微軟正黑體" w:hint="eastAsia"/>
-        </w:rPr>
-        <w:t>使緩啟動衝</w:t>
-      </w:r>
-      <w:proofErr w:type="gramEnd"/>
-      <w:r>
-        <w:rPr>
-          <w:rFonts w:ascii="微軟正黑體" w:eastAsia="微軟正黑體" w:hAnsi="微軟正黑體" w:hint="eastAsia"/>
-        </w:rPr>
-        <w:t>過頭遇到Time-out</w:t>
-      </w:r>
-      <w:proofErr w:type="gramStart"/>
-      <w:r>
-        <w:rPr>
-          <w:rFonts w:ascii="微軟正黑體" w:eastAsia="微軟正黑體" w:hAnsi="微軟正黑體" w:hint="eastAsia"/>
-        </w:rPr>
-        <w:t>而歸並更改</w:t>
-      </w:r>
-      <w:proofErr w:type="gramEnd"/>
-      <w:r>
-        <w:rPr>
-          <w:rFonts w:ascii="微軟正黑體" w:eastAsia="微軟正黑體" w:hAnsi="微軟正黑體" w:hint="eastAsia"/>
-        </w:rPr>
-        <w:t>slow start threshold成一半才達到平衡且有時會有波動。</w:t>
+        <w:t>eno則使緩啟動衝過頭遇到Time-out而歸並更改slow start threshold成一半才達到平衡且有時會有波動。</w:t>
       </w:r>
     </w:p>
     <w:p>
@@ -3700,21 +3297,18 @@
         </w:rPr>
         <w:t xml:space="preserve">    UDP Packet 在第15秒開始出現隨機傳送(On/Off, </w:t>
       </w:r>
-      <w:proofErr w:type="spellStart"/>
       <w:r>
         <w:rPr>
           <w:rFonts w:ascii="微軟正黑體" w:eastAsia="微軟正黑體" w:hAnsi="微軟正黑體"/>
         </w:rPr>
         <w:t>OnOffHelper</w:t>
       </w:r>
-      <w:proofErr w:type="spellEnd"/>
       <w:r>
         <w:rPr>
           <w:rFonts w:ascii="微軟正黑體" w:eastAsia="微軟正黑體" w:hAnsi="微軟正黑體" w:hint="eastAsia"/>
         </w:rPr>
         <w:t>)，其頻寬為5Mbps相當於Bottleneck的一半，可以看到兩者的反應，</w:t>
       </w:r>
-      <w:proofErr w:type="spellStart"/>
       <w:r>
         <w:rPr>
           <w:rFonts w:ascii="微軟正黑體" w:eastAsia="微軟正黑體" w:hAnsi="微軟正黑體"/>
@@ -3725,14 +3319,7 @@
         <w:rPr>
           <w:rFonts w:ascii="微軟正黑體" w:eastAsia="微軟正黑體" w:hAnsi="微軟正黑體" w:hint="eastAsia"/>
         </w:rPr>
-        <w:t>wnd</w:t>
-      </w:r>
-      <w:proofErr w:type="spellEnd"/>
-      <w:r>
-        <w:rPr>
-          <w:rFonts w:ascii="微軟正黑體" w:eastAsia="微軟正黑體" w:hAnsi="微軟正黑體" w:hint="eastAsia"/>
-        </w:rPr>
-        <w:t>跟Throughput開始震盪，但可以看到</w:t>
+        <w:t>wnd跟Throughput開始震盪，但可以看到</w:t>
       </w:r>
       <w:r>
         <w:rPr>
@@ -3750,7 +3337,7 @@
     <w:p>
       <w:pPr>
         <w:rPr>
-          <w:rFonts w:ascii="微軟正黑體" w:eastAsia="微軟正黑體" w:hAnsi="微軟正黑體" w:hint="eastAsia"/>
+          <w:rFonts w:ascii="微軟正黑體" w:eastAsia="微軟正黑體" w:hAnsi="微軟正黑體"/>
         </w:rPr>
       </w:pPr>
       <w:r>
@@ -3759,7 +3346,6 @@
         </w:rPr>
         <w:t xml:space="preserve">    Queue值Reno震盪大，且到第15秒以後頻率更加快，而Vegas則是始終為0的穩定策略，主動的偵測與計算最大值並降低</w:t>
       </w:r>
-      <w:proofErr w:type="spellStart"/>
       <w:r>
         <w:rPr>
           <w:rFonts w:ascii="微軟正黑體" w:eastAsia="微軟正黑體" w:hAnsi="微軟正黑體"/>
@@ -3770,14 +3356,7 @@
         <w:rPr>
           <w:rFonts w:ascii="微軟正黑體" w:eastAsia="微軟正黑體" w:hAnsi="微軟正黑體" w:hint="eastAsia"/>
         </w:rPr>
-        <w:t>wnd</w:t>
-      </w:r>
-      <w:proofErr w:type="spellEnd"/>
-      <w:r>
-        <w:rPr>
-          <w:rFonts w:ascii="微軟正黑體" w:eastAsia="微軟正黑體" w:hAnsi="微軟正黑體" w:hint="eastAsia"/>
-        </w:rPr>
-        <w:t>值在此有明顯的優勢。</w:t>
+        <w:t>wnd值在此有明顯的優勢。</w:t>
       </w:r>
     </w:p>
     <w:p>
@@ -3880,23 +3459,8 @@
         <w:rPr>
           <w:rFonts w:ascii="微軟正黑體" w:eastAsia="微軟正黑體" w:hAnsi="微軟正黑體" w:hint="eastAsia"/>
         </w:rPr>
-        <w:t>一開始沒加入UDP時Vegas甚至只有前面不到1秒的時間有</w:t>
-      </w:r>
-      <w:proofErr w:type="spellStart"/>
-      <w:r>
-        <w:rPr>
-          <w:rFonts w:ascii="微軟正黑體" w:eastAsia="微軟正黑體" w:hAnsi="微軟正黑體" w:hint="eastAsia"/>
-        </w:rPr>
-        <w:t>cwnd</w:t>
-      </w:r>
-      <w:proofErr w:type="spellEnd"/>
-      <w:r>
-        <w:rPr>
-          <w:rFonts w:ascii="微軟正黑體" w:eastAsia="微軟正黑體" w:hAnsi="微軟正黑體" w:hint="eastAsia"/>
-        </w:rPr>
-        <w:t>值，只能用補充的方式，因為其機制的關係滿意</w:t>
-      </w:r>
-      <w:proofErr w:type="spellStart"/>
+        <w:t>一開始沒加入UDP時Vegas甚至只有前面不到1秒的時間有cwnd值，只能用補充的方式，因為其機制的關係滿意</w:t>
+      </w:r>
       <w:r>
         <w:rPr>
           <w:rFonts w:ascii="微軟正黑體" w:eastAsia="微軟正黑體" w:hAnsi="微軟正黑體"/>
@@ -3907,85 +3471,21 @@
         <w:rPr>
           <w:rFonts w:ascii="微軟正黑體" w:eastAsia="微軟正黑體" w:hAnsi="微軟正黑體" w:hint="eastAsia"/>
         </w:rPr>
-        <w:t>wnd</w:t>
-      </w:r>
-      <w:proofErr w:type="spellEnd"/>
-      <w:r>
-        <w:rPr>
-          <w:rFonts w:ascii="微軟正黑體" w:eastAsia="微軟正黑體" w:hAnsi="微軟正黑體" w:hint="eastAsia"/>
-        </w:rPr>
-        <w:t>值而環境又沒有變動就抓不到。</w:t>
-      </w:r>
-    </w:p>
-    <w:p>
-      <w:pPr>
-        <w:rPr>
-          <w:rFonts w:ascii="微軟正黑體" w:eastAsia="微軟正黑體" w:hAnsi="微軟正黑體"/>
-        </w:rPr>
-      </w:pPr>
-      <w:r>
-        <w:rPr>
-          <w:rFonts w:ascii="微軟正黑體" w:eastAsia="微軟正黑體" w:hAnsi="微軟正黑體" w:hint="eastAsia"/>
-        </w:rPr>
-        <w:t xml:space="preserve">    最終在裝Docker時使用NS3 3.48也成功從</w:t>
-      </w:r>
-      <w:proofErr w:type="spellStart"/>
-      <w:r>
-        <w:rPr>
-          <w:rFonts w:ascii="微軟正黑體" w:eastAsia="微軟正黑體" w:hAnsi="微軟正黑體" w:hint="eastAsia"/>
-        </w:rPr>
-        <w:t>tcp</w:t>
-      </w:r>
-      <w:proofErr w:type="spellEnd"/>
-      <w:r>
-        <w:rPr>
-          <w:rFonts w:ascii="微軟正黑體" w:eastAsia="微軟正黑體" w:hAnsi="微軟正黑體" w:hint="eastAsia"/>
-        </w:rPr>
-        <w:t>-</w:t>
-      </w:r>
-      <w:proofErr w:type="spellStart"/>
-      <w:r>
-        <w:rPr>
-          <w:rFonts w:ascii="微軟正黑體" w:eastAsia="微軟正黑體" w:hAnsi="微軟正黑體" w:hint="eastAsia"/>
-        </w:rPr>
-        <w:t>linux</w:t>
-      </w:r>
-      <w:proofErr w:type="spellEnd"/>
-      <w:r>
-        <w:rPr>
-          <w:rFonts w:ascii="微軟正黑體" w:eastAsia="微軟正黑體" w:hAnsi="微軟正黑體" w:hint="eastAsia"/>
-        </w:rPr>
-        <w:t>-reno範例改出</w:t>
-      </w:r>
-      <w:proofErr w:type="spellStart"/>
-      <w:r>
-        <w:rPr>
-          <w:rFonts w:ascii="微軟正黑體" w:eastAsia="微軟正黑體" w:hAnsi="微軟正黑體" w:hint="eastAsia"/>
-        </w:rPr>
-        <w:t>linux</w:t>
-      </w:r>
-      <w:proofErr w:type="spellEnd"/>
-      <w:r>
-        <w:rPr>
-          <w:rFonts w:ascii="微軟正黑體" w:eastAsia="微軟正黑體" w:hAnsi="微軟正黑體" w:hint="eastAsia"/>
-        </w:rPr>
-        <w:t xml:space="preserve"> reno, </w:t>
-      </w:r>
-      <w:proofErr w:type="spellStart"/>
-      <w:r>
-        <w:rPr>
-          <w:rFonts w:ascii="微軟正黑體" w:eastAsia="微軟正黑體" w:hAnsi="微軟正黑體" w:hint="eastAsia"/>
-        </w:rPr>
-        <w:t>vegas</w:t>
-      </w:r>
-      <w:proofErr w:type="spellEnd"/>
-      <w:r>
-        <w:rPr>
-          <w:rFonts w:ascii="微軟正黑體" w:eastAsia="微軟正黑體" w:hAnsi="微軟正黑體" w:hint="eastAsia"/>
-        </w:rPr>
-        <w:t>的實驗環境，</w:t>
-      </w:r>
-      <w:proofErr w:type="spellStart"/>
+        <w:t>wnd值而環境又沒有變動就抓不到。</w:t>
+      </w:r>
+    </w:p>
+    <w:p>
+      <w:pPr>
+        <w:rPr>
+          <w:rFonts w:ascii="微軟正黑體" w:eastAsia="微軟正黑體" w:hAnsi="微軟正黑體"/>
+        </w:rPr>
+      </w:pPr>
+      <w:r>
+        <w:rPr>
+          <w:rFonts w:ascii="微軟正黑體" w:eastAsia="微軟正黑體" w:hAnsi="微軟正黑體" w:hint="eastAsia"/>
+        </w:rPr>
+        <w:t xml:space="preserve">    最終在裝Docker時使用NS3 3.48也成功從tcp-linux-reno範例改出linux reno, vegas的實驗環境，</w:t>
+      </w:r>
       <w:r>
         <w:rPr>
           <w:rFonts w:ascii="微軟正黑體" w:eastAsia="微軟正黑體" w:hAnsi="微軟正黑體"/>
@@ -3996,28 +3496,7 @@
         <w:rPr>
           <w:rFonts w:ascii="微軟正黑體" w:eastAsia="微軟正黑體" w:hAnsi="微軟正黑體" w:hint="eastAsia"/>
         </w:rPr>
-        <w:t>egas</w:t>
-      </w:r>
-      <w:proofErr w:type="spellEnd"/>
-      <w:r>
-        <w:rPr>
-          <w:rFonts w:ascii="微軟正黑體" w:eastAsia="微軟正黑體" w:hAnsi="微軟正黑體" w:hint="eastAsia"/>
-        </w:rPr>
-        <w:t>沒有範例但設計在</w:t>
-      </w:r>
-      <w:proofErr w:type="spellStart"/>
-      <w:r>
-        <w:rPr>
-          <w:rFonts w:ascii="微軟正黑體" w:eastAsia="微軟正黑體" w:hAnsi="微軟正黑體" w:hint="eastAsia"/>
-        </w:rPr>
-        <w:t>src</w:t>
-      </w:r>
-      <w:proofErr w:type="spellEnd"/>
-      <w:r>
-        <w:rPr>
-          <w:rFonts w:ascii="微軟正黑體" w:eastAsia="微軟正黑體" w:hAnsi="微軟正黑體" w:hint="eastAsia"/>
-        </w:rPr>
-        <w:t>/internet中有實作所以可以呼叫。</w:t>
+        <w:t>egas沒有範例但設計在src/internet中有實作所以可以呼叫。</w:t>
       </w:r>
     </w:p>
     <w:p>
@@ -4039,7 +3518,7 @@
     <w:p>
       <w:pPr>
         <w:rPr>
-          <w:rFonts w:ascii="微軟正黑體" w:eastAsia="微軟正黑體" w:hAnsi="微軟正黑體" w:hint="eastAsia"/>
+          <w:rFonts w:ascii="微軟正黑體" w:eastAsia="微軟正黑體" w:hAnsi="微軟正黑體"/>
         </w:rPr>
       </w:pPr>
       <w:r>
@@ -5178,6 +4657,7 @@
   <w:style w:type="character" w:default="1" w:styleId="a1">
     <w:name w:val="Default Paragraph Font"/>
     <w:uiPriority w:val="1"/>
+    <w:semiHidden/>
     <w:unhideWhenUsed/>
   </w:style>
   <w:style w:type="table" w:default="1" w:styleId="a2">
@@ -5864,7 +5344,10 @@
     <w:rsidRoot w:val="00E13840"/>
     <w:rsid w:val="00056E5F"/>
     <w:rsid w:val="00941B57"/>
+    <w:rsid w:val="00A2181C"/>
+    <w:rsid w:val="00DC68B8"/>
     <w:rsid w:val="00E13840"/>
+    <w:rsid w:val="00FE79DA"/>
   </w:rsids>
   <m:mathPr>
     <m:mathFont m:val="Cambria Math"/>

</xml_diff>